<commit_message>
docs: 설계서 v1.5 - Phase 0~2 구현 결과 반영
- csrf_token 쿠키 Path를 /로 정정 (§17.3)
- Phase 2 API 구현 범위와 세부 계약 명시 (§14.3)
- Phase 2 구현 결과와 이월 항목 기록 (§19)
- docs-word docx 재생성

Co-Authored-By: Claude Sonnet 5.5 <noreply@anthropic.com>
</commit_message>
<xml_diff>
--- a/docs-word/06-API_명세서.docx
+++ b/docs-word/06-API_명세서.docx
@@ -6802,6 +6802,815 @@
     <w:p>
       <w:r>
         <w:rPr>
+          <w:rFonts w:ascii="Arial" w:hAnsi="Arial" w:eastAsia="Malgun Gothic" w:cs="Malgun Gothic"/>
+          <w:b/>
+          <w:color w:val="000000"/>
+          <w:sz w:val="22"/>
+          <w:lang w:eastAsia="ko-KR"/>
+        </w:rPr>
+        <w:t>Phase 2 구현 범위와 세부 계약(v1.5 확정)</w:t>
+      </w:r>
+    </w:p>
+    <w:p>
+      <w:pPr>
+        <w:pStyle w:val="ListBullet"/>
+      </w:pPr>
+      <w:r>
+        <w:rPr>
+          <w:rFonts w:ascii="Menlo" w:hAnsi="Menlo" w:eastAsia="Menlo" w:cs="Menlo"/>
+          <w:color w:val="000000"/>
+          <w:sz w:val="21"/>
+          <w:lang w:eastAsia="ko-KR"/>
+        </w:rPr>
+        <w:t>POST /nodes</w:t>
+      </w:r>
+      <w:r>
+        <w:rPr>
+          <w:rFonts w:ascii="Arial" w:hAnsi="Arial" w:eastAsia="Malgun Gothic" w:cs="Malgun Gothic"/>
+          <w:color w:val="000000"/>
+          <w:sz w:val="22"/>
+          <w:lang w:eastAsia="ko-KR"/>
+        </w:rPr>
+        <w:t xml:space="preserve">는 Phase 2에서 </w:t>
+      </w:r>
+      <w:r>
+        <w:rPr>
+          <w:rFonts w:ascii="Menlo" w:hAnsi="Menlo" w:eastAsia="Menlo" w:cs="Menlo"/>
+          <w:color w:val="000000"/>
+          <w:sz w:val="21"/>
+          <w:lang w:eastAsia="ko-KR"/>
+        </w:rPr>
+        <w:t>type</w:t>
+      </w:r>
+      <w:r>
+        <w:rPr>
+          <w:rFonts w:ascii="Arial" w:hAnsi="Arial" w:eastAsia="Malgun Gothic" w:cs="Malgun Gothic"/>
+          <w:color w:val="000000"/>
+          <w:sz w:val="22"/>
+          <w:lang w:eastAsia="ko-KR"/>
+        </w:rPr>
+        <w:t xml:space="preserve">이 </w:t>
+      </w:r>
+      <w:r>
+        <w:rPr>
+          <w:rFonts w:ascii="Menlo" w:hAnsi="Menlo" w:eastAsia="Menlo" w:cs="Menlo"/>
+          <w:color w:val="000000"/>
+          <w:sz w:val="21"/>
+          <w:lang w:eastAsia="ko-KR"/>
+        </w:rPr>
+        <w:t>CONCEPT</w:t>
+      </w:r>
+      <w:r>
+        <w:rPr>
+          <w:rFonts w:ascii="Arial" w:hAnsi="Arial" w:eastAsia="Malgun Gothic" w:cs="Malgun Gothic"/>
+          <w:color w:val="000000"/>
+          <w:sz w:val="22"/>
+          <w:lang w:eastAsia="ko-KR"/>
+        </w:rPr>
+        <w:t>/</w:t>
+      </w:r>
+      <w:r>
+        <w:rPr>
+          <w:rFonts w:ascii="Menlo" w:hAnsi="Menlo" w:eastAsia="Menlo" w:cs="Menlo"/>
+          <w:color w:val="000000"/>
+          <w:sz w:val="21"/>
+          <w:lang w:eastAsia="ko-KR"/>
+        </w:rPr>
+        <w:t>NOTE</w:t>
+      </w:r>
+      <w:r>
+        <w:rPr>
+          <w:rFonts w:ascii="Arial" w:hAnsi="Arial" w:eastAsia="Malgun Gothic" w:cs="Malgun Gothic"/>
+          <w:color w:val="000000"/>
+          <w:sz w:val="22"/>
+          <w:lang w:eastAsia="ko-KR"/>
+        </w:rPr>
+        <w:t xml:space="preserve">일 때만 허용하며, 다른 타입은 </w:t>
+      </w:r>
+      <w:r>
+        <w:rPr>
+          <w:rFonts w:ascii="Menlo" w:hAnsi="Menlo" w:eastAsia="Menlo" w:cs="Menlo"/>
+          <w:color w:val="000000"/>
+          <w:sz w:val="21"/>
+          <w:lang w:eastAsia="ko-KR"/>
+        </w:rPr>
+        <w:t>400 UNSUPPORTED_TYPE</w:t>
+      </w:r>
+      <w:r>
+        <w:rPr>
+          <w:rFonts w:ascii="Arial" w:hAnsi="Arial" w:eastAsia="Malgun Gothic" w:cs="Malgun Gothic"/>
+          <w:color w:val="000000"/>
+          <w:sz w:val="22"/>
+          <w:lang w:eastAsia="ko-KR"/>
+        </w:rPr>
+        <w:t xml:space="preserve">이다(Snippet은 Phase 3, 나머지는 Phase 6). 요청의 </w:t>
+      </w:r>
+      <w:r>
+        <w:rPr>
+          <w:rFonts w:ascii="Menlo" w:hAnsi="Menlo" w:eastAsia="Menlo" w:cs="Menlo"/>
+          <w:color w:val="000000"/>
+          <w:sz w:val="21"/>
+          <w:lang w:eastAsia="ko-KR"/>
+        </w:rPr>
+        <w:t>relations[]</w:t>
+      </w:r>
+      <w:r>
+        <w:rPr>
+          <w:rFonts w:ascii="Arial" w:hAnsi="Arial" w:eastAsia="Malgun Gothic" w:cs="Malgun Gothic"/>
+          <w:color w:val="000000"/>
+          <w:sz w:val="22"/>
+          <w:lang w:eastAsia="ko-KR"/>
+        </w:rPr>
+        <w:t>는 Phase 4 전까지 받지 않는다.</w:t>
+      </w:r>
+    </w:p>
+    <w:p>
+      <w:pPr>
+        <w:pStyle w:val="ListBullet"/>
+      </w:pPr>
+      <w:r>
+        <w:rPr>
+          <w:rFonts w:ascii="Arial" w:hAnsi="Arial" w:eastAsia="Malgun Gothic" w:cs="Malgun Gothic"/>
+          <w:color w:val="000000"/>
+          <w:sz w:val="22"/>
+          <w:lang w:eastAsia="ko-KR"/>
+        </w:rPr>
+        <w:t xml:space="preserve">검증: </w:t>
+      </w:r>
+      <w:r>
+        <w:rPr>
+          <w:rFonts w:ascii="Menlo" w:hAnsi="Menlo" w:eastAsia="Menlo" w:cs="Menlo"/>
+          <w:color w:val="000000"/>
+          <w:sz w:val="21"/>
+          <w:lang w:eastAsia="ko-KR"/>
+        </w:rPr>
+        <w:t>title</w:t>
+      </w:r>
+      <w:r>
+        <w:rPr>
+          <w:rFonts w:ascii="Arial" w:hAnsi="Arial" w:eastAsia="Malgun Gothic" w:cs="Malgun Gothic"/>
+          <w:color w:val="000000"/>
+          <w:sz w:val="22"/>
+          <w:lang w:eastAsia="ko-KR"/>
+        </w:rPr>
+        <w:t xml:space="preserve"> 1~200자, </w:t>
+      </w:r>
+      <w:r>
+        <w:rPr>
+          <w:rFonts w:ascii="Menlo" w:hAnsi="Menlo" w:eastAsia="Menlo" w:cs="Menlo"/>
+          <w:color w:val="000000"/>
+          <w:sz w:val="21"/>
+          <w:lang w:eastAsia="ko-KR"/>
+        </w:rPr>
+        <w:t>summary</w:t>
+      </w:r>
+      <w:r>
+        <w:rPr>
+          <w:rFonts w:ascii="Arial" w:hAnsi="Arial" w:eastAsia="Malgun Gothic" w:cs="Malgun Gothic"/>
+          <w:color w:val="000000"/>
+          <w:sz w:val="22"/>
+          <w:lang w:eastAsia="ko-KR"/>
+        </w:rPr>
+        <w:t xml:space="preserve"> 최대 1,000자, </w:t>
+      </w:r>
+      <w:r>
+        <w:rPr>
+          <w:rFonts w:ascii="Menlo" w:hAnsi="Menlo" w:eastAsia="Menlo" w:cs="Menlo"/>
+          <w:color w:val="000000"/>
+          <w:sz w:val="21"/>
+          <w:lang w:eastAsia="ko-KR"/>
+        </w:rPr>
+        <w:t>bodyMd</w:t>
+      </w:r>
+      <w:r>
+        <w:rPr>
+          <w:rFonts w:ascii="Arial" w:hAnsi="Arial" w:eastAsia="Malgun Gothic" w:cs="Malgun Gothic"/>
+          <w:color w:val="000000"/>
+          <w:sz w:val="22"/>
+          <w:lang w:eastAsia="ko-KR"/>
+        </w:rPr>
+        <w:t xml:space="preserve"> 최대 1,000,000바이트(초과 시 </w:t>
+      </w:r>
+      <w:r>
+        <w:rPr>
+          <w:rFonts w:ascii="Menlo" w:hAnsi="Menlo" w:eastAsia="Menlo" w:cs="Menlo"/>
+          <w:color w:val="000000"/>
+          <w:sz w:val="21"/>
+          <w:lang w:eastAsia="ko-KR"/>
+        </w:rPr>
+        <w:t>413 PAYLOAD_TOO_LARGE</w:t>
+      </w:r>
+      <w:r>
+        <w:rPr>
+          <w:rFonts w:ascii="Arial" w:hAnsi="Arial" w:eastAsia="Malgun Gothic" w:cs="Malgun Gothic"/>
+          <w:color w:val="000000"/>
+          <w:sz w:val="22"/>
+          <w:lang w:eastAsia="ko-KR"/>
+        </w:rPr>
+        <w:t xml:space="preserve">), NUL 문자 거부, 실패는 </w:t>
+      </w:r>
+      <w:r>
+        <w:rPr>
+          <w:rFonts w:ascii="Menlo" w:hAnsi="Menlo" w:eastAsia="Menlo" w:cs="Menlo"/>
+          <w:color w:val="000000"/>
+          <w:sz w:val="21"/>
+          <w:lang w:eastAsia="ko-KR"/>
+        </w:rPr>
+        <w:t>400 VALIDATION_FAILED</w:t>
+      </w:r>
+      <w:r>
+        <w:rPr>
+          <w:rFonts w:ascii="Arial" w:hAnsi="Arial" w:eastAsia="Malgun Gothic" w:cs="Malgun Gothic"/>
+          <w:color w:val="000000"/>
+          <w:sz w:val="22"/>
+          <w:lang w:eastAsia="ko-KR"/>
+        </w:rPr>
+        <w:t xml:space="preserve"> + </w:t>
+      </w:r>
+      <w:r>
+        <w:rPr>
+          <w:rFonts w:ascii="Menlo" w:hAnsi="Menlo" w:eastAsia="Menlo" w:cs="Menlo"/>
+          <w:color w:val="000000"/>
+          <w:sz w:val="21"/>
+          <w:lang w:eastAsia="ko-KR"/>
+        </w:rPr>
+        <w:t>fieldErrors</w:t>
+      </w:r>
+      <w:r>
+        <w:rPr>
+          <w:rFonts w:ascii="Arial" w:hAnsi="Arial" w:eastAsia="Malgun Gothic" w:cs="Malgun Gothic"/>
+          <w:color w:val="000000"/>
+          <w:sz w:val="22"/>
+          <w:lang w:eastAsia="ko-KR"/>
+        </w:rPr>
+        <w:t>.</w:t>
+      </w:r>
+    </w:p>
+    <w:p>
+      <w:pPr>
+        <w:pStyle w:val="ListBullet"/>
+      </w:pPr>
+      <w:r>
+        <w:rPr>
+          <w:rFonts w:ascii="Menlo" w:hAnsi="Menlo" w:eastAsia="Menlo" w:cs="Menlo"/>
+          <w:color w:val="000000"/>
+          <w:sz w:val="21"/>
+          <w:lang w:eastAsia="ko-KR"/>
+        </w:rPr>
+        <w:t>PATCH /nodes/{id}</w:t>
+      </w:r>
+      <w:r>
+        <w:rPr>
+          <w:rFonts w:ascii="Arial" w:hAnsi="Arial" w:eastAsia="Malgun Gothic" w:cs="Malgun Gothic"/>
+          <w:color w:val="000000"/>
+          <w:sz w:val="22"/>
+          <w:lang w:eastAsia="ko-KR"/>
+        </w:rPr>
+        <w:t xml:space="preserve">: 요청에 없거나 </w:t>
+      </w:r>
+      <w:r>
+        <w:rPr>
+          <w:rFonts w:ascii="Menlo" w:hAnsi="Menlo" w:eastAsia="Menlo" w:cs="Menlo"/>
+          <w:color w:val="000000"/>
+          <w:sz w:val="21"/>
+          <w:lang w:eastAsia="ko-KR"/>
+        </w:rPr>
+        <w:t>null</w:t>
+      </w:r>
+      <w:r>
+        <w:rPr>
+          <w:rFonts w:ascii="Arial" w:hAnsi="Arial" w:eastAsia="Malgun Gothic" w:cs="Malgun Gothic"/>
+          <w:color w:val="000000"/>
+          <w:sz w:val="22"/>
+          <w:lang w:eastAsia="ko-KR"/>
+        </w:rPr>
+        <w:t xml:space="preserve">인 필드는 변경하지 않는다. 실제 변경이 없으면 </w:t>
+      </w:r>
+      <w:r>
+        <w:rPr>
+          <w:rFonts w:ascii="Menlo" w:hAnsi="Menlo" w:eastAsia="Menlo" w:cs="Menlo"/>
+          <w:color w:val="000000"/>
+          <w:sz w:val="21"/>
+          <w:lang w:eastAsia="ko-KR"/>
+        </w:rPr>
+        <w:t>version</w:t>
+      </w:r>
+      <w:r>
+        <w:rPr>
+          <w:rFonts w:ascii="Arial" w:hAnsi="Arial" w:eastAsia="Malgun Gothic" w:cs="Malgun Gothic"/>
+          <w:color w:val="000000"/>
+          <w:sz w:val="22"/>
+          <w:lang w:eastAsia="ko-KR"/>
+        </w:rPr>
+        <w:t xml:space="preserve">을 올리지 않는다. </w:t>
+      </w:r>
+      <w:r>
+        <w:rPr>
+          <w:rFonts w:ascii="Menlo" w:hAnsi="Menlo" w:eastAsia="Menlo" w:cs="Menlo"/>
+          <w:color w:val="000000"/>
+          <w:sz w:val="21"/>
+          <w:lang w:eastAsia="ko-KR"/>
+        </w:rPr>
+        <w:t>TRASHED</w:t>
+      </w:r>
+      <w:r>
+        <w:rPr>
+          <w:rFonts w:ascii="Arial" w:hAnsi="Arial" w:eastAsia="Malgun Gothic" w:cs="Malgun Gothic"/>
+          <w:color w:val="000000"/>
+          <w:sz w:val="22"/>
+          <w:lang w:eastAsia="ko-KR"/>
+        </w:rPr>
+        <w:t xml:space="preserve"> Node 수정은 </w:t>
+      </w:r>
+      <w:r>
+        <w:rPr>
+          <w:rFonts w:ascii="Menlo" w:hAnsi="Menlo" w:eastAsia="Menlo" w:cs="Menlo"/>
+          <w:color w:val="000000"/>
+          <w:sz w:val="21"/>
+          <w:lang w:eastAsia="ko-KR"/>
+        </w:rPr>
+        <w:t>409 INVALID_NODE_STATE</w:t>
+      </w:r>
+      <w:r>
+        <w:rPr>
+          <w:rFonts w:ascii="Arial" w:hAnsi="Arial" w:eastAsia="Malgun Gothic" w:cs="Malgun Gothic"/>
+          <w:color w:val="000000"/>
+          <w:sz w:val="22"/>
+          <w:lang w:eastAsia="ko-KR"/>
+        </w:rPr>
+        <w:t xml:space="preserve">. 응답의 </w:t>
+      </w:r>
+      <w:r>
+        <w:rPr>
+          <w:rFonts w:ascii="Menlo" w:hAnsi="Menlo" w:eastAsia="Menlo" w:cs="Menlo"/>
+          <w:color w:val="000000"/>
+          <w:sz w:val="21"/>
+          <w:lang w:eastAsia="ko-KR"/>
+        </w:rPr>
+        <w:t>version</w:t>
+      </w:r>
+      <w:r>
+        <w:rPr>
+          <w:rFonts w:ascii="Arial" w:hAnsi="Arial" w:eastAsia="Malgun Gothic" w:cs="Malgun Gothic"/>
+          <w:color w:val="000000"/>
+          <w:sz w:val="22"/>
+          <w:lang w:eastAsia="ko-KR"/>
+        </w:rPr>
+        <w:t xml:space="preserve">은 </w:t>
+      </w:r>
+      <w:r>
+        <w:rPr>
+          <w:rFonts w:ascii="Arial" w:hAnsi="Arial" w:eastAsia="Malgun Gothic" w:cs="Malgun Gothic"/>
+          <w:b/>
+          <w:color w:val="000000"/>
+          <w:sz w:val="22"/>
+          <w:lang w:eastAsia="ko-KR"/>
+        </w:rPr>
+        <w:t>갱신 후 값</w:t>
+      </w:r>
+      <w:r>
+        <w:rPr>
+          <w:rFonts w:ascii="Arial" w:hAnsi="Arial" w:eastAsia="Malgun Gothic" w:cs="Malgun Gothic"/>
+          <w:color w:val="000000"/>
+          <w:sz w:val="22"/>
+          <w:lang w:eastAsia="ko-KR"/>
+        </w:rPr>
+        <w:t>이며, 클라이언트는 이 값을 다음 요청에 사용한다.</w:t>
+      </w:r>
+    </w:p>
+    <w:p>
+      <w:pPr>
+        <w:pStyle w:val="ListBullet"/>
+      </w:pPr>
+      <w:r>
+        <w:rPr>
+          <w:rFonts w:ascii="Arial" w:hAnsi="Arial" w:eastAsia="Malgun Gothic" w:cs="Malgun Gothic"/>
+          <w:color w:val="000000"/>
+          <w:sz w:val="22"/>
+          <w:lang w:eastAsia="ko-KR"/>
+        </w:rPr>
+        <w:t xml:space="preserve">상태 전이 endpoint는 모두 </w:t>
+      </w:r>
+      <w:r>
+        <w:rPr>
+          <w:rFonts w:ascii="Menlo" w:hAnsi="Menlo" w:eastAsia="Menlo" w:cs="Menlo"/>
+          <w:color w:val="000000"/>
+          <w:sz w:val="21"/>
+          <w:lang w:eastAsia="ko-KR"/>
+        </w:rPr>
+        <w:t>version</w:t>
+      </w:r>
+      <w:r>
+        <w:rPr>
+          <w:rFonts w:ascii="Arial" w:hAnsi="Arial" w:eastAsia="Malgun Gothic" w:cs="Malgun Gothic"/>
+          <w:color w:val="000000"/>
+          <w:sz w:val="22"/>
+          <w:lang w:eastAsia="ko-KR"/>
+        </w:rPr>
+        <w:t xml:space="preserve">을 요구한다. 허용되지 않은 전이는 </w:t>
+      </w:r>
+      <w:r>
+        <w:rPr>
+          <w:rFonts w:ascii="Menlo" w:hAnsi="Menlo" w:eastAsia="Menlo" w:cs="Menlo"/>
+          <w:color w:val="000000"/>
+          <w:sz w:val="21"/>
+          <w:lang w:eastAsia="ko-KR"/>
+        </w:rPr>
+        <w:t>409 INVALID_NODE_STATE</w:t>
+      </w:r>
+      <w:r>
+        <w:rPr>
+          <w:rFonts w:ascii="Arial" w:hAnsi="Arial" w:eastAsia="Malgun Gothic" w:cs="Malgun Gothic"/>
+          <w:color w:val="000000"/>
+          <w:sz w:val="22"/>
+          <w:lang w:eastAsia="ko-KR"/>
+        </w:rPr>
+        <w:t xml:space="preserve">, </w:t>
+      </w:r>
+      <w:r>
+        <w:rPr>
+          <w:rFonts w:ascii="Menlo" w:hAnsi="Menlo" w:eastAsia="Menlo" w:cs="Menlo"/>
+          <w:color w:val="000000"/>
+          <w:sz w:val="21"/>
+          <w:lang w:eastAsia="ko-KR"/>
+        </w:rPr>
+        <w:t>version</w:t>
+      </w:r>
+      <w:r>
+        <w:rPr>
+          <w:rFonts w:ascii="Arial" w:hAnsi="Arial" w:eastAsia="Malgun Gothic" w:cs="Malgun Gothic"/>
+          <w:color w:val="000000"/>
+          <w:sz w:val="22"/>
+          <w:lang w:eastAsia="ko-KR"/>
+        </w:rPr>
+        <w:t xml:space="preserve"> 불일치는 </w:t>
+      </w:r>
+      <w:r>
+        <w:rPr>
+          <w:rFonts w:ascii="Menlo" w:hAnsi="Menlo" w:eastAsia="Menlo" w:cs="Menlo"/>
+          <w:color w:val="000000"/>
+          <w:sz w:val="21"/>
+          <w:lang w:eastAsia="ko-KR"/>
+        </w:rPr>
+        <w:t>409 VERSION_CONFLICT</w:t>
+      </w:r>
+      <w:r>
+        <w:rPr>
+          <w:rFonts w:ascii="Arial" w:hAnsi="Arial" w:eastAsia="Malgun Gothic" w:cs="Malgun Gothic"/>
+          <w:color w:val="000000"/>
+          <w:sz w:val="22"/>
+          <w:lang w:eastAsia="ko-KR"/>
+        </w:rPr>
+        <w:t>다.</w:t>
+      </w:r>
+    </w:p>
+    <w:p>
+      <w:pPr>
+        <w:pStyle w:val="ListBullet"/>
+      </w:pPr>
+      <w:r>
+        <w:rPr>
+          <w:rFonts w:ascii="Menlo" w:hAnsi="Menlo" w:eastAsia="Menlo" w:cs="Menlo"/>
+          <w:color w:val="000000"/>
+          <w:sz w:val="21"/>
+          <w:lang w:eastAsia="ko-KR"/>
+        </w:rPr>
+        <w:t>GET /nodes</w:t>
+      </w:r>
+      <w:r>
+        <w:rPr>
+          <w:rFonts w:ascii="Arial" w:hAnsi="Arial" w:eastAsia="Malgun Gothic" w:cs="Malgun Gothic"/>
+          <w:color w:val="000000"/>
+          <w:sz w:val="22"/>
+          <w:lang w:eastAsia="ko-KR"/>
+        </w:rPr>
+        <w:t xml:space="preserve">: </w:t>
+      </w:r>
+      <w:r>
+        <w:rPr>
+          <w:rFonts w:ascii="Menlo" w:hAnsi="Menlo" w:eastAsia="Menlo" w:cs="Menlo"/>
+          <w:color w:val="000000"/>
+          <w:sz w:val="21"/>
+          <w:lang w:eastAsia="ko-KR"/>
+        </w:rPr>
+        <w:t>status</w:t>
+      </w:r>
+      <w:r>
+        <w:rPr>
+          <w:rFonts w:ascii="Arial" w:hAnsi="Arial" w:eastAsia="Malgun Gothic" w:cs="Malgun Gothic"/>
+          <w:color w:val="000000"/>
+          <w:sz w:val="22"/>
+          <w:lang w:eastAsia="ko-KR"/>
+        </w:rPr>
+        <w:t xml:space="preserve"> 미지정 시 </w:t>
+      </w:r>
+      <w:r>
+        <w:rPr>
+          <w:rFonts w:ascii="Menlo" w:hAnsi="Menlo" w:eastAsia="Menlo" w:cs="Menlo"/>
+          <w:color w:val="000000"/>
+          <w:sz w:val="21"/>
+          <w:lang w:eastAsia="ko-KR"/>
+        </w:rPr>
+        <w:t>ACTIVE</w:t>
+      </w:r>
+      <w:r>
+        <w:rPr>
+          <w:rFonts w:ascii="Arial" w:hAnsi="Arial" w:eastAsia="Malgun Gothic" w:cs="Malgun Gothic"/>
+          <w:color w:val="000000"/>
+          <w:sz w:val="22"/>
+          <w:lang w:eastAsia="ko-KR"/>
+        </w:rPr>
+        <w:t xml:space="preserve">만 반환한다. 정렬은 </w:t>
+      </w:r>
+      <w:r>
+        <w:rPr>
+          <w:rFonts w:ascii="Menlo" w:hAnsi="Menlo" w:eastAsia="Menlo" w:cs="Menlo"/>
+          <w:color w:val="000000"/>
+          <w:sz w:val="21"/>
+          <w:lang w:eastAsia="ko-KR"/>
+        </w:rPr>
+        <w:t>updatedAt DESC, id ASC</w:t>
+      </w:r>
+      <w:r>
+        <w:rPr>
+          <w:rFonts w:ascii="Arial" w:hAnsi="Arial" w:eastAsia="Malgun Gothic" w:cs="Malgun Gothic"/>
+          <w:color w:val="000000"/>
+          <w:sz w:val="22"/>
+          <w:lang w:eastAsia="ko-KR"/>
+        </w:rPr>
+        <w:t xml:space="preserve"> 하나이며 </w:t>
+      </w:r>
+      <w:r>
+        <w:rPr>
+          <w:rFonts w:ascii="Menlo" w:hAnsi="Menlo" w:eastAsia="Menlo" w:cs="Menlo"/>
+          <w:color w:val="000000"/>
+          <w:sz w:val="21"/>
+          <w:lang w:eastAsia="ko-KR"/>
+        </w:rPr>
+        <w:t>sort</w:t>
+      </w:r>
+      <w:r>
+        <w:rPr>
+          <w:rFonts w:ascii="Arial" w:hAnsi="Arial" w:eastAsia="Malgun Gothic" w:cs="Malgun Gothic"/>
+          <w:color w:val="000000"/>
+          <w:sz w:val="22"/>
+          <w:lang w:eastAsia="ko-KR"/>
+        </w:rPr>
+        <w:t xml:space="preserve">에 다른 값을 주면 </w:t>
+      </w:r>
+      <w:r>
+        <w:rPr>
+          <w:rFonts w:ascii="Menlo" w:hAnsi="Menlo" w:eastAsia="Menlo" w:cs="Menlo"/>
+          <w:color w:val="000000"/>
+          <w:sz w:val="21"/>
+          <w:lang w:eastAsia="ko-KR"/>
+        </w:rPr>
+        <w:t>400</w:t>
+      </w:r>
+      <w:r>
+        <w:rPr>
+          <w:rFonts w:ascii="Arial" w:hAnsi="Arial" w:eastAsia="Malgun Gothic" w:cs="Malgun Gothic"/>
+          <w:color w:val="000000"/>
+          <w:sz w:val="22"/>
+          <w:lang w:eastAsia="ko-KR"/>
+        </w:rPr>
+        <w:t xml:space="preserve">이다. cursor는 opaque(마이크로초 단위 </w:t>
+      </w:r>
+      <w:r>
+        <w:rPr>
+          <w:rFonts w:ascii="Menlo" w:hAnsi="Menlo" w:eastAsia="Menlo" w:cs="Menlo"/>
+          <w:color w:val="000000"/>
+          <w:sz w:val="21"/>
+          <w:lang w:eastAsia="ko-KR"/>
+        </w:rPr>
+        <w:t>updatedAt</w:t>
+      </w:r>
+      <w:r>
+        <w:rPr>
+          <w:rFonts w:ascii="Arial" w:hAnsi="Arial" w:eastAsia="Malgun Gothic" w:cs="Malgun Gothic"/>
+          <w:color w:val="000000"/>
+          <w:sz w:val="22"/>
+          <w:lang w:eastAsia="ko-KR"/>
+        </w:rPr>
+        <w:t xml:space="preserve"> + </w:t>
+      </w:r>
+      <w:r>
+        <w:rPr>
+          <w:rFonts w:ascii="Menlo" w:hAnsi="Menlo" w:eastAsia="Menlo" w:cs="Menlo"/>
+          <w:color w:val="000000"/>
+          <w:sz w:val="21"/>
+          <w:lang w:eastAsia="ko-KR"/>
+        </w:rPr>
+        <w:t>id</w:t>
+      </w:r>
+      <w:r>
+        <w:rPr>
+          <w:rFonts w:ascii="Arial" w:hAnsi="Arial" w:eastAsia="Malgun Gothic" w:cs="Malgun Gothic"/>
+          <w:color w:val="000000"/>
+          <w:sz w:val="22"/>
+          <w:lang w:eastAsia="ko-KR"/>
+        </w:rPr>
+        <w:t xml:space="preserve">)이고 잘못된 값은 </w:t>
+      </w:r>
+      <w:r>
+        <w:rPr>
+          <w:rFonts w:ascii="Menlo" w:hAnsi="Menlo" w:eastAsia="Menlo" w:cs="Menlo"/>
+          <w:color w:val="000000"/>
+          <w:sz w:val="21"/>
+          <w:lang w:eastAsia="ko-KR"/>
+        </w:rPr>
+        <w:t>400 INVALID_CURSOR</w:t>
+      </w:r>
+      <w:r>
+        <w:rPr>
+          <w:rFonts w:ascii="Arial" w:hAnsi="Arial" w:eastAsia="Malgun Gothic" w:cs="Malgun Gothic"/>
+          <w:color w:val="000000"/>
+          <w:sz w:val="22"/>
+          <w:lang w:eastAsia="ko-KR"/>
+        </w:rPr>
+        <w:t xml:space="preserve">, </w:t>
+      </w:r>
+      <w:r>
+        <w:rPr>
+          <w:rFonts w:ascii="Menlo" w:hAnsi="Menlo" w:eastAsia="Menlo" w:cs="Menlo"/>
+          <w:color w:val="000000"/>
+          <w:sz w:val="21"/>
+          <w:lang w:eastAsia="ko-KR"/>
+        </w:rPr>
+        <w:t>size</w:t>
+      </w:r>
+      <w:r>
+        <w:rPr>
+          <w:rFonts w:ascii="Arial" w:hAnsi="Arial" w:eastAsia="Malgun Gothic" w:cs="Malgun Gothic"/>
+          <w:color w:val="000000"/>
+          <w:sz w:val="22"/>
+          <w:lang w:eastAsia="ko-KR"/>
+        </w:rPr>
+        <w:t xml:space="preserve">가 1~100을 벗어나면 </w:t>
+      </w:r>
+      <w:r>
+        <w:rPr>
+          <w:rFonts w:ascii="Menlo" w:hAnsi="Menlo" w:eastAsia="Menlo" w:cs="Menlo"/>
+          <w:color w:val="000000"/>
+          <w:sz w:val="21"/>
+          <w:lang w:eastAsia="ko-KR"/>
+        </w:rPr>
+        <w:t>400</w:t>
+      </w:r>
+      <w:r>
+        <w:rPr>
+          <w:rFonts w:ascii="Arial" w:hAnsi="Arial" w:eastAsia="Malgun Gothic" w:cs="Malgun Gothic"/>
+          <w:color w:val="000000"/>
+          <w:sz w:val="22"/>
+          <w:lang w:eastAsia="ko-KR"/>
+        </w:rPr>
+        <w:t>이다.</w:t>
+      </w:r>
+    </w:p>
+    <w:p>
+      <w:pPr>
+        <w:pStyle w:val="ListBullet"/>
+      </w:pPr>
+      <w:r>
+        <w:rPr>
+          <w:rFonts w:ascii="Arial" w:hAnsi="Arial" w:eastAsia="Malgun Gothic" w:cs="Malgun Gothic"/>
+          <w:color w:val="000000"/>
+          <w:sz w:val="22"/>
+          <w:lang w:eastAsia="ko-KR"/>
+        </w:rPr>
+        <w:t xml:space="preserve">다른 Workspace의 Node/Tag id는 존재 여부를 숨기기 위해 </w:t>
+      </w:r>
+      <w:r>
+        <w:rPr>
+          <w:rFonts w:ascii="Menlo" w:hAnsi="Menlo" w:eastAsia="Menlo" w:cs="Menlo"/>
+          <w:color w:val="000000"/>
+          <w:sz w:val="21"/>
+          <w:lang w:eastAsia="ko-KR"/>
+        </w:rPr>
+        <w:t>404</w:t>
+      </w:r>
+      <w:r>
+        <w:rPr>
+          <w:rFonts w:ascii="Arial" w:hAnsi="Arial" w:eastAsia="Malgun Gothic" w:cs="Malgun Gothic"/>
+          <w:color w:val="000000"/>
+          <w:sz w:val="22"/>
+          <w:lang w:eastAsia="ko-KR"/>
+        </w:rPr>
+        <w:t xml:space="preserve">(Node) 또는 </w:t>
+      </w:r>
+      <w:r>
+        <w:rPr>
+          <w:rFonts w:ascii="Menlo" w:hAnsi="Menlo" w:eastAsia="Menlo" w:cs="Menlo"/>
+          <w:color w:val="000000"/>
+          <w:sz w:val="21"/>
+          <w:lang w:eastAsia="ko-KR"/>
+        </w:rPr>
+        <w:t>400</w:t>
+      </w:r>
+      <w:r>
+        <w:rPr>
+          <w:rFonts w:ascii="Arial" w:hAnsi="Arial" w:eastAsia="Malgun Gothic" w:cs="Malgun Gothic"/>
+          <w:color w:val="000000"/>
+          <w:sz w:val="22"/>
+          <w:lang w:eastAsia="ko-KR"/>
+        </w:rPr>
+        <w:t xml:space="preserve">(요청 본문의 </w:t>
+      </w:r>
+      <w:r>
+        <w:rPr>
+          <w:rFonts w:ascii="Menlo" w:hAnsi="Menlo" w:eastAsia="Menlo" w:cs="Menlo"/>
+          <w:color w:val="000000"/>
+          <w:sz w:val="21"/>
+          <w:lang w:eastAsia="ko-KR"/>
+        </w:rPr>
+        <w:t>tagIds</w:t>
+      </w:r>
+      <w:r>
+        <w:rPr>
+          <w:rFonts w:ascii="Arial" w:hAnsi="Arial" w:eastAsia="Malgun Gothic" w:cs="Malgun Gothic"/>
+          <w:color w:val="000000"/>
+          <w:sz w:val="22"/>
+          <w:lang w:eastAsia="ko-KR"/>
+        </w:rPr>
+        <w:t xml:space="preserve"> 참조)로 응답한다.</w:t>
+      </w:r>
+    </w:p>
+    <w:p>
+      <w:pPr>
+        <w:pStyle w:val="ListBullet"/>
+      </w:pPr>
+      <w:r>
+        <w:rPr>
+          <w:rFonts w:ascii="Arial" w:hAnsi="Arial" w:eastAsia="Malgun Gothic" w:cs="Malgun Gothic"/>
+          <w:color w:val="000000"/>
+          <w:sz w:val="22"/>
+          <w:lang w:eastAsia="ko-KR"/>
+        </w:rPr>
+        <w:t xml:space="preserve">태그 이름은 앞뒤 공백 제거, 연속 공백 축소, 소문자 정규화 값으로 Workspace 내 유일성을 판정한다(대소문자만 다른 이름은 </w:t>
+      </w:r>
+      <w:r>
+        <w:rPr>
+          <w:rFonts w:ascii="Menlo" w:hAnsi="Menlo" w:eastAsia="Menlo" w:cs="Menlo"/>
+          <w:color w:val="000000"/>
+          <w:sz w:val="21"/>
+          <w:lang w:eastAsia="ko-KR"/>
+        </w:rPr>
+        <w:t>409 TAG_EXISTS</w:t>
+      </w:r>
+      <w:r>
+        <w:rPr>
+          <w:rFonts w:ascii="Arial" w:hAnsi="Arial" w:eastAsia="Malgun Gothic" w:cs="Malgun Gothic"/>
+          <w:color w:val="000000"/>
+          <w:sz w:val="22"/>
+          <w:lang w:eastAsia="ko-KR"/>
+        </w:rPr>
+        <w:t>).</w:t>
+      </w:r>
+    </w:p>
+    <w:p>
+      <w:pPr>
+        <w:pStyle w:val="ListBullet"/>
+      </w:pPr>
+      <w:r>
+        <w:rPr>
+          <w:rFonts w:ascii="Menlo" w:hAnsi="Menlo" w:eastAsia="Menlo" w:cs="Menlo"/>
+          <w:color w:val="000000"/>
+          <w:sz w:val="21"/>
+          <w:lang w:eastAsia="ko-KR"/>
+        </w:rPr>
+        <w:t>POST /nodes/{id}/permanent-delete</w:t>
+      </w:r>
+      <w:r>
+        <w:rPr>
+          <w:rFonts w:ascii="Arial" w:hAnsi="Arial" w:eastAsia="Malgun Gothic" w:cs="Malgun Gothic"/>
+          <w:color w:val="000000"/>
+          <w:sz w:val="22"/>
+          <w:lang w:eastAsia="ko-KR"/>
+        </w:rPr>
+        <w:t xml:space="preserve">는 재인증(§17.2.2)에 의존하므로 Phase 2에서 구현하지 않고 Phase 7로 이월한다. </w:t>
+      </w:r>
+      <w:r>
+        <w:rPr>
+          <w:rFonts w:ascii="Menlo" w:hAnsi="Menlo" w:eastAsia="Menlo" w:cs="Menlo"/>
+          <w:color w:val="000000"/>
+          <w:sz w:val="21"/>
+          <w:lang w:eastAsia="ko-KR"/>
+        </w:rPr>
+        <w:t>NodeDetail</w:t>
+      </w:r>
+      <w:r>
+        <w:rPr>
+          <w:rFonts w:ascii="Arial" w:hAnsi="Arial" w:eastAsia="Malgun Gothic" w:cs="Malgun Gothic"/>
+          <w:color w:val="000000"/>
+          <w:sz w:val="22"/>
+          <w:lang w:eastAsia="ko-KR"/>
+        </w:rPr>
+        <w:t>의 관계 정보와 backlink도 Phase 4에서 추가한다.</w:t>
+      </w:r>
+    </w:p>
+    <w:p>
+      <w:r>
+        <w:rPr>
           <w:rFonts w:ascii="Menlo" w:hAnsi="Menlo" w:eastAsia="Menlo" w:cs="Menlo"/>
           <w:color w:val="000000"/>
           <w:sz w:val="21"/>

</xml_diff>

<commit_message>
feat(snippet): Phase 3 Snippet 구현
Backend: snippets/snippet_versions (V6), 불변 버전, 코드 변경 시에만 새 버전, 원문 그대로 저장,
512KB(바이트) 제한, 서버 측 secret 감지와 확인 흐름(422), 원자적 사용 통계,
Node 공통 로직 재사용(subtype 생성/수정), Library 목록 분리.
Frontend: Snippets 목록·상세·편집, Monaco(지연 로딩), Shiki 하이라이트(HTML 주입 없음),
정확한 클립보드 복사, 버전 이력과 이전 원문 조회.
Tests: 통합 테스트(동시 수정·동시 복사 포함), SecretScanner 단위 테스트, Playwright E2E.
Fix: secret 스캔 정규식 O(n^2) 폭주를 창 단위 스캔으로 해결, 접두어 붙은 환경변수 탐지,
E2E 경합 2건 수정.
Docs: 설계서 v1.6 (Snippet 계약, 구현 결과, refresh 응답 유실 시 family 폐기 미결 결정)

Co-Authored-By: Claude Sonnet 5.5 <noreply@anthropic.com>
</commit_message>
<xml_diff>
--- a/docs-word/06-API_명세서.docx
+++ b/docs-word/06-API_명세서.docx
@@ -9475,6 +9475,1204 @@
       </w:r>
     </w:p>
     <w:p>
+      <w:r>
+        <w:rPr>
+          <w:rFonts w:ascii="Arial" w:hAnsi="Arial" w:eastAsia="Malgun Gothic" w:cs="Malgun Gothic"/>
+          <w:b/>
+          <w:color w:val="000000"/>
+          <w:sz w:val="22"/>
+          <w:lang w:eastAsia="ko-KR"/>
+        </w:rPr>
+        <w:t>Phase 3 구현 범위와 세부 계약(v1.6 확정)</w:t>
+      </w:r>
+    </w:p>
+    <w:p>
+      <w:pPr>
+        <w:pStyle w:val="ListBullet"/>
+      </w:pPr>
+      <w:r>
+        <w:rPr>
+          <w:rFonts w:ascii="Arial" w:hAnsi="Arial" w:eastAsia="Malgun Gothic" w:cs="Malgun Gothic"/>
+          <w:color w:val="000000"/>
+          <w:sz w:val="22"/>
+          <w:lang w:eastAsia="ko-KR"/>
+        </w:rPr>
+        <w:t xml:space="preserve">Snippet은 </w:t>
+      </w:r>
+      <w:r>
+        <w:rPr>
+          <w:rFonts w:ascii="Menlo" w:hAnsi="Menlo" w:eastAsia="Menlo" w:cs="Menlo"/>
+          <w:color w:val="000000"/>
+          <w:sz w:val="21"/>
+          <w:lang w:eastAsia="ko-KR"/>
+        </w:rPr>
+        <w:t>knowledge_nodes(node_type='SNIPPET')</w:t>
+      </w:r>
+      <w:r>
+        <w:rPr>
+          <w:rFonts w:ascii="Arial" w:hAnsi="Arial" w:eastAsia="Malgun Gothic" w:cs="Malgun Gothic"/>
+          <w:color w:val="000000"/>
+          <w:sz w:val="22"/>
+          <w:lang w:eastAsia="ko-KR"/>
+        </w:rPr>
+        <w:t>의 subtype이다. 제목·설명(</w:t>
+      </w:r>
+      <w:r>
+        <w:rPr>
+          <w:rFonts w:ascii="Menlo" w:hAnsi="Menlo" w:eastAsia="Menlo" w:cs="Menlo"/>
+          <w:color w:val="000000"/>
+          <w:sz w:val="21"/>
+          <w:lang w:eastAsia="ko-KR"/>
+        </w:rPr>
+        <w:t>summary</w:t>
+      </w:r>
+      <w:r>
+        <w:rPr>
+          <w:rFonts w:ascii="Arial" w:hAnsi="Arial" w:eastAsia="Malgun Gothic" w:cs="Malgun Gothic"/>
+          <w:color w:val="000000"/>
+          <w:sz w:val="22"/>
+          <w:lang w:eastAsia="ko-KR"/>
+        </w:rPr>
+        <w:t xml:space="preserve">)·태그·상태·즐겨찾기는 Node 공통 로직을 그대로 쓰므로 </w:t>
+      </w:r>
+      <w:r>
+        <w:rPr>
+          <w:rFonts w:ascii="Arial" w:hAnsi="Arial" w:eastAsia="Malgun Gothic" w:cs="Malgun Gothic"/>
+          <w:b/>
+          <w:color w:val="000000"/>
+          <w:sz w:val="22"/>
+          <w:lang w:eastAsia="ko-KR"/>
+        </w:rPr>
+        <w:t>상태 전이와 즐겨찾기는 `/nodes/{id}/archive`·`/trash`·`/favorite` 등 공통 endpoint</w:t>
+      </w:r>
+      <w:r>
+        <w:rPr>
+          <w:rFonts w:ascii="Arial" w:hAnsi="Arial" w:eastAsia="Malgun Gothic" w:cs="Malgun Gothic"/>
+          <w:color w:val="000000"/>
+          <w:sz w:val="22"/>
+          <w:lang w:eastAsia="ko-KR"/>
+        </w:rPr>
+        <w:t>를 사용한다(Snippet 전용 endpoint 없음).</w:t>
+      </w:r>
+    </w:p>
+    <w:p>
+      <w:pPr>
+        <w:pStyle w:val="ListBullet"/>
+      </w:pPr>
+      <w:r>
+        <w:rPr>
+          <w:rFonts w:ascii="Arial" w:hAnsi="Arial" w:eastAsia="Malgun Gothic" w:cs="Malgun Gothic"/>
+          <w:color w:val="000000"/>
+          <w:sz w:val="22"/>
+          <w:lang w:eastAsia="ko-KR"/>
+        </w:rPr>
+        <w:t xml:space="preserve">응답 모양: </w:t>
+      </w:r>
+      <w:r>
+        <w:rPr>
+          <w:rFonts w:ascii="Menlo" w:hAnsi="Menlo" w:eastAsia="Menlo" w:cs="Menlo"/>
+          <w:color w:val="000000"/>
+          <w:sz w:val="21"/>
+          <w:lang w:eastAsia="ko-KR"/>
+        </w:rPr>
+        <w:t>SnippetDetail = {공통 Node 필드, snippet:{language, framework, currentVersionNo, useCount, lastUsedAt, secretScanStatus}, currentVersion:{versionNo, code, changeSummary, createdAt}}</w:t>
+      </w:r>
+      <w:r>
+        <w:rPr>
+          <w:rFonts w:ascii="Arial" w:hAnsi="Arial" w:eastAsia="Malgun Gothic" w:cs="Malgun Gothic"/>
+          <w:color w:val="000000"/>
+          <w:sz w:val="22"/>
+          <w:lang w:eastAsia="ko-KR"/>
+        </w:rPr>
+        <w:t>. 목록(</w:t>
+      </w:r>
+      <w:r>
+        <w:rPr>
+          <w:rFonts w:ascii="Menlo" w:hAnsi="Menlo" w:eastAsia="Menlo" w:cs="Menlo"/>
+          <w:color w:val="000000"/>
+          <w:sz w:val="21"/>
+          <w:lang w:eastAsia="ko-KR"/>
+        </w:rPr>
+        <w:t>SnippetSummary</w:t>
+      </w:r>
+      <w:r>
+        <w:rPr>
+          <w:rFonts w:ascii="Arial" w:hAnsi="Arial" w:eastAsia="Malgun Gothic" w:cs="Malgun Gothic"/>
+          <w:color w:val="000000"/>
+          <w:sz w:val="22"/>
+          <w:lang w:eastAsia="ko-KR"/>
+        </w:rPr>
+        <w:t>)은 코드 원문을 싣지 않는다.</w:t>
+      </w:r>
+    </w:p>
+    <w:p>
+      <w:pPr>
+        <w:pStyle w:val="ListBullet"/>
+      </w:pPr>
+      <w:r>
+        <w:rPr>
+          <w:rFonts w:ascii="Arial" w:hAnsi="Arial" w:eastAsia="Malgun Gothic" w:cs="Malgun Gothic"/>
+          <w:b/>
+          <w:color w:val="000000"/>
+          <w:sz w:val="22"/>
+          <w:lang w:eastAsia="ko-KR"/>
+        </w:rPr>
+        <w:t>Library와 분리:</w:t>
+      </w:r>
+      <w:r>
+        <w:rPr>
+          <w:rFonts w:ascii="Arial" w:hAnsi="Arial" w:eastAsia="Malgun Gothic" w:cs="Malgun Gothic"/>
+          <w:color w:val="000000"/>
+          <w:sz w:val="22"/>
+          <w:lang w:eastAsia="ko-KR"/>
+        </w:rPr>
+        <w:t xml:space="preserve"> </w:t>
+      </w:r>
+      <w:r>
+        <w:rPr>
+          <w:rFonts w:ascii="Menlo" w:hAnsi="Menlo" w:eastAsia="Menlo" w:cs="Menlo"/>
+          <w:color w:val="000000"/>
+          <w:sz w:val="21"/>
+          <w:lang w:eastAsia="ko-KR"/>
+        </w:rPr>
+        <w:t>GET /nodes</w:t>
+      </w:r>
+      <w:r>
+        <w:rPr>
+          <w:rFonts w:ascii="Arial" w:hAnsi="Arial" w:eastAsia="Malgun Gothic" w:cs="Malgun Gothic"/>
+          <w:color w:val="000000"/>
+          <w:sz w:val="22"/>
+          <w:lang w:eastAsia="ko-KR"/>
+        </w:rPr>
+        <w:t xml:space="preserve">는 </w:t>
+      </w:r>
+      <w:r>
+        <w:rPr>
+          <w:rFonts w:ascii="Menlo" w:hAnsi="Menlo" w:eastAsia="Menlo" w:cs="Menlo"/>
+          <w:color w:val="000000"/>
+          <w:sz w:val="21"/>
+          <w:lang w:eastAsia="ko-KR"/>
+        </w:rPr>
+        <w:t>type</w:t>
+      </w:r>
+      <w:r>
+        <w:rPr>
+          <w:rFonts w:ascii="Arial" w:hAnsi="Arial" w:eastAsia="Malgun Gothic" w:cs="Malgun Gothic"/>
+          <w:color w:val="000000"/>
+          <w:sz w:val="22"/>
+          <w:lang w:eastAsia="ko-KR"/>
+        </w:rPr>
+        <w:t xml:space="preserve"> 미지정 시 Concept/Note만 반환하고 Snippet은 제외한다(§8.1: Snippet은 독립 작업 공간). Node 공통 </w:t>
+      </w:r>
+      <w:r>
+        <w:rPr>
+          <w:rFonts w:ascii="Menlo" w:hAnsi="Menlo" w:eastAsia="Menlo" w:cs="Menlo"/>
+          <w:color w:val="000000"/>
+          <w:sz w:val="21"/>
+          <w:lang w:eastAsia="ko-KR"/>
+        </w:rPr>
+        <w:t>PATCH /nodes/{id}</w:t>
+      </w:r>
+      <w:r>
+        <w:rPr>
+          <w:rFonts w:ascii="Arial" w:hAnsi="Arial" w:eastAsia="Malgun Gothic" w:cs="Malgun Gothic"/>
+          <w:color w:val="000000"/>
+          <w:sz w:val="22"/>
+          <w:lang w:eastAsia="ko-KR"/>
+        </w:rPr>
+        <w:t xml:space="preserve">로 Snippet을 수정하려 하면 </w:t>
+      </w:r>
+      <w:r>
+        <w:rPr>
+          <w:rFonts w:ascii="Menlo" w:hAnsi="Menlo" w:eastAsia="Menlo" w:cs="Menlo"/>
+          <w:color w:val="000000"/>
+          <w:sz w:val="21"/>
+          <w:lang w:eastAsia="ko-KR"/>
+        </w:rPr>
+        <w:t>400 VALIDATION_FAILED(type: USE_SUBTYPE_API)</w:t>
+      </w:r>
+      <w:r>
+        <w:rPr>
+          <w:rFonts w:ascii="Arial" w:hAnsi="Arial" w:eastAsia="Malgun Gothic" w:cs="Malgun Gothic"/>
+          <w:color w:val="000000"/>
+          <w:sz w:val="22"/>
+          <w:lang w:eastAsia="ko-KR"/>
+        </w:rPr>
+        <w:t xml:space="preserve">이고, </w:t>
+      </w:r>
+      <w:r>
+        <w:rPr>
+          <w:rFonts w:ascii="Menlo" w:hAnsi="Menlo" w:eastAsia="Menlo" w:cs="Menlo"/>
+          <w:color w:val="000000"/>
+          <w:sz w:val="21"/>
+          <w:lang w:eastAsia="ko-KR"/>
+        </w:rPr>
+        <w:t>POST /nodes</w:t>
+      </w:r>
+      <w:r>
+        <w:rPr>
+          <w:rFonts w:ascii="Arial" w:hAnsi="Arial" w:eastAsia="Malgun Gothic" w:cs="Malgun Gothic"/>
+          <w:color w:val="000000"/>
+          <w:sz w:val="22"/>
+          <w:lang w:eastAsia="ko-KR"/>
+        </w:rPr>
+        <w:t xml:space="preserve">로 </w:t>
+      </w:r>
+      <w:r>
+        <w:rPr>
+          <w:rFonts w:ascii="Menlo" w:hAnsi="Menlo" w:eastAsia="Menlo" w:cs="Menlo"/>
+          <w:color w:val="000000"/>
+          <w:sz w:val="21"/>
+          <w:lang w:eastAsia="ko-KR"/>
+        </w:rPr>
+        <w:t>SNIPPET</w:t>
+      </w:r>
+      <w:r>
+        <w:rPr>
+          <w:rFonts w:ascii="Arial" w:hAnsi="Arial" w:eastAsia="Malgun Gothic" w:cs="Malgun Gothic"/>
+          <w:color w:val="000000"/>
+          <w:sz w:val="22"/>
+          <w:lang w:eastAsia="ko-KR"/>
+        </w:rPr>
+        <w:t>을 만들 수 없다(</w:t>
+      </w:r>
+      <w:r>
+        <w:rPr>
+          <w:rFonts w:ascii="Menlo" w:hAnsi="Menlo" w:eastAsia="Menlo" w:cs="Menlo"/>
+          <w:color w:val="000000"/>
+          <w:sz w:val="21"/>
+          <w:lang w:eastAsia="ko-KR"/>
+        </w:rPr>
+        <w:t>400 UNSUPPORTED_TYPE</w:t>
+      </w:r>
+      <w:r>
+        <w:rPr>
+          <w:rFonts w:ascii="Arial" w:hAnsi="Arial" w:eastAsia="Malgun Gothic" w:cs="Malgun Gothic"/>
+          <w:color w:val="000000"/>
+          <w:sz w:val="22"/>
+          <w:lang w:eastAsia="ko-KR"/>
+        </w:rPr>
+        <w:t xml:space="preserve">). 반대로 Concept/Note id를 </w:t>
+      </w:r>
+      <w:r>
+        <w:rPr>
+          <w:rFonts w:ascii="Menlo" w:hAnsi="Menlo" w:eastAsia="Menlo" w:cs="Menlo"/>
+          <w:color w:val="000000"/>
+          <w:sz w:val="21"/>
+          <w:lang w:eastAsia="ko-KR"/>
+        </w:rPr>
+        <w:t>/snippets/{id}</w:t>
+      </w:r>
+      <w:r>
+        <w:rPr>
+          <w:rFonts w:ascii="Arial" w:hAnsi="Arial" w:eastAsia="Malgun Gothic" w:cs="Malgun Gothic"/>
+          <w:color w:val="000000"/>
+          <w:sz w:val="22"/>
+          <w:lang w:eastAsia="ko-KR"/>
+        </w:rPr>
+        <w:t xml:space="preserve">로 조회·수정하면 </w:t>
+      </w:r>
+      <w:r>
+        <w:rPr>
+          <w:rFonts w:ascii="Menlo" w:hAnsi="Menlo" w:eastAsia="Menlo" w:cs="Menlo"/>
+          <w:color w:val="000000"/>
+          <w:sz w:val="21"/>
+          <w:lang w:eastAsia="ko-KR"/>
+        </w:rPr>
+        <w:t>404</w:t>
+      </w:r>
+      <w:r>
+        <w:rPr>
+          <w:rFonts w:ascii="Arial" w:hAnsi="Arial" w:eastAsia="Malgun Gothic" w:cs="Malgun Gothic"/>
+          <w:color w:val="000000"/>
+          <w:sz w:val="22"/>
+          <w:lang w:eastAsia="ko-KR"/>
+        </w:rPr>
+        <w:t>다.</w:t>
+      </w:r>
+    </w:p>
+    <w:p>
+      <w:pPr>
+        <w:pStyle w:val="ListBullet"/>
+      </w:pPr>
+      <w:r>
+        <w:rPr>
+          <w:rFonts w:ascii="Arial" w:hAnsi="Arial" w:eastAsia="Malgun Gothic" w:cs="Malgun Gothic"/>
+          <w:b/>
+          <w:color w:val="000000"/>
+          <w:sz w:val="22"/>
+          <w:lang w:eastAsia="ko-KR"/>
+        </w:rPr>
+        <w:t>코드 원문 보존(SNP-03):</w:t>
+      </w:r>
+      <w:r>
+        <w:rPr>
+          <w:rFonts w:ascii="Arial" w:hAnsi="Arial" w:eastAsia="Malgun Gothic" w:cs="Malgun Gothic"/>
+          <w:color w:val="000000"/>
+          <w:sz w:val="22"/>
+          <w:lang w:eastAsia="ko-KR"/>
+        </w:rPr>
+        <w:t xml:space="preserve"> 코드는 trim·줄바꿈 정규화 없이 </w:t>
+      </w:r>
+      <w:r>
+        <w:rPr>
+          <w:rFonts w:ascii="Arial" w:hAnsi="Arial" w:eastAsia="Malgun Gothic" w:cs="Malgun Gothic"/>
+          <w:b/>
+          <w:color w:val="000000"/>
+          <w:sz w:val="22"/>
+          <w:lang w:eastAsia="ko-KR"/>
+        </w:rPr>
+        <w:t>입력 그대로</w:t>
+      </w:r>
+      <w:r>
+        <w:rPr>
+          <w:rFonts w:ascii="Arial" w:hAnsi="Arial" w:eastAsia="Malgun Gothic" w:cs="Malgun Gothic"/>
+          <w:color w:val="000000"/>
+          <w:sz w:val="22"/>
+          <w:lang w:eastAsia="ko-KR"/>
+        </w:rPr>
+        <w:t xml:space="preserve"> 저장·반환한다. 검증: 공백뿐이면 </w:t>
+      </w:r>
+      <w:r>
+        <w:rPr>
+          <w:rFonts w:ascii="Menlo" w:hAnsi="Menlo" w:eastAsia="Menlo" w:cs="Menlo"/>
+          <w:color w:val="000000"/>
+          <w:sz w:val="21"/>
+          <w:lang w:eastAsia="ko-KR"/>
+        </w:rPr>
+        <w:t>400</w:t>
+      </w:r>
+      <w:r>
+        <w:rPr>
+          <w:rFonts w:ascii="Arial" w:hAnsi="Arial" w:eastAsia="Malgun Gothic" w:cs="Malgun Gothic"/>
+          <w:color w:val="000000"/>
+          <w:sz w:val="22"/>
+          <w:lang w:eastAsia="ko-KR"/>
+        </w:rPr>
+        <w:t xml:space="preserve">, NUL 문자·짝 없는 surrogate는 </w:t>
+      </w:r>
+      <w:r>
+        <w:rPr>
+          <w:rFonts w:ascii="Menlo" w:hAnsi="Menlo" w:eastAsia="Menlo" w:cs="Menlo"/>
+          <w:color w:val="000000"/>
+          <w:sz w:val="21"/>
+          <w:lang w:eastAsia="ko-KR"/>
+        </w:rPr>
+        <w:t>400 INVALID_CHARACTER</w:t>
+      </w:r>
+      <w:r>
+        <w:rPr>
+          <w:rFonts w:ascii="Arial" w:hAnsi="Arial" w:eastAsia="Malgun Gothic" w:cs="Malgun Gothic"/>
+          <w:color w:val="000000"/>
+          <w:sz w:val="22"/>
+          <w:lang w:eastAsia="ko-KR"/>
+        </w:rPr>
+        <w:t xml:space="preserve">(조용히 치환하지 않음), UTF-8 </w:t>
+      </w:r>
+      <w:r>
+        <w:rPr>
+          <w:rFonts w:ascii="Arial" w:hAnsi="Arial" w:eastAsia="Malgun Gothic" w:cs="Malgun Gothic"/>
+          <w:b/>
+          <w:color w:val="000000"/>
+          <w:sz w:val="22"/>
+          <w:lang w:eastAsia="ko-KR"/>
+        </w:rPr>
+        <w:t>바이트</w:t>
+      </w:r>
+      <w:r>
+        <w:rPr>
+          <w:rFonts w:ascii="Arial" w:hAnsi="Arial" w:eastAsia="Malgun Gothic" w:cs="Malgun Gothic"/>
+          <w:color w:val="000000"/>
+          <w:sz w:val="22"/>
+          <w:lang w:eastAsia="ko-KR"/>
+        </w:rPr>
+        <w:t xml:space="preserve"> 기준 512 KB 초과는 </w:t>
+      </w:r>
+      <w:r>
+        <w:rPr>
+          <w:rFonts w:ascii="Menlo" w:hAnsi="Menlo" w:eastAsia="Menlo" w:cs="Menlo"/>
+          <w:color w:val="000000"/>
+          <w:sz w:val="21"/>
+          <w:lang w:eastAsia="ko-KR"/>
+        </w:rPr>
+        <w:t>413 PAYLOAD_TOO_LARGE</w:t>
+      </w:r>
+      <w:r>
+        <w:rPr>
+          <w:rFonts w:ascii="Arial" w:hAnsi="Arial" w:eastAsia="Malgun Gothic" w:cs="Malgun Gothic"/>
+          <w:color w:val="000000"/>
+          <w:sz w:val="22"/>
+          <w:lang w:eastAsia="ko-KR"/>
+        </w:rPr>
+        <w:t xml:space="preserve">(field </w:t>
+      </w:r>
+      <w:r>
+        <w:rPr>
+          <w:rFonts w:ascii="Menlo" w:hAnsi="Menlo" w:eastAsia="Menlo" w:cs="Menlo"/>
+          <w:color w:val="000000"/>
+          <w:sz w:val="21"/>
+          <w:lang w:eastAsia="ko-KR"/>
+        </w:rPr>
+        <w:t>code</w:t>
+      </w:r>
+      <w:r>
+        <w:rPr>
+          <w:rFonts w:ascii="Arial" w:hAnsi="Arial" w:eastAsia="Malgun Gothic" w:cs="Malgun Gothic"/>
+          <w:color w:val="000000"/>
+          <w:sz w:val="22"/>
+          <w:lang w:eastAsia="ko-KR"/>
+        </w:rPr>
+        <w:t xml:space="preserve">, </w:t>
+      </w:r>
+      <w:r>
+        <w:rPr>
+          <w:rFonts w:ascii="Menlo" w:hAnsi="Menlo" w:eastAsia="Menlo" w:cs="Menlo"/>
+          <w:color w:val="000000"/>
+          <w:sz w:val="21"/>
+          <w:lang w:eastAsia="ko-KR"/>
+        </w:rPr>
+        <w:t>MAX_512KB</w:t>
+      </w:r>
+      <w:r>
+        <w:rPr>
+          <w:rFonts w:ascii="Arial" w:hAnsi="Arial" w:eastAsia="Malgun Gothic" w:cs="Malgun Gothic"/>
+          <w:color w:val="000000"/>
+          <w:sz w:val="22"/>
+          <w:lang w:eastAsia="ko-KR"/>
+        </w:rPr>
+        <w:t>). DB CHECK(</w:t>
+      </w:r>
+      <w:r>
+        <w:rPr>
+          <w:rFonts w:ascii="Menlo" w:hAnsi="Menlo" w:eastAsia="Menlo" w:cs="Menlo"/>
+          <w:color w:val="000000"/>
+          <w:sz w:val="21"/>
+          <w:lang w:eastAsia="ko-KR"/>
+        </w:rPr>
+        <w:t>octet_length(code) &lt;= 524288</w:t>
+      </w:r>
+      <w:r>
+        <w:rPr>
+          <w:rFonts w:ascii="Arial" w:hAnsi="Arial" w:eastAsia="Malgun Gothic" w:cs="Malgun Gothic"/>
+          <w:color w:val="000000"/>
+          <w:sz w:val="22"/>
+          <w:lang w:eastAsia="ko-KR"/>
+        </w:rPr>
+        <w:t xml:space="preserve">)가 최종 방어선이다. 참고: Monaco 편집기는 줄바꿈을 하나의 EOL로 통일하므로, 줄바꿈이 섞인 코드를 </w:t>
+      </w:r>
+      <w:r>
+        <w:rPr>
+          <w:rFonts w:ascii="Arial" w:hAnsi="Arial" w:eastAsia="Malgun Gothic" w:cs="Malgun Gothic"/>
+          <w:b/>
+          <w:color w:val="000000"/>
+          <w:sz w:val="22"/>
+          <w:lang w:eastAsia="ko-KR"/>
+        </w:rPr>
+        <w:t>편집</w:t>
+      </w:r>
+      <w:r>
+        <w:rPr>
+          <w:rFonts w:ascii="Arial" w:hAnsi="Arial" w:eastAsia="Malgun Gothic" w:cs="Malgun Gothic"/>
+          <w:color w:val="000000"/>
+          <w:sz w:val="22"/>
+          <w:lang w:eastAsia="ko-KR"/>
+        </w:rPr>
+        <w:t>하면 다수 쪽으로 맞춰진다(읽기·복사는 저장된 원문 그대로).</w:t>
+      </w:r>
+    </w:p>
+    <w:p>
+      <w:pPr>
+        <w:pStyle w:val="ListBullet"/>
+      </w:pPr>
+      <w:r>
+        <w:rPr>
+          <w:rFonts w:ascii="Arial" w:hAnsi="Arial" w:eastAsia="Malgun Gothic" w:cs="Malgun Gothic"/>
+          <w:b/>
+          <w:color w:val="000000"/>
+          <w:sz w:val="22"/>
+          <w:lang w:eastAsia="ko-KR"/>
+        </w:rPr>
+        <w:t>버전 생성 조건(SNP-05):</w:t>
+      </w:r>
+      <w:r>
+        <w:rPr>
+          <w:rFonts w:ascii="Arial" w:hAnsi="Arial" w:eastAsia="Malgun Gothic" w:cs="Malgun Gothic"/>
+          <w:color w:val="000000"/>
+          <w:sz w:val="22"/>
+          <w:lang w:eastAsia="ko-KR"/>
+        </w:rPr>
+        <w:t xml:space="preserve"> </w:t>
+      </w:r>
+      <w:r>
+        <w:rPr>
+          <w:rFonts w:ascii="Menlo" w:hAnsi="Menlo" w:eastAsia="Menlo" w:cs="Menlo"/>
+          <w:color w:val="000000"/>
+          <w:sz w:val="21"/>
+          <w:lang w:eastAsia="ko-KR"/>
+        </w:rPr>
+        <w:t>PATCH</w:t>
+      </w:r>
+      <w:r>
+        <w:rPr>
+          <w:rFonts w:ascii="Arial" w:hAnsi="Arial" w:eastAsia="Malgun Gothic" w:cs="Malgun Gothic"/>
+          <w:color w:val="000000"/>
+          <w:sz w:val="22"/>
+          <w:lang w:eastAsia="ko-KR"/>
+        </w:rPr>
+        <w:t xml:space="preserve">의 </w:t>
+      </w:r>
+      <w:r>
+        <w:rPr>
+          <w:rFonts w:ascii="Menlo" w:hAnsi="Menlo" w:eastAsia="Menlo" w:cs="Menlo"/>
+          <w:color w:val="000000"/>
+          <w:sz w:val="21"/>
+          <w:lang w:eastAsia="ko-KR"/>
+        </w:rPr>
+        <w:t>code</w:t>
+      </w:r>
+      <w:r>
+        <w:rPr>
+          <w:rFonts w:ascii="Arial" w:hAnsi="Arial" w:eastAsia="Malgun Gothic" w:cs="Malgun Gothic"/>
+          <w:color w:val="000000"/>
+          <w:sz w:val="22"/>
+          <w:lang w:eastAsia="ko-KR"/>
+        </w:rPr>
+        <w:t xml:space="preserve">가 현재 버전과 </w:t>
+      </w:r>
+      <w:r>
+        <w:rPr>
+          <w:rFonts w:ascii="Arial" w:hAnsi="Arial" w:eastAsia="Malgun Gothic" w:cs="Malgun Gothic"/>
+          <w:b/>
+          <w:color w:val="000000"/>
+          <w:sz w:val="22"/>
+          <w:lang w:eastAsia="ko-KR"/>
+        </w:rPr>
+        <w:t>SHA-256이 다를 때만</w:t>
+      </w:r>
+      <w:r>
+        <w:rPr>
+          <w:rFonts w:ascii="Arial" w:hAnsi="Arial" w:eastAsia="Malgun Gothic" w:cs="Malgun Gothic"/>
+          <w:color w:val="000000"/>
+          <w:sz w:val="22"/>
+          <w:lang w:eastAsia="ko-KR"/>
+        </w:rPr>
+        <w:t xml:space="preserve"> 새 버전(</w:t>
+      </w:r>
+      <w:r>
+        <w:rPr>
+          <w:rFonts w:ascii="Menlo" w:hAnsi="Menlo" w:eastAsia="Menlo" w:cs="Menlo"/>
+          <w:color w:val="000000"/>
+          <w:sz w:val="21"/>
+          <w:lang w:eastAsia="ko-KR"/>
+        </w:rPr>
+        <w:t>versionNo+1</w:t>
+      </w:r>
+      <w:r>
+        <w:rPr>
+          <w:rFonts w:ascii="Arial" w:hAnsi="Arial" w:eastAsia="Malgun Gothic" w:cs="Malgun Gothic"/>
+          <w:color w:val="000000"/>
+          <w:sz w:val="22"/>
+          <w:lang w:eastAsia="ko-KR"/>
+        </w:rPr>
+        <w:t xml:space="preserve">)을 만든다. 같은 코드를 다시 보내거나 제목·설명·태그·언어·framework만 바꾸면 버전은 늘지 않는다. 어떤 변경이든 Node의 </w:t>
+      </w:r>
+      <w:r>
+        <w:rPr>
+          <w:rFonts w:ascii="Menlo" w:hAnsi="Menlo" w:eastAsia="Menlo" w:cs="Menlo"/>
+          <w:color w:val="000000"/>
+          <w:sz w:val="21"/>
+          <w:lang w:eastAsia="ko-KR"/>
+        </w:rPr>
+        <w:t>version</w:t>
+      </w:r>
+      <w:r>
+        <w:rPr>
+          <w:rFonts w:ascii="Arial" w:hAnsi="Arial" w:eastAsia="Malgun Gothic" w:cs="Malgun Gothic"/>
+          <w:color w:val="000000"/>
+          <w:sz w:val="22"/>
+          <w:lang w:eastAsia="ko-KR"/>
+        </w:rPr>
+        <w:t xml:space="preserve">(낙관적 락)은 오르고, 아무것도 안 바뀌면 오르지 않는다. 동시에 같은 </w:t>
+      </w:r>
+      <w:r>
+        <w:rPr>
+          <w:rFonts w:ascii="Menlo" w:hAnsi="Menlo" w:eastAsia="Menlo" w:cs="Menlo"/>
+          <w:color w:val="000000"/>
+          <w:sz w:val="21"/>
+          <w:lang w:eastAsia="ko-KR"/>
+        </w:rPr>
+        <w:t>version</w:t>
+      </w:r>
+      <w:r>
+        <w:rPr>
+          <w:rFonts w:ascii="Arial" w:hAnsi="Arial" w:eastAsia="Malgun Gothic" w:cs="Malgun Gothic"/>
+          <w:color w:val="000000"/>
+          <w:sz w:val="22"/>
+          <w:lang w:eastAsia="ko-KR"/>
+        </w:rPr>
+        <w:t xml:space="preserve">으로 코드를 수정하면 정확히 하나만 성공하고 나머지는 </w:t>
+      </w:r>
+      <w:r>
+        <w:rPr>
+          <w:rFonts w:ascii="Menlo" w:hAnsi="Menlo" w:eastAsia="Menlo" w:cs="Menlo"/>
+          <w:color w:val="000000"/>
+          <w:sz w:val="21"/>
+          <w:lang w:eastAsia="ko-KR"/>
+        </w:rPr>
+        <w:t>409 VERSION_CONFLICT</w:t>
+      </w:r>
+      <w:r>
+        <w:rPr>
+          <w:rFonts w:ascii="Arial" w:hAnsi="Arial" w:eastAsia="Malgun Gothic" w:cs="Malgun Gothic"/>
+          <w:color w:val="000000"/>
+          <w:sz w:val="22"/>
+          <w:lang w:eastAsia="ko-KR"/>
+        </w:rPr>
+        <w:t xml:space="preserve">이며 버전 번호는 연속이다(통합 테스트로 검증). 버전 행은 불변이다(Hibernate </w:t>
+      </w:r>
+      <w:r>
+        <w:rPr>
+          <w:rFonts w:ascii="Menlo" w:hAnsi="Menlo" w:eastAsia="Menlo" w:cs="Menlo"/>
+          <w:color w:val="000000"/>
+          <w:sz w:val="21"/>
+          <w:lang w:eastAsia="ko-KR"/>
+        </w:rPr>
+        <w:t>@Immutable</w:t>
+      </w:r>
+      <w:r>
+        <w:rPr>
+          <w:rFonts w:ascii="Arial" w:hAnsi="Arial" w:eastAsia="Malgun Gothic" w:cs="Malgun Gothic"/>
+          <w:color w:val="000000"/>
+          <w:sz w:val="22"/>
+          <w:lang w:eastAsia="ko-KR"/>
+        </w:rPr>
+        <w:t>, 수정·삭제 경로 없음).</w:t>
+      </w:r>
+    </w:p>
+    <w:p>
+      <w:pPr>
+        <w:pStyle w:val="ListBullet"/>
+      </w:pPr>
+      <w:r>
+        <w:rPr>
+          <w:rFonts w:ascii="Menlo" w:hAnsi="Menlo" w:eastAsia="Menlo" w:cs="Menlo"/>
+          <w:color w:val="000000"/>
+          <w:sz w:val="21"/>
+          <w:lang w:eastAsia="ko-KR"/>
+        </w:rPr>
+        <w:t>language</w:t>
+      </w:r>
+      <w:r>
+        <w:rPr>
+          <w:rFonts w:ascii="Arial" w:hAnsi="Arial" w:eastAsia="Malgun Gothic" w:cs="Malgun Gothic"/>
+          <w:color w:val="000000"/>
+          <w:sz w:val="22"/>
+          <w:lang w:eastAsia="ko-KR"/>
+        </w:rPr>
+        <w:t xml:space="preserve">는 소문자 </w:t>
+      </w:r>
+      <w:r>
+        <w:rPr>
+          <w:rFonts w:ascii="Menlo" w:hAnsi="Menlo" w:eastAsia="Menlo" w:cs="Menlo"/>
+          <w:color w:val="000000"/>
+          <w:sz w:val="21"/>
+          <w:lang w:eastAsia="ko-KR"/>
+        </w:rPr>
+        <w:t>[a-z0-9][a-z0-9+#._-]{0,29}</w:t>
+      </w:r>
+      <w:r>
+        <w:rPr>
+          <w:rFonts w:ascii="Arial" w:hAnsi="Arial" w:eastAsia="Malgun Gothic" w:cs="Malgun Gothic"/>
+          <w:color w:val="000000"/>
+          <w:sz w:val="22"/>
+          <w:lang w:eastAsia="ko-KR"/>
+        </w:rPr>
+        <w:t xml:space="preserve">, </w:t>
+      </w:r>
+      <w:r>
+        <w:rPr>
+          <w:rFonts w:ascii="Menlo" w:hAnsi="Menlo" w:eastAsia="Menlo" w:cs="Menlo"/>
+          <w:color w:val="000000"/>
+          <w:sz w:val="21"/>
+          <w:lang w:eastAsia="ko-KR"/>
+        </w:rPr>
+        <w:t>framework</w:t>
+      </w:r>
+      <w:r>
+        <w:rPr>
+          <w:rFonts w:ascii="Arial" w:hAnsi="Arial" w:eastAsia="Malgun Gothic" w:cs="Malgun Gothic"/>
+          <w:color w:val="000000"/>
+          <w:sz w:val="22"/>
+          <w:lang w:eastAsia="ko-KR"/>
+        </w:rPr>
+        <w:t xml:space="preserve">(선택)는 소문자 </w:t>
+      </w:r>
+      <w:r>
+        <w:rPr>
+          <w:rFonts w:ascii="Menlo" w:hAnsi="Menlo" w:eastAsia="Menlo" w:cs="Menlo"/>
+          <w:color w:val="000000"/>
+          <w:sz w:val="21"/>
+          <w:lang w:eastAsia="ko-KR"/>
+        </w:rPr>
+        <w:t>[a-z0-9][a-z0-9+#._ -]{0,49}</w:t>
+      </w:r>
+      <w:r>
+        <w:rPr>
+          <w:rFonts w:ascii="Arial" w:hAnsi="Arial" w:eastAsia="Malgun Gothic" w:cs="Malgun Gothic"/>
+          <w:color w:val="000000"/>
+          <w:sz w:val="22"/>
+          <w:lang w:eastAsia="ko-KR"/>
+        </w:rPr>
+        <w:t xml:space="preserve">로 정규화해 저장하며 목록 필터도 같은 정규화를 거친다. </w:t>
+      </w:r>
+      <w:r>
+        <w:rPr>
+          <w:rFonts w:ascii="Menlo" w:hAnsi="Menlo" w:eastAsia="Menlo" w:cs="Menlo"/>
+          <w:color w:val="000000"/>
+          <w:sz w:val="21"/>
+          <w:lang w:eastAsia="ko-KR"/>
+        </w:rPr>
+        <w:t>framework</w:t>
+      </w:r>
+      <w:r>
+        <w:rPr>
+          <w:rFonts w:ascii="Arial" w:hAnsi="Arial" w:eastAsia="Malgun Gothic" w:cs="Malgun Gothic"/>
+          <w:color w:val="000000"/>
+          <w:sz w:val="22"/>
+          <w:lang w:eastAsia="ko-KR"/>
+        </w:rPr>
+        <w:t>에 빈 문자열을 보내면 지운다(</w:t>
+      </w:r>
+      <w:r>
+        <w:rPr>
+          <w:rFonts w:ascii="Menlo" w:hAnsi="Menlo" w:eastAsia="Menlo" w:cs="Menlo"/>
+          <w:color w:val="000000"/>
+          <w:sz w:val="21"/>
+          <w:lang w:eastAsia="ko-KR"/>
+        </w:rPr>
+        <w:t>null</w:t>
+      </w:r>
+      <w:r>
+        <w:rPr>
+          <w:rFonts w:ascii="Arial" w:hAnsi="Arial" w:eastAsia="Malgun Gothic" w:cs="Malgun Gothic"/>
+          <w:color w:val="000000"/>
+          <w:sz w:val="22"/>
+          <w:lang w:eastAsia="ko-KR"/>
+        </w:rPr>
+        <w:t>/생략은 변경 없음).</w:t>
+      </w:r>
+    </w:p>
+    <w:p>
+      <w:pPr>
+        <w:pStyle w:val="ListBullet"/>
+      </w:pPr>
+      <w:r>
+        <w:rPr>
+          <w:rFonts w:ascii="Arial" w:hAnsi="Arial" w:eastAsia="Malgun Gothic" w:cs="Malgun Gothic"/>
+          <w:b/>
+          <w:color w:val="000000"/>
+          <w:sz w:val="22"/>
+          <w:lang w:eastAsia="ko-KR"/>
+        </w:rPr>
+        <w:t>Secret 확인 흐름(SNP-09, §17.5):</w:t>
+      </w:r>
+      <w:r>
+        <w:rPr>
+          <w:rFonts w:ascii="Arial" w:hAnsi="Arial" w:eastAsia="Malgun Gothic" w:cs="Malgun Gothic"/>
+          <w:color w:val="000000"/>
+          <w:sz w:val="22"/>
+          <w:lang w:eastAsia="ko-KR"/>
+        </w:rPr>
+        <w:t xml:space="preserve"> 코드가 새로 저장될 때(생성, 코드 변경 시) 서버가 스캔한다(private key, API key 접두어, JWT, 자격 증명 대입(</w:t>
+      </w:r>
+      <w:r>
+        <w:rPr>
+          <w:rFonts w:ascii="Menlo" w:hAnsi="Menlo" w:eastAsia="Menlo" w:cs="Menlo"/>
+          <w:color w:val="000000"/>
+          <w:sz w:val="21"/>
+          <w:lang w:eastAsia="ko-KR"/>
+        </w:rPr>
+        <w:t>password=</w:t>
+      </w:r>
+      <w:r>
+        <w:rPr>
+          <w:rFonts w:ascii="Arial" w:hAnsi="Arial" w:eastAsia="Malgun Gothic" w:cs="Malgun Gothic"/>
+          <w:color w:val="000000"/>
+          <w:sz w:val="22"/>
+          <w:lang w:eastAsia="ko-KR"/>
+        </w:rPr>
+        <w:t xml:space="preserve">, </w:t>
+      </w:r>
+      <w:r>
+        <w:rPr>
+          <w:rFonts w:ascii="Menlo" w:hAnsi="Menlo" w:eastAsia="Menlo" w:cs="Menlo"/>
+          <w:color w:val="000000"/>
+          <w:sz w:val="21"/>
+          <w:lang w:eastAsia="ko-KR"/>
+        </w:rPr>
+        <w:t>DB_PASSWORD=</w:t>
+      </w:r>
+      <w:r>
+        <w:rPr>
+          <w:rFonts w:ascii="Arial" w:hAnsi="Arial" w:eastAsia="Malgun Gothic" w:cs="Malgun Gothic"/>
+          <w:color w:val="000000"/>
+          <w:sz w:val="22"/>
+          <w:lang w:eastAsia="ko-KR"/>
+        </w:rPr>
+        <w:t xml:space="preserve">, </w:t>
+      </w:r>
+      <w:r>
+        <w:rPr>
+          <w:rFonts w:ascii="Menlo" w:hAnsi="Menlo" w:eastAsia="Menlo" w:cs="Menlo"/>
+          <w:color w:val="000000"/>
+          <w:sz w:val="21"/>
+          <w:lang w:eastAsia="ko-KR"/>
+        </w:rPr>
+        <w:t>API_TOKEN=</w:t>
+      </w:r>
+      <w:r>
+        <w:rPr>
+          <w:rFonts w:ascii="Arial" w:hAnsi="Arial" w:eastAsia="Malgun Gothic" w:cs="Malgun Gothic"/>
+          <w:color w:val="000000"/>
+          <w:sz w:val="22"/>
+          <w:lang w:eastAsia="ko-KR"/>
+        </w:rPr>
+        <w:t xml:space="preserve"> 등), 계정이 든 접속 문자열). 의심되면 </w:t>
+      </w:r>
+      <w:r>
+        <w:rPr>
+          <w:rFonts w:ascii="Menlo" w:hAnsi="Menlo" w:eastAsia="Menlo" w:cs="Menlo"/>
+          <w:color w:val="000000"/>
+          <w:sz w:val="21"/>
+          <w:lang w:eastAsia="ko-KR"/>
+        </w:rPr>
+        <w:t>422 SECRET_CONFIRMATION_REQUIRED</w:t>
+      </w:r>
+      <w:r>
+        <w:rPr>
+          <w:rFonts w:ascii="Arial" w:hAnsi="Arial" w:eastAsia="Malgun Gothic" w:cs="Malgun Gothic"/>
+          <w:color w:val="000000"/>
+          <w:sz w:val="22"/>
+          <w:lang w:eastAsia="ko-KR"/>
+        </w:rPr>
+        <w:t xml:space="preserve">와 </w:t>
+      </w:r>
+      <w:r>
+        <w:rPr>
+          <w:rFonts w:ascii="Menlo" w:hAnsi="Menlo" w:eastAsia="Menlo" w:cs="Menlo"/>
+          <w:color w:val="000000"/>
+          <w:sz w:val="21"/>
+          <w:lang w:eastAsia="ko-KR"/>
+        </w:rPr>
+        <w:t>fieldErrors:[{field:"code", reason:"&lt;KIND&gt;@L&lt;줄&gt;"}]</w:t>
+      </w:r>
+      <w:r>
+        <w:rPr>
+          <w:rFonts w:ascii="Arial" w:hAnsi="Arial" w:eastAsia="Malgun Gothic" w:cs="Malgun Gothic"/>
+          <w:color w:val="000000"/>
+          <w:sz w:val="22"/>
+          <w:lang w:eastAsia="ko-KR"/>
+        </w:rPr>
+        <w:t xml:space="preserve">을 반환하고 </w:t>
+      </w:r>
+      <w:r>
+        <w:rPr>
+          <w:rFonts w:ascii="Arial" w:hAnsi="Arial" w:eastAsia="Malgun Gothic" w:cs="Malgun Gothic"/>
+          <w:b/>
+          <w:color w:val="000000"/>
+          <w:sz w:val="22"/>
+          <w:lang w:eastAsia="ko-KR"/>
+        </w:rPr>
+        <w:t>아무것도 저장하지 않는다</w:t>
+      </w:r>
+      <w:r>
+        <w:rPr>
+          <w:rFonts w:ascii="Arial" w:hAnsi="Arial" w:eastAsia="Malgun Gothic" w:cs="Malgun Gothic"/>
+          <w:color w:val="000000"/>
+          <w:sz w:val="22"/>
+          <w:lang w:eastAsia="ko-KR"/>
+        </w:rPr>
+        <w:t xml:space="preserve">. 응답·로그에는 종류와 줄 번호만 있고 의심 값은 없다. 재요청에 </w:t>
+      </w:r>
+      <w:r>
+        <w:rPr>
+          <w:rFonts w:ascii="Menlo" w:hAnsi="Menlo" w:eastAsia="Menlo" w:cs="Menlo"/>
+          <w:color w:val="000000"/>
+          <w:sz w:val="21"/>
+          <w:lang w:eastAsia="ko-KR"/>
+        </w:rPr>
+        <w:t>secretConfirmation: "CONFIRMED"</w:t>
+      </w:r>
+      <w:r>
+        <w:rPr>
+          <w:rFonts w:ascii="Arial" w:hAnsi="Arial" w:eastAsia="Malgun Gothic" w:cs="Malgun Gothic"/>
+          <w:color w:val="000000"/>
+          <w:sz w:val="22"/>
+          <w:lang w:eastAsia="ko-KR"/>
+        </w:rPr>
+        <w:t>를 담으면 저장되고(</w:t>
+      </w:r>
+      <w:r>
+        <w:rPr>
+          <w:rFonts w:ascii="Menlo" w:hAnsi="Menlo" w:eastAsia="Menlo" w:cs="Menlo"/>
+          <w:color w:val="000000"/>
+          <w:sz w:val="21"/>
+          <w:lang w:eastAsia="ko-KR"/>
+        </w:rPr>
+        <w:t>secretScanStatus=CONFIRMED_WITH_FINDINGS</w:t>
+      </w:r>
+      <w:r>
+        <w:rPr>
+          <w:rFonts w:ascii="Arial" w:hAnsi="Arial" w:eastAsia="Malgun Gothic" w:cs="Malgun Gothic"/>
+          <w:color w:val="000000"/>
+          <w:sz w:val="22"/>
+          <w:lang w:eastAsia="ko-KR"/>
+        </w:rPr>
+        <w:t xml:space="preserve">), private key는 </w:t>
+      </w:r>
+      <w:r>
+        <w:rPr>
+          <w:rFonts w:ascii="Menlo" w:hAnsi="Menlo" w:eastAsia="Menlo" w:cs="Menlo"/>
+          <w:color w:val="000000"/>
+          <w:sz w:val="21"/>
+          <w:lang w:eastAsia="ko-KR"/>
+        </w:rPr>
+        <w:t>"CONFIRMED_HIGH_RISK"</w:t>
+      </w:r>
+      <w:r>
+        <w:rPr>
+          <w:rFonts w:ascii="Arial" w:hAnsi="Arial" w:eastAsia="Malgun Gothic" w:cs="Malgun Gothic"/>
+          <w:color w:val="000000"/>
+          <w:sz w:val="22"/>
+          <w:lang w:eastAsia="ko-KR"/>
+        </w:rPr>
+        <w:t xml:space="preserve">(재확인)여야 통과한다. 코드를 고쳐 secret이 없어지면 </w:t>
+      </w:r>
+      <w:r>
+        <w:rPr>
+          <w:rFonts w:ascii="Menlo" w:hAnsi="Menlo" w:eastAsia="Menlo" w:cs="Menlo"/>
+          <w:color w:val="000000"/>
+          <w:sz w:val="21"/>
+          <w:lang w:eastAsia="ko-KR"/>
+        </w:rPr>
+        <w:t>CLEAN</w:t>
+      </w:r>
+      <w:r>
+        <w:rPr>
+          <w:rFonts w:ascii="Arial" w:hAnsi="Arial" w:eastAsia="Malgun Gothic" w:cs="Malgun Gothic"/>
+          <w:color w:val="000000"/>
+          <w:sz w:val="22"/>
+          <w:lang w:eastAsia="ko-KR"/>
+        </w:rPr>
+        <w:t>으로 돌아간다. 고엔트로피 문자열 감지는 해시·UUID 오탐이 커서 제외했다. 스캔은 한 줄을 1,024자 창(겹침 256)으로 나눠 수행해, 512 KB 한 줄 입력에서도 정규식 백트래킹이 폭발하지 않는다.</w:t>
+      </w:r>
+    </w:p>
+    <w:p>
+      <w:pPr>
+        <w:pStyle w:val="ListBullet"/>
+      </w:pPr>
+      <w:r>
+        <w:rPr>
+          <w:rFonts w:ascii="Arial" w:hAnsi="Arial" w:eastAsia="Malgun Gothic" w:cs="Malgun Gothic"/>
+          <w:color w:val="000000"/>
+          <w:sz w:val="22"/>
+          <w:lang w:eastAsia="ko-KR"/>
+        </w:rPr>
+        <w:t xml:space="preserve">버전 목록은 최신순 cursor 페이지이며 코드 원문 대신 </w:t>
+      </w:r>
+      <w:r>
+        <w:rPr>
+          <w:rFonts w:ascii="Menlo" w:hAnsi="Menlo" w:eastAsia="Menlo" w:cs="Menlo"/>
+          <w:color w:val="000000"/>
+          <w:sz w:val="21"/>
+          <w:lang w:eastAsia="ko-KR"/>
+        </w:rPr>
+        <w:t>codeLength</w:t>
+      </w:r>
+      <w:r>
+        <w:rPr>
+          <w:rFonts w:ascii="Arial" w:hAnsi="Arial" w:eastAsia="Malgun Gothic" w:cs="Malgun Gothic"/>
+          <w:color w:val="000000"/>
+          <w:sz w:val="22"/>
+          <w:lang w:eastAsia="ko-KR"/>
+        </w:rPr>
+        <w:t xml:space="preserve">(문자 수)를 준다. 원문은 </w:t>
+      </w:r>
+      <w:r>
+        <w:rPr>
+          <w:rFonts w:ascii="Menlo" w:hAnsi="Menlo" w:eastAsia="Menlo" w:cs="Menlo"/>
+          <w:color w:val="000000"/>
+          <w:sz w:val="21"/>
+          <w:lang w:eastAsia="ko-KR"/>
+        </w:rPr>
+        <w:t>GET /snippets/{id}/versions/{no}</w:t>
+      </w:r>
+      <w:r>
+        <w:rPr>
+          <w:rFonts w:ascii="Arial" w:hAnsi="Arial" w:eastAsia="Malgun Gothic" w:cs="Malgun Gothic"/>
+          <w:color w:val="000000"/>
+          <w:sz w:val="22"/>
+          <w:lang w:eastAsia="ko-KR"/>
+        </w:rPr>
+        <w:t>.</w:t>
+      </w:r>
+    </w:p>
+    <w:p>
+      <w:pPr>
+        <w:pStyle w:val="ListBullet"/>
+      </w:pPr>
+      <w:r>
+        <w:rPr>
+          <w:rFonts w:ascii="Menlo" w:hAnsi="Menlo" w:eastAsia="Menlo" w:cs="Menlo"/>
+          <w:color w:val="000000"/>
+          <w:sz w:val="21"/>
+          <w:lang w:eastAsia="ko-KR"/>
+        </w:rPr>
+        <w:t>POST /snippets/{id}/usage</w:t>
+      </w:r>
+      <w:r>
+        <w:rPr>
+          <w:rFonts w:ascii="Arial" w:hAnsi="Arial" w:eastAsia="Malgun Gothic" w:cs="Malgun Gothic"/>
+          <w:color w:val="000000"/>
+          <w:sz w:val="22"/>
+          <w:lang w:eastAsia="ko-KR"/>
+        </w:rPr>
+        <w:t xml:space="preserve">는 </w:t>
+      </w:r>
+      <w:r>
+        <w:rPr>
+          <w:rFonts w:ascii="Menlo" w:hAnsi="Menlo" w:eastAsia="Menlo" w:cs="Menlo"/>
+          <w:color w:val="000000"/>
+          <w:sz w:val="21"/>
+          <w:lang w:eastAsia="ko-KR"/>
+        </w:rPr>
+        <w:t>{action:"COPY"}</w:t>
+      </w:r>
+      <w:r>
+        <w:rPr>
+          <w:rFonts w:ascii="Arial" w:hAnsi="Arial" w:eastAsia="Malgun Gothic" w:cs="Malgun Gothic"/>
+          <w:color w:val="000000"/>
+          <w:sz w:val="22"/>
+          <w:lang w:eastAsia="ko-KR"/>
+        </w:rPr>
+        <w:t xml:space="preserve">만 허용(그 외 </w:t>
+      </w:r>
+      <w:r>
+        <w:rPr>
+          <w:rFonts w:ascii="Menlo" w:hAnsi="Menlo" w:eastAsia="Menlo" w:cs="Menlo"/>
+          <w:color w:val="000000"/>
+          <w:sz w:val="21"/>
+          <w:lang w:eastAsia="ko-KR"/>
+        </w:rPr>
+        <w:t>400</w:t>
+      </w:r>
+      <w:r>
+        <w:rPr>
+          <w:rFonts w:ascii="Arial" w:hAnsi="Arial" w:eastAsia="Malgun Gothic" w:cs="Malgun Gothic"/>
+          <w:color w:val="000000"/>
+          <w:sz w:val="22"/>
+          <w:lang w:eastAsia="ko-KR"/>
+        </w:rPr>
+        <w:t xml:space="preserve">)하고 </w:t>
+      </w:r>
+      <w:r>
+        <w:rPr>
+          <w:rFonts w:ascii="Menlo" w:hAnsi="Menlo" w:eastAsia="Menlo" w:cs="Menlo"/>
+          <w:color w:val="000000"/>
+          <w:sz w:val="21"/>
+          <w:lang w:eastAsia="ko-KR"/>
+        </w:rPr>
+        <w:t>use_count</w:t>
+      </w:r>
+      <w:r>
+        <w:rPr>
+          <w:rFonts w:ascii="Arial" w:hAnsi="Arial" w:eastAsia="Malgun Gothic" w:cs="Malgun Gothic"/>
+          <w:color w:val="000000"/>
+          <w:sz w:val="22"/>
+          <w:lang w:eastAsia="ko-KR"/>
+        </w:rPr>
+        <w:t xml:space="preserve">를 DB에서 원자적으로 증가시킨다. Node </w:t>
+      </w:r>
+      <w:r>
+        <w:rPr>
+          <w:rFonts w:ascii="Menlo" w:hAnsi="Menlo" w:eastAsia="Menlo" w:cs="Menlo"/>
+          <w:color w:val="000000"/>
+          <w:sz w:val="21"/>
+          <w:lang w:eastAsia="ko-KR"/>
+        </w:rPr>
+        <w:t>version</w:t>
+      </w:r>
+      <w:r>
+        <w:rPr>
+          <w:rFonts w:ascii="Arial" w:hAnsi="Arial" w:eastAsia="Malgun Gothic" w:cs="Malgun Gothic"/>
+          <w:color w:val="000000"/>
+          <w:sz w:val="22"/>
+          <w:lang w:eastAsia="ko-KR"/>
+        </w:rPr>
+        <w:t>은 올리지 않으므로 동시 편집 충돌 원인이 되지 않는다. 이전 버전 원문 복사는 통계에 포함하지 않는다. rate limit은 Phase 7.</w:t>
+      </w:r>
+    </w:p>
+    <w:p>
+      <w:pPr>
+        <w:pStyle w:val="ListBullet"/>
+      </w:pPr>
+      <w:r>
+        <w:rPr>
+          <w:rFonts w:ascii="Arial" w:hAnsi="Arial" w:eastAsia="Malgun Gothic" w:cs="Malgun Gothic"/>
+          <w:b/>
+          <w:color w:val="000000"/>
+          <w:sz w:val="22"/>
+          <w:lang w:eastAsia="ko-KR"/>
+        </w:rPr>
+        <w:t>제외/이월:</w:t>
+      </w:r>
+      <w:r>
+        <w:rPr>
+          <w:rFonts w:ascii="Arial" w:hAnsi="Arial" w:eastAsia="Malgun Gothic" w:cs="Malgun Gothic"/>
+          <w:color w:val="000000"/>
+          <w:sz w:val="22"/>
+          <w:lang w:eastAsia="ko-KR"/>
+        </w:rPr>
+        <w:t xml:space="preserve"> </w:t>
+      </w:r>
+      <w:r>
+        <w:rPr>
+          <w:rFonts w:ascii="Menlo" w:hAnsi="Menlo" w:eastAsia="Menlo" w:cs="Menlo"/>
+          <w:color w:val="000000"/>
+          <w:sz w:val="21"/>
+          <w:lang w:eastAsia="ko-KR"/>
+        </w:rPr>
+        <w:t>GET /snippets/{id}/diff</w:t>
+      </w:r>
+      <w:r>
+        <w:rPr>
+          <w:rFonts w:ascii="Arial" w:hAnsi="Arial" w:eastAsia="Malgun Gothic" w:cs="Malgun Gothic"/>
+          <w:color w:val="000000"/>
+          <w:sz w:val="22"/>
+          <w:lang w:eastAsia="ko-KR"/>
+        </w:rPr>
+        <w:t xml:space="preserve">(SNP-07, SHOULD — "초기에는 버전별 원문 조회만" 허용), 요청의 </w:t>
+      </w:r>
+      <w:r>
+        <w:rPr>
+          <w:rFonts w:ascii="Menlo" w:hAnsi="Menlo" w:eastAsia="Menlo" w:cs="Menlo"/>
+          <w:color w:val="000000"/>
+          <w:sz w:val="21"/>
+          <w:lang w:eastAsia="ko-KR"/>
+        </w:rPr>
+        <w:t>relations[]</w:t>
+      </w:r>
+      <w:r>
+        <w:rPr>
+          <w:rFonts w:ascii="Arial" w:hAnsi="Arial" w:eastAsia="Malgun Gothic" w:cs="Malgun Gothic"/>
+          <w:color w:val="000000"/>
+          <w:sz w:val="22"/>
+          <w:lang w:eastAsia="ko-KR"/>
+        </w:rPr>
+        <w:t>(Phase 4). 알 수 없는 요청 필드는 무시된다.</w:t>
+      </w:r>
+    </w:p>
+    <w:p>
       <w:pPr>
         <w:pStyle w:val="Heading2"/>
         <w:keepNext/>

</xml_diff>

<commit_message>
feat(relation): Phase 4 Relation & Knowledge Graph 구현
Backend: relation_types(시스템 13종 seed)/knowledge_relations (V7), 허용 조합·self-loop·중복·교차 Workspace 검증,
대칭 관계 canonical 저장, constraint 이름 기반 오류 변환, /relations CRUD, Relation Picker 후보 endpoint,
Node·Snippet 상세의 relations(outgoing/backlink), /graph/focus(BFS, depth/노드/edge 상한, 확장 후보),
/graph/workspace(페이지네이션). LIKE 와일드카드 이스케이프를 LikeEscape로 공통화.
Frontend: Relation Picker, 관련 항목/Backlinks, Graph 화면(React Flow + dagre, URL 필터,
상세 drawer, 키보드 목록 대안, 잘림 안내).
Tests: 관계·그래프 통합 테스트(동시 생성, cycle, 상한, DB 제약 포함), Playwright E2E.
Fix: 관계 변경 시 Picker 후보 캐시 무효화.
Docs: 설계서 v1.7 (Relation/Graph 계약, 구현 결과, 모듈 의존 방향)

Co-Authored-By: Claude Sonnet 5.5 <noreply@anthropic.com>
</commit_message>
<xml_diff>
--- a/docs-word/06-API_명세서.docx
+++ b/docs-word/06-API_명세서.docx
@@ -12617,6 +12617,1331 @@
       </w:r>
     </w:p>
     <w:p>
+      <w:r>
+        <w:rPr>
+          <w:rFonts w:ascii="Arial" w:hAnsi="Arial" w:eastAsia="Malgun Gothic" w:cs="Malgun Gothic"/>
+          <w:b/>
+          <w:color w:val="000000"/>
+          <w:sz w:val="22"/>
+          <w:lang w:eastAsia="ko-KR"/>
+        </w:rPr>
+        <w:t>Phase 4 구현 범위와 세부 계약(v1.7 확정)</w:t>
+      </w:r>
+    </w:p>
+    <w:p>
+      <w:pPr>
+        <w:pStyle w:val="ListBullet"/>
+      </w:pPr>
+      <w:r>
+        <w:rPr>
+          <w:rFonts w:ascii="Arial" w:hAnsi="Arial" w:eastAsia="Malgun Gothic" w:cs="Malgun Gothic"/>
+          <w:b/>
+          <w:color w:val="000000"/>
+          <w:sz w:val="22"/>
+          <w:lang w:eastAsia="ko-KR"/>
+        </w:rPr>
+        <w:t>Relation 검증 순서와 오류:</w:t>
+      </w:r>
+      <w:r>
+        <w:rPr>
+          <w:rFonts w:ascii="Arial" w:hAnsi="Arial" w:eastAsia="Malgun Gothic" w:cs="Malgun Gothic"/>
+          <w:color w:val="000000"/>
+          <w:sz w:val="22"/>
+          <w:lang w:eastAsia="ko-KR"/>
+        </w:rPr>
+        <w:t xml:space="preserve"> self-loop(</w:t>
+      </w:r>
+      <w:r>
+        <w:rPr>
+          <w:rFonts w:ascii="Menlo" w:hAnsi="Menlo" w:eastAsia="Menlo" w:cs="Menlo"/>
+          <w:color w:val="000000"/>
+          <w:sz w:val="21"/>
+          <w:lang w:eastAsia="ko-KR"/>
+        </w:rPr>
+        <w:t>400 SELF_RELATION_NOT_ALLOWED</w:t>
+      </w:r>
+      <w:r>
+        <w:rPr>
+          <w:rFonts w:ascii="Arial" w:hAnsi="Arial" w:eastAsia="Malgun Gothic" w:cs="Malgun Gothic"/>
+          <w:color w:val="000000"/>
+          <w:sz w:val="22"/>
+          <w:lang w:eastAsia="ko-KR"/>
+        </w:rPr>
+        <w:t>) → 관계 타입(</w:t>
+      </w:r>
+      <w:r>
+        <w:rPr>
+          <w:rFonts w:ascii="Menlo" w:hAnsi="Menlo" w:eastAsia="Menlo" w:cs="Menlo"/>
+          <w:color w:val="000000"/>
+          <w:sz w:val="21"/>
+          <w:lang w:eastAsia="ko-KR"/>
+        </w:rPr>
+        <w:t>400 INVALID_RELATION_TYPE</w:t>
+      </w:r>
+      <w:r>
+        <w:rPr>
+          <w:rFonts w:ascii="Arial" w:hAnsi="Arial" w:eastAsia="Malgun Gothic" w:cs="Malgun Gothic"/>
+          <w:color w:val="000000"/>
+          <w:sz w:val="22"/>
+          <w:lang w:eastAsia="ko-KR"/>
+        </w:rPr>
+        <w:t>) → 두 Node가 같은 Workspace에 존재(</w:t>
+      </w:r>
+      <w:r>
+        <w:rPr>
+          <w:rFonts w:ascii="Menlo" w:hAnsi="Menlo" w:eastAsia="Menlo" w:cs="Menlo"/>
+          <w:color w:val="000000"/>
+          <w:sz w:val="21"/>
+          <w:lang w:eastAsia="ko-KR"/>
+        </w:rPr>
+        <w:t>400 INVALID_RELATION_NODE</w:t>
+      </w:r>
+      <w:r>
+        <w:rPr>
+          <w:rFonts w:ascii="Arial" w:hAnsi="Arial" w:eastAsia="Malgun Gothic" w:cs="Malgun Gothic"/>
+          <w:color w:val="000000"/>
+          <w:sz w:val="22"/>
+          <w:lang w:eastAsia="ko-KR"/>
+        </w:rPr>
+        <w:t xml:space="preserve"> — 다른 Workspace id는 없음과 구분되지 않는다) → 휴지통 Node 금지(</w:t>
+      </w:r>
+      <w:r>
+        <w:rPr>
+          <w:rFonts w:ascii="Menlo" w:hAnsi="Menlo" w:eastAsia="Menlo" w:cs="Menlo"/>
+          <w:color w:val="000000"/>
+          <w:sz w:val="21"/>
+          <w:lang w:eastAsia="ko-KR"/>
+        </w:rPr>
+        <w:t>409 INVALID_NODE_STATE</w:t>
+      </w:r>
+      <w:r>
+        <w:rPr>
+          <w:rFonts w:ascii="Arial" w:hAnsi="Arial" w:eastAsia="Malgun Gothic" w:cs="Malgun Gothic"/>
+          <w:color w:val="000000"/>
+          <w:sz w:val="22"/>
+          <w:lang w:eastAsia="ko-KR"/>
+        </w:rPr>
+        <w:t>) → §13.1.1 허용 조합(</w:t>
+      </w:r>
+      <w:r>
+        <w:rPr>
+          <w:rFonts w:ascii="Menlo" w:hAnsi="Menlo" w:eastAsia="Menlo" w:cs="Menlo"/>
+          <w:color w:val="000000"/>
+          <w:sz w:val="21"/>
+          <w:lang w:eastAsia="ko-KR"/>
+        </w:rPr>
+        <w:t>400 TYPE_NOT_ALLOWED</w:t>
+      </w:r>
+      <w:r>
+        <w:rPr>
+          <w:rFonts w:ascii="Arial" w:hAnsi="Arial" w:eastAsia="Malgun Gothic" w:cs="Malgun Gothic"/>
+          <w:color w:val="000000"/>
+          <w:sz w:val="22"/>
+          <w:lang w:eastAsia="ko-KR"/>
+        </w:rPr>
+        <w:t>) → 중복(</w:t>
+      </w:r>
+      <w:r>
+        <w:rPr>
+          <w:rFonts w:ascii="Menlo" w:hAnsi="Menlo" w:eastAsia="Menlo" w:cs="Menlo"/>
+          <w:color w:val="000000"/>
+          <w:sz w:val="21"/>
+          <w:lang w:eastAsia="ko-KR"/>
+        </w:rPr>
+        <w:t>409 DUPLICATE_RELATION</w:t>
+      </w:r>
+      <w:r>
+        <w:rPr>
+          <w:rFonts w:ascii="Arial" w:hAnsi="Arial" w:eastAsia="Malgun Gothic" w:cs="Malgun Gothic"/>
+          <w:color w:val="000000"/>
+          <w:sz w:val="22"/>
+          <w:lang w:eastAsia="ko-KR"/>
+        </w:rPr>
+        <w:t xml:space="preserve">, </w:t>
+      </w:r>
+      <w:r>
+        <w:rPr>
+          <w:rFonts w:ascii="Menlo" w:hAnsi="Menlo" w:eastAsia="Menlo" w:cs="Menlo"/>
+          <w:color w:val="000000"/>
+          <w:sz w:val="21"/>
+          <w:lang w:eastAsia="ko-KR"/>
+        </w:rPr>
+        <w:t>fieldErrors:[{field:"relationId", reason:"&lt;기존 id&gt;"}]</w:t>
+      </w:r>
+      <w:r>
+        <w:rPr>
+          <w:rFonts w:ascii="Arial" w:hAnsi="Arial" w:eastAsia="Malgun Gothic" w:cs="Malgun Gothic"/>
+          <w:color w:val="000000"/>
+          <w:sz w:val="22"/>
+          <w:lang w:eastAsia="ko-KR"/>
+        </w:rPr>
+        <w:t xml:space="preserve">로 기존 관계를 알려 준다). 동시 요청 경합은 DB UNIQUE/CHECK가 막고, constraint 이름 기반 변환은 infrastructure의 </w:t>
+      </w:r>
+      <w:r>
+        <w:rPr>
+          <w:rFonts w:ascii="Menlo" w:hAnsi="Menlo" w:eastAsia="Menlo" w:cs="Menlo"/>
+          <w:color w:val="000000"/>
+          <w:sz w:val="21"/>
+          <w:lang w:eastAsia="ko-KR"/>
+        </w:rPr>
+        <w:t>RelationStore</w:t>
+      </w:r>
+      <w:r>
+        <w:rPr>
+          <w:rFonts w:ascii="Arial" w:hAnsi="Arial" w:eastAsia="Malgun Gothic" w:cs="Malgun Gothic"/>
+          <w:color w:val="000000"/>
+          <w:sz w:val="22"/>
+          <w:lang w:eastAsia="ko-KR"/>
+        </w:rPr>
+        <w:t xml:space="preserve">가 맡는다. </w:t>
+      </w:r>
+      <w:r>
+        <w:rPr>
+          <w:rFonts w:ascii="Menlo" w:hAnsi="Menlo" w:eastAsia="Menlo" w:cs="Menlo"/>
+          <w:color w:val="000000"/>
+          <w:sz w:val="21"/>
+          <w:lang w:eastAsia="ko-KR"/>
+        </w:rPr>
+        <w:t>note</w:t>
+      </w:r>
+      <w:r>
+        <w:rPr>
+          <w:rFonts w:ascii="Arial" w:hAnsi="Arial" w:eastAsia="Malgun Gothic" w:cs="Malgun Gothic"/>
+          <w:color w:val="000000"/>
+          <w:sz w:val="22"/>
+          <w:lang w:eastAsia="ko-KR"/>
+        </w:rPr>
+        <w:t>는 최대 500자.</w:t>
+      </w:r>
+    </w:p>
+    <w:p>
+      <w:pPr>
+        <w:pStyle w:val="ListBullet"/>
+      </w:pPr>
+      <w:r>
+        <w:rPr>
+          <w:rFonts w:ascii="Arial" w:hAnsi="Arial" w:eastAsia="Malgun Gothic" w:cs="Malgun Gothic"/>
+          <w:b/>
+          <w:color w:val="000000"/>
+          <w:sz w:val="22"/>
+          <w:lang w:eastAsia="ko-KR"/>
+        </w:rPr>
+        <w:t>`PATCH /relations/{id}`:</w:t>
+      </w:r>
+      <w:r>
+        <w:rPr>
+          <w:rFonts w:ascii="Arial" w:hAnsi="Arial" w:eastAsia="Malgun Gothic" w:cs="Malgun Gothic"/>
+          <w:color w:val="000000"/>
+          <w:sz w:val="22"/>
+          <w:lang w:eastAsia="ko-KR"/>
+        </w:rPr>
+        <w:t xml:space="preserve"> </w:t>
+      </w:r>
+      <w:r>
+        <w:rPr>
+          <w:rFonts w:ascii="Menlo" w:hAnsi="Menlo" w:eastAsia="Menlo" w:cs="Menlo"/>
+          <w:color w:val="000000"/>
+          <w:sz w:val="21"/>
+          <w:lang w:eastAsia="ko-KR"/>
+        </w:rPr>
+        <w:t>relationTypeId</w:t>
+      </w:r>
+      <w:r>
+        <w:rPr>
+          <w:rFonts w:ascii="Arial" w:hAnsi="Arial" w:eastAsia="Malgun Gothic" w:cs="Malgun Gothic"/>
+          <w:color w:val="000000"/>
+          <w:sz w:val="22"/>
+          <w:lang w:eastAsia="ko-KR"/>
+        </w:rPr>
+        <w:t>/</w:t>
+      </w:r>
+      <w:r>
+        <w:rPr>
+          <w:rFonts w:ascii="Menlo" w:hAnsi="Menlo" w:eastAsia="Menlo" w:cs="Menlo"/>
+          <w:color w:val="000000"/>
+          <w:sz w:val="21"/>
+          <w:lang w:eastAsia="ko-KR"/>
+        </w:rPr>
+        <w:t>note</w:t>
+      </w:r>
+      <w:r>
+        <w:rPr>
+          <w:rFonts w:ascii="Arial" w:hAnsi="Arial" w:eastAsia="Malgun Gothic" w:cs="Malgun Gothic"/>
+          <w:color w:val="000000"/>
+          <w:sz w:val="22"/>
+          <w:lang w:eastAsia="ko-KR"/>
+        </w:rPr>
+        <w:t xml:space="preserve"> 중 보낸 것만 바꾼다(</w:t>
+      </w:r>
+      <w:r>
+        <w:rPr>
+          <w:rFonts w:ascii="Menlo" w:hAnsi="Menlo" w:eastAsia="Menlo" w:cs="Menlo"/>
+          <w:color w:val="000000"/>
+          <w:sz w:val="21"/>
+          <w:lang w:eastAsia="ko-KR"/>
+        </w:rPr>
+        <w:t>null</w:t>
+      </w:r>
+      <w:r>
+        <w:rPr>
+          <w:rFonts w:ascii="Arial" w:hAnsi="Arial" w:eastAsia="Malgun Gothic" w:cs="Malgun Gothic"/>
+          <w:color w:val="000000"/>
+          <w:sz w:val="22"/>
+          <w:lang w:eastAsia="ko-KR"/>
+        </w:rPr>
+        <w:t xml:space="preserve">/생략은 변경 없음, 빈 메모 문자열은 지움). 타입을 바꾸면 같은 허용 조합·중복 규칙이 적용되고, 방향성 → 대칭으로 바꾸면 canonical 순서로 저장 방향이 정리된다. 아무것도 바뀌지 않으면 </w:t>
+      </w:r>
+      <w:r>
+        <w:rPr>
+          <w:rFonts w:ascii="Menlo" w:hAnsi="Menlo" w:eastAsia="Menlo" w:cs="Menlo"/>
+          <w:color w:val="000000"/>
+          <w:sz w:val="21"/>
+          <w:lang w:eastAsia="ko-KR"/>
+        </w:rPr>
+        <w:t>updated_at</w:t>
+      </w:r>
+      <w:r>
+        <w:rPr>
+          <w:rFonts w:ascii="Arial" w:hAnsi="Arial" w:eastAsia="Malgun Gothic" w:cs="Malgun Gothic"/>
+          <w:color w:val="000000"/>
+          <w:sz w:val="22"/>
+          <w:lang w:eastAsia="ko-KR"/>
+        </w:rPr>
+        <w:t>도 바꾸지 않는다. 휴지통 Node가 낀 관계는 수정할 수 없고(</w:t>
+      </w:r>
+      <w:r>
+        <w:rPr>
+          <w:rFonts w:ascii="Menlo" w:hAnsi="Menlo" w:eastAsia="Menlo" w:cs="Menlo"/>
+          <w:color w:val="000000"/>
+          <w:sz w:val="21"/>
+          <w:lang w:eastAsia="ko-KR"/>
+        </w:rPr>
+        <w:t>409</w:t>
+      </w:r>
+      <w:r>
+        <w:rPr>
+          <w:rFonts w:ascii="Arial" w:hAnsi="Arial" w:eastAsia="Malgun Gothic" w:cs="Malgun Gothic"/>
+          <w:color w:val="000000"/>
+          <w:sz w:val="22"/>
+          <w:lang w:eastAsia="ko-KR"/>
+        </w:rPr>
+        <w:t xml:space="preserve">), 삭제는 언제나 가능하다. 낙관적 락 </w:t>
+      </w:r>
+      <w:r>
+        <w:rPr>
+          <w:rFonts w:ascii="Menlo" w:hAnsi="Menlo" w:eastAsia="Menlo" w:cs="Menlo"/>
+          <w:color w:val="000000"/>
+          <w:sz w:val="21"/>
+          <w:lang w:eastAsia="ko-KR"/>
+        </w:rPr>
+        <w:t>version</w:t>
+      </w:r>
+      <w:r>
+        <w:rPr>
+          <w:rFonts w:ascii="Arial" w:hAnsi="Arial" w:eastAsia="Malgun Gothic" w:cs="Malgun Gothic"/>
+          <w:color w:val="000000"/>
+          <w:sz w:val="22"/>
+          <w:lang w:eastAsia="ko-KR"/>
+        </w:rPr>
+        <w:t>은 없다(마지막 쓰기가 이기며 UNIQUE가 무결성을 지킨다).</w:t>
+      </w:r>
+    </w:p>
+    <w:p>
+      <w:pPr>
+        <w:pStyle w:val="ListBullet"/>
+      </w:pPr>
+      <w:r>
+        <w:rPr>
+          <w:rFonts w:ascii="Arial" w:hAnsi="Arial" w:eastAsia="Malgun Gothic" w:cs="Malgun Gothic"/>
+          <w:b/>
+          <w:color w:val="000000"/>
+          <w:sz w:val="22"/>
+          <w:lang w:eastAsia="ko-KR"/>
+        </w:rPr>
+        <w:t>`GET /relation-types`:</w:t>
+      </w:r>
+      <w:r>
+        <w:rPr>
+          <w:rFonts w:ascii="Arial" w:hAnsi="Arial" w:eastAsia="Malgun Gothic" w:cs="Malgun Gothic"/>
+          <w:color w:val="000000"/>
+          <w:sz w:val="22"/>
+          <w:lang w:eastAsia="ko-KR"/>
+        </w:rPr>
+        <w:t xml:space="preserve"> 활성 시스템 13종(+ 해당 Workspace의 사용자 타입, 현재는 없음). 허용 Source/Target 조합은 이 응답의 </w:t>
+      </w:r>
+      <w:r>
+        <w:rPr>
+          <w:rFonts w:ascii="Menlo" w:hAnsi="Menlo" w:eastAsia="Menlo" w:cs="Menlo"/>
+          <w:color w:val="000000"/>
+          <w:sz w:val="21"/>
+          <w:lang w:eastAsia="ko-KR"/>
+        </w:rPr>
+        <w:t>allowedSourceTypes</w:t>
+      </w:r>
+      <w:r>
+        <w:rPr>
+          <w:rFonts w:ascii="Arial" w:hAnsi="Arial" w:eastAsia="Malgun Gothic" w:cs="Malgun Gothic"/>
+          <w:color w:val="000000"/>
+          <w:sz w:val="22"/>
+          <w:lang w:eastAsia="ko-KR"/>
+        </w:rPr>
+        <w:t>/</w:t>
+      </w:r>
+      <w:r>
+        <w:rPr>
+          <w:rFonts w:ascii="Menlo" w:hAnsi="Menlo" w:eastAsia="Menlo" w:cs="Menlo"/>
+          <w:color w:val="000000"/>
+          <w:sz w:val="21"/>
+          <w:lang w:eastAsia="ko-KR"/>
+        </w:rPr>
+        <w:t>allowedTargetTypes</w:t>
+      </w:r>
+      <w:r>
+        <w:rPr>
+          <w:rFonts w:ascii="Arial" w:hAnsi="Arial" w:eastAsia="Malgun Gothic" w:cs="Malgun Gothic"/>
+          <w:color w:val="000000"/>
+          <w:sz w:val="22"/>
+          <w:lang w:eastAsia="ko-KR"/>
+        </w:rPr>
+        <w:t xml:space="preserve">이며 화면이 선택지를 미리 거르는 데 쓴다. </w:t>
+      </w:r>
+      <w:r>
+        <w:rPr>
+          <w:rFonts w:ascii="Menlo" w:hAnsi="Menlo" w:eastAsia="Menlo" w:cs="Menlo"/>
+          <w:color w:val="000000"/>
+          <w:sz w:val="21"/>
+          <w:lang w:eastAsia="ko-KR"/>
+        </w:rPr>
+        <w:t>POST /relation-types</w:t>
+      </w:r>
+      <w:r>
+        <w:rPr>
+          <w:rFonts w:ascii="Arial" w:hAnsi="Arial" w:eastAsia="Malgun Gothic" w:cs="Malgun Gothic"/>
+          <w:color w:val="000000"/>
+          <w:sz w:val="22"/>
+          <w:lang w:eastAsia="ko-KR"/>
+        </w:rPr>
+        <w:t xml:space="preserve"> 라우트는 없다.</w:t>
+      </w:r>
+    </w:p>
+    <w:p>
+      <w:pPr>
+        <w:pStyle w:val="ListBullet"/>
+      </w:pPr>
+      <w:r>
+        <w:rPr>
+          <w:rFonts w:ascii="Arial" w:hAnsi="Arial" w:eastAsia="Malgun Gothic" w:cs="Malgun Gothic"/>
+          <w:b/>
+          <w:color w:val="000000"/>
+          <w:sz w:val="22"/>
+          <w:lang w:eastAsia="ko-KR"/>
+        </w:rPr>
+        <w:t>보조 endpoint `GET /relations/target-candidates?nodeId&amp;relationTypeId&amp;side=OUTGOING|INCOMING&amp;q`(Relation Picker용, 표에 없던 추가):</w:t>
+      </w:r>
+      <w:r>
+        <w:rPr>
+          <w:rFonts w:ascii="Arial" w:hAnsi="Arial" w:eastAsia="Malgun Gothic" w:cs="Malgun Gothic"/>
+          <w:color w:val="000000"/>
+          <w:sz w:val="22"/>
+          <w:lang w:eastAsia="ko-KR"/>
+        </w:rPr>
+        <w:t xml:space="preserve"> 그 타입·방향에서 허용되는 타입의 Node 중 </w:t>
+      </w:r>
+      <w:r>
+        <w:rPr>
+          <w:rFonts w:ascii="Arial" w:hAnsi="Arial" w:eastAsia="Malgun Gothic" w:cs="Malgun Gothic"/>
+          <w:b/>
+          <w:color w:val="000000"/>
+          <w:sz w:val="22"/>
+          <w:lang w:eastAsia="ko-KR"/>
+        </w:rPr>
+        <w:t>아직 연결되지 않은</w:t>
+      </w:r>
+      <w:r>
+        <w:rPr>
+          <w:rFonts w:ascii="Arial" w:hAnsi="Arial" w:eastAsia="Malgun Gothic" w:cs="Malgun Gothic"/>
+          <w:color w:val="000000"/>
+          <w:sz w:val="22"/>
+          <w:lang w:eastAsia="ko-KR"/>
+        </w:rPr>
+        <w:t xml:space="preserve"> 것만(대칭 타입은 양방향 기준), 휴지통·자기 자신 제외, 제목 부분 일치(대소문자 무시, </w:t>
+      </w:r>
+      <w:r>
+        <w:rPr>
+          <w:rFonts w:ascii="Menlo" w:hAnsi="Menlo" w:eastAsia="Menlo" w:cs="Menlo"/>
+          <w:color w:val="000000"/>
+          <w:sz w:val="21"/>
+          <w:lang w:eastAsia="ko-KR"/>
+        </w:rPr>
+        <w:t>%</w:t>
+      </w:r>
+      <w:r>
+        <w:rPr>
+          <w:rFonts w:ascii="Arial" w:hAnsi="Arial" w:eastAsia="Malgun Gothic" w:cs="Malgun Gothic"/>
+          <w:color w:val="000000"/>
+          <w:sz w:val="22"/>
+          <w:lang w:eastAsia="ko-KR"/>
+        </w:rPr>
+        <w:t xml:space="preserve"> </w:t>
+      </w:r>
+      <w:r>
+        <w:rPr>
+          <w:rFonts w:ascii="Menlo" w:hAnsi="Menlo" w:eastAsia="Menlo" w:cs="Menlo"/>
+          <w:color w:val="000000"/>
+          <w:sz w:val="21"/>
+          <w:lang w:eastAsia="ko-KR"/>
+        </w:rPr>
+        <w:t>_</w:t>
+      </w:r>
+      <w:r>
+        <w:rPr>
+          <w:rFonts w:ascii="Arial" w:hAnsi="Arial" w:eastAsia="Malgun Gothic" w:cs="Malgun Gothic"/>
+          <w:color w:val="000000"/>
+          <w:sz w:val="22"/>
+          <w:lang w:eastAsia="ko-KR"/>
+        </w:rPr>
+        <w:t>는 문자 그대로), 최근 수정 순 최대 20건. 이 Node의 타입이 그 방향으로 허용되지 않으면 빈 목록. 통합 검색(Phase 5) 이전의 최소 기능이다.</w:t>
+      </w:r>
+    </w:p>
+    <w:p>
+      <w:pPr>
+        <w:pStyle w:val="ListBullet"/>
+      </w:pPr>
+      <w:r>
+        <w:rPr>
+          <w:rFonts w:ascii="Arial" w:hAnsi="Arial" w:eastAsia="Malgun Gothic" w:cs="Malgun Gothic"/>
+          <w:b/>
+          <w:color w:val="000000"/>
+          <w:sz w:val="22"/>
+          <w:lang w:eastAsia="ko-KR"/>
+        </w:rPr>
+        <w:t>Node 상세의 `relations`:</w:t>
+      </w:r>
+      <w:r>
+        <w:rPr>
+          <w:rFonts w:ascii="Arial" w:hAnsi="Arial" w:eastAsia="Malgun Gothic" w:cs="Malgun Gothic"/>
+          <w:color w:val="000000"/>
+          <w:sz w:val="22"/>
+          <w:lang w:eastAsia="ko-KR"/>
+        </w:rPr>
+        <w:t xml:space="preserve"> </w:t>
+      </w:r>
+      <w:r>
+        <w:rPr>
+          <w:rFonts w:ascii="Menlo" w:hAnsi="Menlo" w:eastAsia="Menlo" w:cs="Menlo"/>
+          <w:color w:val="000000"/>
+          <w:sz w:val="21"/>
+          <w:lang w:eastAsia="ko-KR"/>
+        </w:rPr>
+        <w:t>GET /nodes/{id}</w:t>
+      </w:r>
+      <w:r>
+        <w:rPr>
+          <w:rFonts w:ascii="Arial" w:hAnsi="Arial" w:eastAsia="Malgun Gothic" w:cs="Malgun Gothic"/>
+          <w:color w:val="000000"/>
+          <w:sz w:val="22"/>
+          <w:lang w:eastAsia="ko-KR"/>
+        </w:rPr>
+        <w:t xml:space="preserve">, </w:t>
+      </w:r>
+      <w:r>
+        <w:rPr>
+          <w:rFonts w:ascii="Menlo" w:hAnsi="Menlo" w:eastAsia="Menlo" w:cs="Menlo"/>
+          <w:color w:val="000000"/>
+          <w:sz w:val="21"/>
+          <w:lang w:eastAsia="ko-KR"/>
+        </w:rPr>
+        <w:t>GET /snippets/{id}</w:t>
+      </w:r>
+      <w:r>
+        <w:rPr>
+          <w:rFonts w:ascii="Arial" w:hAnsi="Arial" w:eastAsia="Malgun Gothic" w:cs="Malgun Gothic"/>
+          <w:color w:val="000000"/>
+          <w:sz w:val="22"/>
+          <w:lang w:eastAsia="ko-KR"/>
+        </w:rPr>
+        <w:t xml:space="preserve">(및 생성·수정 응답)는 </w:t>
+      </w:r>
+      <w:r>
+        <w:rPr>
+          <w:rFonts w:ascii="Menlo" w:hAnsi="Menlo" w:eastAsia="Menlo" w:cs="Menlo"/>
+          <w:color w:val="000000"/>
+          <w:sz w:val="21"/>
+          <w:lang w:eastAsia="ko-KR"/>
+        </w:rPr>
+        <w:t>relations:{outgoing[], incoming[], truncated}</w:t>
+      </w:r>
+      <w:r>
+        <w:rPr>
+          <w:rFonts w:ascii="Arial" w:hAnsi="Arial" w:eastAsia="Malgun Gothic" w:cs="Malgun Gothic"/>
+          <w:color w:val="000000"/>
+          <w:sz w:val="22"/>
+          <w:lang w:eastAsia="ko-KR"/>
+        </w:rPr>
+        <w:t xml:space="preserve">를 포함한다. 각 항목은 </w:t>
+      </w:r>
+      <w:r>
+        <w:rPr>
+          <w:rFonts w:ascii="Menlo" w:hAnsi="Menlo" w:eastAsia="Menlo" w:cs="Menlo"/>
+          <w:color w:val="000000"/>
+          <w:sz w:val="21"/>
+          <w:lang w:eastAsia="ko-KR"/>
+        </w:rPr>
+        <w:t>{id, relationTypeId, type, label, nodeId, nodeTitle, nodeType, nodeStatus, note}</w:t>
+      </w:r>
+      <w:r>
+        <w:rPr>
+          <w:rFonts w:ascii="Arial" w:hAnsi="Arial" w:eastAsia="Malgun Gothic" w:cs="Malgun Gothic"/>
+          <w:color w:val="000000"/>
+          <w:sz w:val="22"/>
+          <w:lang w:eastAsia="ko-KR"/>
+        </w:rPr>
+        <w:t xml:space="preserve">이며 </w:t>
+      </w:r>
+      <w:r>
+        <w:rPr>
+          <w:rFonts w:ascii="Menlo" w:hAnsi="Menlo" w:eastAsia="Menlo" w:cs="Menlo"/>
+          <w:color w:val="000000"/>
+          <w:sz w:val="21"/>
+          <w:lang w:eastAsia="ko-KR"/>
+        </w:rPr>
+        <w:t>label</w:t>
+      </w:r>
+      <w:r>
+        <w:rPr>
+          <w:rFonts w:ascii="Arial" w:hAnsi="Arial" w:eastAsia="Malgun Gothic" w:cs="Malgun Gothic"/>
+          <w:color w:val="000000"/>
+          <w:sz w:val="22"/>
+          <w:lang w:eastAsia="ko-KR"/>
+        </w:rPr>
+        <w:t xml:space="preserve">은 이 Node 기준으로 forward/inverse가 이미 골라져 있다. </w:t>
+      </w:r>
+      <w:r>
+        <w:rPr>
+          <w:rFonts w:ascii="Arial" w:hAnsi="Arial" w:eastAsia="Malgun Gothic" w:cs="Malgun Gothic"/>
+          <w:b/>
+          <w:color w:val="000000"/>
+          <w:sz w:val="22"/>
+          <w:lang w:eastAsia="ko-KR"/>
+        </w:rPr>
+        <w:t>대칭 타입은 저장 방향과 무관하게 항상 `outgoing`에 담고</w:t>
+      </w:r>
+      <w:r>
+        <w:rPr>
+          <w:rFonts w:ascii="Arial" w:hAnsi="Arial" w:eastAsia="Malgun Gothic" w:cs="Malgun Gothic"/>
+          <w:color w:val="000000"/>
+          <w:sz w:val="22"/>
+          <w:lang w:eastAsia="ko-KR"/>
+        </w:rPr>
+        <w:t xml:space="preserve"> 상대 Node를 </w:t>
+      </w:r>
+      <w:r>
+        <w:rPr>
+          <w:rFonts w:ascii="Menlo" w:hAnsi="Menlo" w:eastAsia="Menlo" w:cs="Menlo"/>
+          <w:color w:val="000000"/>
+          <w:sz w:val="21"/>
+          <w:lang w:eastAsia="ko-KR"/>
+        </w:rPr>
+        <w:t>nodeId</w:t>
+      </w:r>
+      <w:r>
+        <w:rPr>
+          <w:rFonts w:ascii="Arial" w:hAnsi="Arial" w:eastAsia="Malgun Gothic" w:cs="Malgun Gothic"/>
+          <w:color w:val="000000"/>
+          <w:sz w:val="22"/>
+          <w:lang w:eastAsia="ko-KR"/>
+        </w:rPr>
+        <w:t xml:space="preserve">로 준다(§13.1.2의 canonical 저장을 화면이 알 필요가 없다). 휴지통 Node와 이어진 관계는 제외한다. 한 Node에 싣는 관계는 최대 200건이며 넘으면 </w:t>
+      </w:r>
+      <w:r>
+        <w:rPr>
+          <w:rFonts w:ascii="Menlo" w:hAnsi="Menlo" w:eastAsia="Menlo" w:cs="Menlo"/>
+          <w:color w:val="000000"/>
+          <w:sz w:val="21"/>
+          <w:lang w:eastAsia="ko-KR"/>
+        </w:rPr>
+        <w:t>truncated=true</w:t>
+      </w:r>
+      <w:r>
+        <w:rPr>
+          <w:rFonts w:ascii="Arial" w:hAnsi="Arial" w:eastAsia="Malgun Gothic" w:cs="Malgun Gothic"/>
+          <w:color w:val="000000"/>
+          <w:sz w:val="22"/>
+          <w:lang w:eastAsia="ko-KR"/>
+        </w:rPr>
+        <w:t>로 알린다.</w:t>
+      </w:r>
+    </w:p>
+    <w:p>
+      <w:pPr>
+        <w:pStyle w:val="ListBullet"/>
+      </w:pPr>
+      <w:r>
+        <w:rPr>
+          <w:rFonts w:ascii="Arial" w:hAnsi="Arial" w:eastAsia="Malgun Gothic" w:cs="Malgun Gothic"/>
+          <w:b/>
+          <w:color w:val="000000"/>
+          <w:sz w:val="22"/>
+          <w:lang w:eastAsia="ko-KR"/>
+        </w:rPr>
+        <w:t>`GET /graph/focus/{nodeId}`:</w:t>
+      </w:r>
+      <w:r>
+        <w:rPr>
+          <w:rFonts w:ascii="Arial" w:hAnsi="Arial" w:eastAsia="Malgun Gothic" w:cs="Malgun Gothic"/>
+          <w:color w:val="000000"/>
+          <w:sz w:val="22"/>
+          <w:lang w:eastAsia="ko-KR"/>
+        </w:rPr>
+        <w:t xml:space="preserve"> </w:t>
+      </w:r>
+      <w:r>
+        <w:rPr>
+          <w:rFonts w:ascii="Menlo" w:hAnsi="Menlo" w:eastAsia="Menlo" w:cs="Menlo"/>
+          <w:color w:val="000000"/>
+          <w:sz w:val="21"/>
+          <w:lang w:eastAsia="ko-KR"/>
+        </w:rPr>
+        <w:t>depth</w:t>
+      </w:r>
+      <w:r>
+        <w:rPr>
+          <w:rFonts w:ascii="Arial" w:hAnsi="Arial" w:eastAsia="Malgun Gothic" w:cs="Malgun Gothic"/>
+          <w:color w:val="000000"/>
+          <w:sz w:val="22"/>
+          <w:lang w:eastAsia="ko-KR"/>
+        </w:rPr>
+        <w:t xml:space="preserve">(기본 1, 1~3, 3 초과는 </w:t>
+      </w:r>
+      <w:r>
+        <w:rPr>
+          <w:rFonts w:ascii="Menlo" w:hAnsi="Menlo" w:eastAsia="Menlo" w:cs="Menlo"/>
+          <w:color w:val="000000"/>
+          <w:sz w:val="21"/>
+          <w:lang w:eastAsia="ko-KR"/>
+        </w:rPr>
+        <w:t>400 LIMIT_EXCEEDED</w:t>
+      </w:r>
+      <w:r>
+        <w:rPr>
+          <w:rFonts w:ascii="Arial" w:hAnsi="Arial" w:eastAsia="Malgun Gothic" w:cs="Malgun Gothic"/>
+          <w:color w:val="000000"/>
+          <w:sz w:val="22"/>
+          <w:lang w:eastAsia="ko-KR"/>
+        </w:rPr>
+        <w:t xml:space="preserve">, 1 미만은 </w:t>
+      </w:r>
+      <w:r>
+        <w:rPr>
+          <w:rFonts w:ascii="Menlo" w:hAnsi="Menlo" w:eastAsia="Menlo" w:cs="Menlo"/>
+          <w:color w:val="000000"/>
+          <w:sz w:val="21"/>
+          <w:lang w:eastAsia="ko-KR"/>
+        </w:rPr>
+        <w:t>400</w:t>
+      </w:r>
+      <w:r>
+        <w:rPr>
+          <w:rFonts w:ascii="Arial" w:hAnsi="Arial" w:eastAsia="Malgun Gothic" w:cs="Malgun Gothic"/>
+          <w:color w:val="000000"/>
+          <w:sz w:val="22"/>
+          <w:lang w:eastAsia="ko-KR"/>
+        </w:rPr>
+        <w:t xml:space="preserve">), </w:t>
+      </w:r>
+      <w:r>
+        <w:rPr>
+          <w:rFonts w:ascii="Menlo" w:hAnsi="Menlo" w:eastAsia="Menlo" w:cs="Menlo"/>
+          <w:color w:val="000000"/>
+          <w:sz w:val="21"/>
+          <w:lang w:eastAsia="ko-KR"/>
+        </w:rPr>
+        <w:t>maxNodes</w:t>
+      </w:r>
+      <w:r>
+        <w:rPr>
+          <w:rFonts w:ascii="Arial" w:hAnsi="Arial" w:eastAsia="Malgun Gothic" w:cs="Malgun Gothic"/>
+          <w:color w:val="000000"/>
+          <w:sz w:val="22"/>
+          <w:lang w:eastAsia="ko-KR"/>
+        </w:rPr>
+        <w:t xml:space="preserve">(기본 200, 최대 500, 초과는 </w:t>
+      </w:r>
+      <w:r>
+        <w:rPr>
+          <w:rFonts w:ascii="Menlo" w:hAnsi="Menlo" w:eastAsia="Menlo" w:cs="Menlo"/>
+          <w:color w:val="000000"/>
+          <w:sz w:val="21"/>
+          <w:lang w:eastAsia="ko-KR"/>
+        </w:rPr>
+        <w:t>400 LIMIT_EXCEEDED</w:t>
+      </w:r>
+      <w:r>
+        <w:rPr>
+          <w:rFonts w:ascii="Arial" w:hAnsi="Arial" w:eastAsia="Malgun Gothic" w:cs="Malgun Gothic"/>
+          <w:color w:val="000000"/>
+          <w:sz w:val="22"/>
+          <w:lang w:eastAsia="ko-KR"/>
+        </w:rPr>
+        <w:t xml:space="preserve">), </w:t>
+      </w:r>
+      <w:r>
+        <w:rPr>
+          <w:rFonts w:ascii="Menlo" w:hAnsi="Menlo" w:eastAsia="Menlo" w:cs="Menlo"/>
+          <w:color w:val="000000"/>
+          <w:sz w:val="21"/>
+          <w:lang w:eastAsia="ko-KR"/>
+        </w:rPr>
+        <w:t>nodeTypes</w:t>
+      </w:r>
+      <w:r>
+        <w:rPr>
+          <w:rFonts w:ascii="Arial" w:hAnsi="Arial" w:eastAsia="Malgun Gothic" w:cs="Malgun Gothic"/>
+          <w:color w:val="000000"/>
+          <w:sz w:val="22"/>
+          <w:lang w:eastAsia="ko-KR"/>
+        </w:rPr>
+        <w:t>/</w:t>
+      </w:r>
+      <w:r>
+        <w:rPr>
+          <w:rFonts w:ascii="Menlo" w:hAnsi="Menlo" w:eastAsia="Menlo" w:cs="Menlo"/>
+          <w:color w:val="000000"/>
+          <w:sz w:val="21"/>
+          <w:lang w:eastAsia="ko-KR"/>
+        </w:rPr>
+        <w:t>relationTypes</w:t>
+      </w:r>
+      <w:r>
+        <w:rPr>
+          <w:rFonts w:ascii="Arial" w:hAnsi="Arial" w:eastAsia="Malgun Gothic" w:cs="Malgun Gothic"/>
+          <w:color w:val="000000"/>
+          <w:sz w:val="22"/>
+          <w:lang w:eastAsia="ko-KR"/>
+        </w:rPr>
+        <w:t xml:space="preserve">(콤마 구분 목록, 모르는 관계 key는 </w:t>
+      </w:r>
+      <w:r>
+        <w:rPr>
+          <w:rFonts w:ascii="Menlo" w:hAnsi="Menlo" w:eastAsia="Menlo" w:cs="Menlo"/>
+          <w:color w:val="000000"/>
+          <w:sz w:val="21"/>
+          <w:lang w:eastAsia="ko-KR"/>
+        </w:rPr>
+        <w:t>400</w:t>
+      </w:r>
+      <w:r>
+        <w:rPr>
+          <w:rFonts w:ascii="Arial" w:hAnsi="Arial" w:eastAsia="Malgun Gothic" w:cs="Malgun Gothic"/>
+          <w:color w:val="000000"/>
+          <w:sz w:val="22"/>
+          <w:lang w:eastAsia="ko-KR"/>
+        </w:rPr>
+        <w:t xml:space="preserve">), </w:t>
+      </w:r>
+      <w:r>
+        <w:rPr>
+          <w:rFonts w:ascii="Menlo" w:hAnsi="Menlo" w:eastAsia="Menlo" w:cs="Menlo"/>
+          <w:color w:val="000000"/>
+          <w:sz w:val="21"/>
+          <w:lang w:eastAsia="ko-KR"/>
+        </w:rPr>
+        <w:t>archived</w:t>
+      </w:r>
+      <w:r>
+        <w:rPr>
+          <w:rFonts w:ascii="Arial" w:hAnsi="Arial" w:eastAsia="Malgun Gothic" w:cs="Malgun Gothic"/>
+          <w:color w:val="000000"/>
+          <w:sz w:val="22"/>
+          <w:lang w:eastAsia="ko-KR"/>
+        </w:rPr>
+        <w:t xml:space="preserve">(기본 false, true면 보관 Node 포함; 휴지통은 항상 제외). 중심 Node가 없거나 휴지통이면 </w:t>
+      </w:r>
+      <w:r>
+        <w:rPr>
+          <w:rFonts w:ascii="Menlo" w:hAnsi="Menlo" w:eastAsia="Menlo" w:cs="Menlo"/>
+          <w:color w:val="000000"/>
+          <w:sz w:val="21"/>
+          <w:lang w:eastAsia="ko-KR"/>
+        </w:rPr>
+        <w:t>404</w:t>
+      </w:r>
+      <w:r>
+        <w:rPr>
+          <w:rFonts w:ascii="Arial" w:hAnsi="Arial" w:eastAsia="Malgun Gothic" w:cs="Malgun Gothic"/>
+          <w:color w:val="000000"/>
+          <w:sz w:val="22"/>
+          <w:lang w:eastAsia="ko-KR"/>
+        </w:rPr>
+        <w:t xml:space="preserve">. </w:t>
+      </w:r>
+      <w:r>
+        <w:rPr>
+          <w:rFonts w:ascii="Arial" w:hAnsi="Arial" w:eastAsia="Malgun Gothic" w:cs="Malgun Gothic"/>
+          <w:b/>
+          <w:color w:val="000000"/>
+          <w:sz w:val="22"/>
+          <w:lang w:eastAsia="ko-KR"/>
+        </w:rPr>
+        <w:t>낮은 depth부터 BFS</w:t>
+      </w:r>
+      <w:r>
+        <w:rPr>
+          <w:rFonts w:ascii="Arial" w:hAnsi="Arial" w:eastAsia="Malgun Gothic" w:cs="Malgun Gothic"/>
+          <w:color w:val="000000"/>
+          <w:sz w:val="22"/>
+          <w:lang w:eastAsia="ko-KR"/>
+        </w:rPr>
+        <w:t xml:space="preserve">로 확장하고 같은 depth에서는 </w:t>
+      </w:r>
+      <w:r>
+        <w:rPr>
+          <w:rFonts w:ascii="Menlo" w:hAnsi="Menlo" w:eastAsia="Menlo" w:cs="Menlo"/>
+          <w:color w:val="000000"/>
+          <w:sz w:val="21"/>
+          <w:lang w:eastAsia="ko-KR"/>
+        </w:rPr>
+        <w:t>updatedAt DESC, id ASC</w:t>
+      </w:r>
+      <w:r>
+        <w:rPr>
+          <w:rFonts w:ascii="Arial" w:hAnsi="Arial" w:eastAsia="Malgun Gothic" w:cs="Malgun Gothic"/>
+          <w:color w:val="000000"/>
+          <w:sz w:val="22"/>
+          <w:lang w:eastAsia="ko-KR"/>
+        </w:rPr>
+        <w:t xml:space="preserve"> 순으로 담아 잘림 지점이 결정적이다. visited 집합으로 cycle에서도 종료하며 여러 경로로 닿는 Node는 가장 낮은 depth로 한 번만 담는다(응답의 </w:t>
+      </w:r>
+      <w:r>
+        <w:rPr>
+          <w:rFonts w:ascii="Menlo" w:hAnsi="Menlo" w:eastAsia="Menlo" w:cs="Menlo"/>
+          <w:color w:val="000000"/>
+          <w:sz w:val="21"/>
+          <w:lang w:eastAsia="ko-KR"/>
+        </w:rPr>
+        <w:t>depth</w:t>
+      </w:r>
+      <w:r>
+        <w:rPr>
+          <w:rFonts w:ascii="Arial" w:hAnsi="Arial" w:eastAsia="Malgun Gothic" w:cs="Malgun Gothic"/>
+          <w:color w:val="000000"/>
+          <w:sz w:val="22"/>
+          <w:lang w:eastAsia="ko-KR"/>
+        </w:rPr>
+        <w:t xml:space="preserve"> 필드). </w:t>
+      </w:r>
+      <w:r>
+        <w:rPr>
+          <w:rFonts w:ascii="Menlo" w:hAnsi="Menlo" w:eastAsia="Menlo" w:cs="Menlo"/>
+          <w:color w:val="000000"/>
+          <w:sz w:val="21"/>
+          <w:lang w:eastAsia="ko-KR"/>
+        </w:rPr>
+        <w:t>nodeTypes</w:t>
+      </w:r>
+      <w:r>
+        <w:rPr>
+          <w:rFonts w:ascii="Arial" w:hAnsi="Arial" w:eastAsia="Malgun Gothic" w:cs="Malgun Gothic"/>
+          <w:color w:val="000000"/>
+          <w:sz w:val="22"/>
+          <w:lang w:eastAsia="ko-KR"/>
+        </w:rPr>
+        <w:t xml:space="preserve"> 필터는 중심 Node 자신에는 적용하지 않는다. edge는 담긴 Node </w:t>
+      </w:r>
+      <w:r>
+        <w:rPr>
+          <w:rFonts w:ascii="Arial" w:hAnsi="Arial" w:eastAsia="Malgun Gothic" w:cs="Malgun Gothic"/>
+          <w:b/>
+          <w:color w:val="000000"/>
+          <w:sz w:val="22"/>
+          <w:lang w:eastAsia="ko-KR"/>
+        </w:rPr>
+        <w:t>사이</w:t>
+      </w:r>
+      <w:r>
+        <w:rPr>
+          <w:rFonts w:ascii="Arial" w:hAnsi="Arial" w:eastAsia="Malgun Gothic" w:cs="Malgun Gothic"/>
+          <w:color w:val="000000"/>
+          <w:sz w:val="22"/>
+          <w:lang w:eastAsia="ko-KR"/>
+        </w:rPr>
+        <w:t xml:space="preserve">의 것만이며 상한은 </w:t>
+      </w:r>
+      <w:r>
+        <w:rPr>
+          <w:rFonts w:ascii="Menlo" w:hAnsi="Menlo" w:eastAsia="Menlo" w:cs="Menlo"/>
+          <w:color w:val="000000"/>
+          <w:sz w:val="21"/>
+          <w:lang w:eastAsia="ko-KR"/>
+        </w:rPr>
+        <w:t>min(1500, 3×maxNodes)</w:t>
+      </w:r>
+      <w:r>
+        <w:rPr>
+          <w:rFonts w:ascii="Arial" w:hAnsi="Arial" w:eastAsia="Malgun Gothic" w:cs="Malgun Gothic"/>
+          <w:color w:val="000000"/>
+          <w:sz w:val="22"/>
+          <w:lang w:eastAsia="ko-KR"/>
+        </w:rPr>
+        <w:t>(</w:t>
+      </w:r>
+      <w:r>
+        <w:rPr>
+          <w:rFonts w:ascii="Menlo" w:hAnsi="Menlo" w:eastAsia="Menlo" w:cs="Menlo"/>
+          <w:color w:val="000000"/>
+          <w:sz w:val="21"/>
+          <w:lang w:eastAsia="ko-KR"/>
+        </w:rPr>
+        <w:t>limits.maxEdges</w:t>
+      </w:r>
+      <w:r>
+        <w:rPr>
+          <w:rFonts w:ascii="Arial" w:hAnsi="Arial" w:eastAsia="Malgun Gothic" w:cs="Malgun Gothic"/>
+          <w:color w:val="000000"/>
+          <w:sz w:val="22"/>
+          <w:lang w:eastAsia="ko-KR"/>
+        </w:rPr>
+        <w:t xml:space="preserve">)다. 상한에 닿으면 </w:t>
+      </w:r>
+      <w:r>
+        <w:rPr>
+          <w:rFonts w:ascii="Menlo" w:hAnsi="Menlo" w:eastAsia="Menlo" w:cs="Menlo"/>
+          <w:color w:val="000000"/>
+          <w:sz w:val="21"/>
+          <w:lang w:eastAsia="ko-KR"/>
+        </w:rPr>
+        <w:t>truncated=true</w:t>
+      </w:r>
+      <w:r>
+        <w:rPr>
+          <w:rFonts w:ascii="Arial" w:hAnsi="Arial" w:eastAsia="Malgun Gothic" w:cs="Malgun Gothic"/>
+          <w:color w:val="000000"/>
+          <w:sz w:val="22"/>
+          <w:lang w:eastAsia="ko-KR"/>
+        </w:rPr>
+        <w:t xml:space="preserve"> + </w:t>
+      </w:r>
+      <w:r>
+        <w:rPr>
+          <w:rFonts w:ascii="Menlo" w:hAnsi="Menlo" w:eastAsia="Menlo" w:cs="Menlo"/>
+          <w:color w:val="000000"/>
+          <w:sz w:val="21"/>
+          <w:lang w:eastAsia="ko-KR"/>
+        </w:rPr>
+        <w:t>truncationReason</w:t>
+      </w:r>
+      <w:r>
+        <w:rPr>
+          <w:rFonts w:ascii="Arial" w:hAnsi="Arial" w:eastAsia="Malgun Gothic" w:cs="Malgun Gothic"/>
+          <w:color w:val="000000"/>
+          <w:sz w:val="22"/>
+          <w:lang w:eastAsia="ko-KR"/>
+        </w:rPr>
+        <w:t>(</w:t>
+      </w:r>
+      <w:r>
+        <w:rPr>
+          <w:rFonts w:ascii="Menlo" w:hAnsi="Menlo" w:eastAsia="Menlo" w:cs="Menlo"/>
+          <w:color w:val="000000"/>
+          <w:sz w:val="21"/>
+          <w:lang w:eastAsia="ko-KR"/>
+        </w:rPr>
+        <w:t>MAX_NODES</w:t>
+      </w:r>
+      <w:r>
+        <w:rPr>
+          <w:rFonts w:ascii="Arial" w:hAnsi="Arial" w:eastAsia="Malgun Gothic" w:cs="Malgun Gothic"/>
+          <w:color w:val="000000"/>
+          <w:sz w:val="22"/>
+          <w:lang w:eastAsia="ko-KR"/>
+        </w:rPr>
+        <w:t xml:space="preserve"> 또는 </w:t>
+      </w:r>
+      <w:r>
+        <w:rPr>
+          <w:rFonts w:ascii="Menlo" w:hAnsi="Menlo" w:eastAsia="Menlo" w:cs="Menlo"/>
+          <w:color w:val="000000"/>
+          <w:sz w:val="21"/>
+          <w:lang w:eastAsia="ko-KR"/>
+        </w:rPr>
+        <w:t>MAX_EDGES</w:t>
+      </w:r>
+      <w:r>
+        <w:rPr>
+          <w:rFonts w:ascii="Arial" w:hAnsi="Arial" w:eastAsia="Malgun Gothic" w:cs="Malgun Gothic"/>
+          <w:color w:val="000000"/>
+          <w:sz w:val="22"/>
+          <w:lang w:eastAsia="ko-KR"/>
+        </w:rPr>
+        <w:t xml:space="preserve">)이고, 상한 때문에 빠진 Node와 요청 depth 바로 다음 단계의 Node를 최대 20개까지 </w:t>
+      </w:r>
+      <w:r>
+        <w:rPr>
+          <w:rFonts w:ascii="Menlo" w:hAnsi="Menlo" w:eastAsia="Menlo" w:cs="Menlo"/>
+          <w:color w:val="000000"/>
+          <w:sz w:val="21"/>
+          <w:lang w:eastAsia="ko-KR"/>
+        </w:rPr>
+        <w:t>nextExpansionCandidates</w:t>
+      </w:r>
+      <w:r>
+        <w:rPr>
+          <w:rFonts w:ascii="Arial" w:hAnsi="Arial" w:eastAsia="Malgun Gothic" w:cs="Malgun Gothic"/>
+          <w:color w:val="000000"/>
+          <w:sz w:val="22"/>
+          <w:lang w:eastAsia="ko-KR"/>
+        </w:rPr>
+        <w:t xml:space="preserve">로 준다. </w:t>
+      </w:r>
+      <w:r>
+        <w:rPr>
+          <w:rFonts w:ascii="Menlo" w:hAnsi="Menlo" w:eastAsia="Menlo" w:cs="Menlo"/>
+          <w:color w:val="000000"/>
+          <w:sz w:val="21"/>
+          <w:lang w:eastAsia="ko-KR"/>
+        </w:rPr>
+        <w:t>MAX_DEPTH</w:t>
+      </w:r>
+      <w:r>
+        <w:rPr>
+          <w:rFonts w:ascii="Arial" w:hAnsi="Arial" w:eastAsia="Malgun Gothic" w:cs="Malgun Gothic"/>
+          <w:color w:val="000000"/>
+          <w:sz w:val="22"/>
+          <w:lang w:eastAsia="ko-KR"/>
+        </w:rPr>
+        <w:t>는 사용하지 않는다(depth 초과는 잘림이 아니라 400이다).</w:t>
+      </w:r>
+    </w:p>
+    <w:p>
+      <w:pPr>
+        <w:pStyle w:val="ListBullet"/>
+      </w:pPr>
+      <w:r>
+        <w:rPr>
+          <w:rFonts w:ascii="Arial" w:hAnsi="Arial" w:eastAsia="Malgun Gothic" w:cs="Malgun Gothic"/>
+          <w:b/>
+          <w:color w:val="000000"/>
+          <w:sz w:val="22"/>
+          <w:lang w:eastAsia="ko-KR"/>
+        </w:rPr>
+        <w:t>`GET /graph/workspace`:</w:t>
+      </w:r>
+      <w:r>
+        <w:rPr>
+          <w:rFonts w:ascii="Arial" w:hAnsi="Arial" w:eastAsia="Malgun Gothic" w:cs="Malgun Gothic"/>
+          <w:color w:val="000000"/>
+          <w:sz w:val="22"/>
+          <w:lang w:eastAsia="ko-KR"/>
+        </w:rPr>
+        <w:t xml:space="preserve"> Node 목록 pagination이다(기본 </w:t>
+      </w:r>
+      <w:r>
+        <w:rPr>
+          <w:rFonts w:ascii="Menlo" w:hAnsi="Menlo" w:eastAsia="Menlo" w:cs="Menlo"/>
+          <w:color w:val="000000"/>
+          <w:sz w:val="21"/>
+          <w:lang w:eastAsia="ko-KR"/>
+        </w:rPr>
+        <w:t>size</w:t>
+      </w:r>
+      <w:r>
+        <w:rPr>
+          <w:rFonts w:ascii="Arial" w:hAnsi="Arial" w:eastAsia="Malgun Gothic" w:cs="Malgun Gothic"/>
+          <w:color w:val="000000"/>
+          <w:sz w:val="22"/>
+          <w:lang w:eastAsia="ko-KR"/>
+        </w:rPr>
+        <w:t xml:space="preserve"> 50, 최대 100, </w:t>
+      </w:r>
+      <w:r>
+        <w:rPr>
+          <w:rFonts w:ascii="Menlo" w:hAnsi="Menlo" w:eastAsia="Menlo" w:cs="Menlo"/>
+          <w:color w:val="000000"/>
+          <w:sz w:val="21"/>
+          <w:lang w:eastAsia="ko-KR"/>
+        </w:rPr>
+        <w:t>GET /nodes</w:t>
+      </w:r>
+      <w:r>
+        <w:rPr>
+          <w:rFonts w:ascii="Arial" w:hAnsi="Arial" w:eastAsia="Malgun Gothic" w:cs="Malgun Gothic"/>
+          <w:color w:val="000000"/>
+          <w:sz w:val="22"/>
+          <w:lang w:eastAsia="ko-KR"/>
+        </w:rPr>
+        <w:t xml:space="preserve">와 같은 cursor 규약). </w:t>
+      </w:r>
+      <w:r>
+        <w:rPr>
+          <w:rFonts w:ascii="Menlo" w:hAnsi="Menlo" w:eastAsia="Menlo" w:cs="Menlo"/>
+          <w:color w:val="000000"/>
+          <w:sz w:val="21"/>
+          <w:lang w:eastAsia="ko-KR"/>
+        </w:rPr>
+        <w:t>tag</w:t>
+      </w:r>
+      <w:r>
+        <w:rPr>
+          <w:rFonts w:ascii="Arial" w:hAnsi="Arial" w:eastAsia="Malgun Gothic" w:cs="Malgun Gothic"/>
+          <w:color w:val="000000"/>
+          <w:sz w:val="22"/>
+          <w:lang w:eastAsia="ko-KR"/>
+        </w:rPr>
+        <w:t xml:space="preserve">, </w:t>
+      </w:r>
+      <w:r>
+        <w:rPr>
+          <w:rFonts w:ascii="Menlo" w:hAnsi="Menlo" w:eastAsia="Menlo" w:cs="Menlo"/>
+          <w:color w:val="000000"/>
+          <w:sz w:val="21"/>
+          <w:lang w:eastAsia="ko-KR"/>
+        </w:rPr>
+        <w:t>nodeTypes</w:t>
+      </w:r>
+      <w:r>
+        <w:rPr>
+          <w:rFonts w:ascii="Arial" w:hAnsi="Arial" w:eastAsia="Malgun Gothic" w:cs="Malgun Gothic"/>
+          <w:color w:val="000000"/>
+          <w:sz w:val="22"/>
+          <w:lang w:eastAsia="ko-KR"/>
+        </w:rPr>
+        <w:t xml:space="preserve">, </w:t>
+      </w:r>
+      <w:r>
+        <w:rPr>
+          <w:rFonts w:ascii="Menlo" w:hAnsi="Menlo" w:eastAsia="Menlo" w:cs="Menlo"/>
+          <w:color w:val="000000"/>
+          <w:sz w:val="21"/>
+          <w:lang w:eastAsia="ko-KR"/>
+        </w:rPr>
+        <w:t>relationTypes</w:t>
+      </w:r>
+      <w:r>
+        <w:rPr>
+          <w:rFonts w:ascii="Arial" w:hAnsi="Arial" w:eastAsia="Malgun Gothic" w:cs="Malgun Gothic"/>
+          <w:color w:val="000000"/>
+          <w:sz w:val="22"/>
+          <w:lang w:eastAsia="ko-KR"/>
+        </w:rPr>
+        <w:t xml:space="preserve">, </w:t>
+      </w:r>
+      <w:r>
+        <w:rPr>
+          <w:rFonts w:ascii="Menlo" w:hAnsi="Menlo" w:eastAsia="Menlo" w:cs="Menlo"/>
+          <w:color w:val="000000"/>
+          <w:sz w:val="21"/>
+          <w:lang w:eastAsia="ko-KR"/>
+        </w:rPr>
+        <w:t>archived</w:t>
+      </w:r>
+      <w:r>
+        <w:rPr>
+          <w:rFonts w:ascii="Arial" w:hAnsi="Arial" w:eastAsia="Malgun Gothic" w:cs="Malgun Gothic"/>
+          <w:color w:val="000000"/>
+          <w:sz w:val="22"/>
+          <w:lang w:eastAsia="ko-KR"/>
+        </w:rPr>
+        <w:t xml:space="preserve"> 필터를 traversal 이후가 아니라 조회 조건에 넣는다. edge는 </w:t>
+      </w:r>
+      <w:r>
+        <w:rPr>
+          <w:rFonts w:ascii="Arial" w:hAnsi="Arial" w:eastAsia="Malgun Gothic" w:cs="Malgun Gothic"/>
+          <w:b/>
+          <w:color w:val="000000"/>
+          <w:sz w:val="22"/>
+          <w:lang w:eastAsia="ko-KR"/>
+        </w:rPr>
+        <w:t>이번 페이지의 Node 사이만</w:t>
+      </w:r>
+      <w:r>
+        <w:rPr>
+          <w:rFonts w:ascii="Arial" w:hAnsi="Arial" w:eastAsia="Malgun Gothic" w:cs="Malgun Gothic"/>
+          <w:color w:val="000000"/>
+          <w:sz w:val="22"/>
+          <w:lang w:eastAsia="ko-KR"/>
+        </w:rPr>
+        <w:t xml:space="preserve"> 반환하므로 페이지를 넘나드는 edge는 보이지 않는다(화면은 첫 페이지만 사용한다). edge가 1,500개를 넘으면 </w:t>
+      </w:r>
+      <w:r>
+        <w:rPr>
+          <w:rFonts w:ascii="Menlo" w:hAnsi="Menlo" w:eastAsia="Menlo" w:cs="Menlo"/>
+          <w:color w:val="000000"/>
+          <w:sz w:val="21"/>
+          <w:lang w:eastAsia="ko-KR"/>
+        </w:rPr>
+        <w:t>truncated=true, MAX_EDGES</w:t>
+      </w:r>
+      <w:r>
+        <w:rPr>
+          <w:rFonts w:ascii="Arial" w:hAnsi="Arial" w:eastAsia="Malgun Gothic" w:cs="Malgun Gothic"/>
+          <w:color w:val="000000"/>
+          <w:sz w:val="22"/>
+          <w:lang w:eastAsia="ko-KR"/>
+        </w:rPr>
+        <w:t>.</w:t>
+      </w:r>
+    </w:p>
+    <w:p>
+      <w:pPr>
+        <w:pStyle w:val="ListBullet"/>
+      </w:pPr>
+      <w:r>
+        <w:rPr>
+          <w:rFonts w:ascii="Arial" w:hAnsi="Arial" w:eastAsia="Malgun Gothic" w:cs="Malgun Gothic"/>
+          <w:b/>
+          <w:color w:val="000000"/>
+          <w:sz w:val="22"/>
+          <w:lang w:eastAsia="ko-KR"/>
+        </w:rPr>
+        <w:t>제외/이월:</w:t>
+      </w:r>
+      <w:r>
+        <w:rPr>
+          <w:rFonts w:ascii="Arial" w:hAnsi="Arial" w:eastAsia="Malgun Gothic" w:cs="Malgun Gothic"/>
+          <w:color w:val="000000"/>
+          <w:sz w:val="22"/>
+          <w:lang w:eastAsia="ko-KR"/>
+        </w:rPr>
+        <w:t xml:space="preserve"> </w:t>
+      </w:r>
+      <w:r>
+        <w:rPr>
+          <w:rFonts w:ascii="Menlo" w:hAnsi="Menlo" w:eastAsia="Menlo" w:cs="Menlo"/>
+          <w:color w:val="000000"/>
+          <w:sz w:val="21"/>
+          <w:lang w:eastAsia="ko-KR"/>
+        </w:rPr>
+        <w:t>PUT /graph/layout</w:t>
+      </w:r>
+      <w:r>
+        <w:rPr>
+          <w:rFonts w:ascii="Arial" w:hAnsi="Arial" w:eastAsia="Malgun Gothic" w:cs="Malgun Gothic"/>
+          <w:color w:val="000000"/>
+          <w:sz w:val="22"/>
+          <w:lang w:eastAsia="ko-KR"/>
+        </w:rPr>
+        <w:t xml:space="preserve">과 </w:t>
+      </w:r>
+      <w:r>
+        <w:rPr>
+          <w:rFonts w:ascii="Menlo" w:hAnsi="Menlo" w:eastAsia="Menlo" w:cs="Menlo"/>
+          <w:color w:val="000000"/>
+          <w:sz w:val="21"/>
+          <w:lang w:eastAsia="ko-KR"/>
+        </w:rPr>
+        <w:t>layout_positions</w:t>
+      </w:r>
+      <w:r>
+        <w:rPr>
+          <w:rFonts w:ascii="Arial" w:hAnsi="Arial" w:eastAsia="Malgun Gothic" w:cs="Malgun Gothic"/>
+          <w:color w:val="000000"/>
+          <w:sz w:val="22"/>
+          <w:lang w:eastAsia="ko-KR"/>
+        </w:rPr>
+        <w:t xml:space="preserve"> 테이블(GRPH-06, SHOULD), Graph 필터의 Project scope(GRPH-04 — Project는 Phase 6), 사용자 정의 Relation(Growth).</w:t>
+      </w:r>
+    </w:p>
+    <w:p>
       <w:pPr>
         <w:pStyle w:val="Heading2"/>
         <w:keepNext/>

</xml_diff>

<commit_message>
feat(problem): Phase 6 Project / Error / Solution / Resource 구현
Backend: error_records/solution_records/projects/resources (V9), Error 해결 상태 머신(미해결 경고는 막지 않음),
Solution 생성과 SOLVED_BY를 한 트랜잭션으로 처리, Project 그래프, Resource URL 검증·정규화·중복 경고,
서브타입 공통 기반(SubtypeRecord, FieldRules, KeysetPaging, SubtypeListQueryService),
검색 확장(Error 메시지, Solution 본문, Project 설명), Library 범위 확장.
Frontend: Problems(체인 미리보기), Error/Solution 상세·폼, 체인 빌더, Project 목록·탭 상세·그래프,
Resource 화면(외부 링크 rel=noopener noreferrer), 대시보드 해결 안 된 오류.
Tests: 통합 테스트(상태 전이, 원자성, 정합성 SQL, 전체 workflow API 버전), UrlNormalizer 단위 테스트,
신규 계정으로 설계서 27.1의 1~13단계를 따라가는 Playwright E2E 포함 5개.
Fix: Project 수정 요청의 기본형 boolean 필드 생략 시 400, SecretScanner 접속 문자열 정규식 수량자 상한.
Docs: 설계서 v1.9 (서브타입 계약, 검색 확장, 구현 결과). refresh 응답 유실 문제는 Phase 7에서 함께 결정.

Co-Authored-By: Claude Sonnet 5.5 <noreply@anthropic.com>
</commit_message>
<xml_diff>
--- a/docs-word/06-API_명세서.docx
+++ b/docs-word/06-API_명세서.docx
@@ -15978,6 +15978,1980 @@
           <w:sz w:val="22"/>
           <w:lang w:eastAsia="ko-KR"/>
         </w:rPr>
+        <w:t>Phase 6 구현 범위와 세부 계약(v1.9 확정)</w:t>
+      </w:r>
+    </w:p>
+    <w:p>
+      <w:pPr>
+        <w:pStyle w:val="ListBullet"/>
+      </w:pPr>
+      <w:r>
+        <w:rPr>
+          <w:rFonts w:ascii="Arial" w:hAnsi="Arial" w:eastAsia="Malgun Gothic" w:cs="Malgun Gothic"/>
+          <w:b/>
+          <w:color w:val="000000"/>
+          <w:sz w:val="22"/>
+          <w:lang w:eastAsia="ko-KR"/>
+        </w:rPr>
+        <w:t>공통:</w:t>
+      </w:r>
+      <w:r>
+        <w:rPr>
+          <w:rFonts w:ascii="Arial" w:hAnsi="Arial" w:eastAsia="Malgun Gothic" w:cs="Malgun Gothic"/>
+          <w:color w:val="000000"/>
+          <w:sz w:val="22"/>
+          <w:lang w:eastAsia="ko-KR"/>
+        </w:rPr>
+        <w:t xml:space="preserve"> Error/Solution/Project/Resource는 </w:t>
+      </w:r>
+      <w:r>
+        <w:rPr>
+          <w:rFonts w:ascii="Menlo" w:hAnsi="Menlo" w:eastAsia="Menlo" w:cs="Menlo"/>
+          <w:color w:val="000000"/>
+          <w:sz w:val="21"/>
+          <w:lang w:eastAsia="ko-KR"/>
+        </w:rPr>
+        <w:t>knowledge_nodes</w:t>
+      </w:r>
+      <w:r>
+        <w:rPr>
+          <w:rFonts w:ascii="Arial" w:hAnsi="Arial" w:eastAsia="Malgun Gothic" w:cs="Malgun Gothic"/>
+          <w:color w:val="000000"/>
+          <w:sz w:val="22"/>
+          <w:lang w:eastAsia="ko-KR"/>
+        </w:rPr>
+        <w:t xml:space="preserve">의 1:1 subtype이다(V9). 제목·요약·태그·상태·즐겨찾기는 Node 공통 로직을 쓰며 </w:t>
+      </w:r>
+      <w:r>
+        <w:rPr>
+          <w:rFonts w:ascii="Arial" w:hAnsi="Arial" w:eastAsia="Malgun Gothic" w:cs="Malgun Gothic"/>
+          <w:b/>
+          <w:color w:val="000000"/>
+          <w:sz w:val="22"/>
+          <w:lang w:eastAsia="ko-KR"/>
+        </w:rPr>
+        <w:t>보관·휴지통·즐겨찾기는 `/nodes/{id}/...` 공통 endpoint</w:t>
+      </w:r>
+      <w:r>
+        <w:rPr>
+          <w:rFonts w:ascii="Arial" w:hAnsi="Arial" w:eastAsia="Malgun Gothic" w:cs="Malgun Gothic"/>
+          <w:color w:val="000000"/>
+          <w:sz w:val="22"/>
+          <w:lang w:eastAsia="ko-KR"/>
+        </w:rPr>
+        <w:t xml:space="preserve">다. 각 타입의 </w:t>
+      </w:r>
+      <w:r>
+        <w:rPr>
+          <w:rFonts w:ascii="Menlo" w:hAnsi="Menlo" w:eastAsia="Menlo" w:cs="Menlo"/>
+          <w:color w:val="000000"/>
+          <w:sz w:val="21"/>
+          <w:lang w:eastAsia="ko-KR"/>
+        </w:rPr>
+        <w:t>PATCH</w:t>
+      </w:r>
+      <w:r>
+        <w:rPr>
+          <w:rFonts w:ascii="Arial" w:hAnsi="Arial" w:eastAsia="Malgun Gothic" w:cs="Malgun Gothic"/>
+          <w:color w:val="000000"/>
+          <w:sz w:val="22"/>
+          <w:lang w:eastAsia="ko-KR"/>
+        </w:rPr>
+        <w:t xml:space="preserve">는 </w:t>
+      </w:r>
+      <w:r>
+        <w:rPr>
+          <w:rFonts w:ascii="Menlo" w:hAnsi="Menlo" w:eastAsia="Menlo" w:cs="Menlo"/>
+          <w:color w:val="000000"/>
+          <w:sz w:val="21"/>
+          <w:lang w:eastAsia="ko-KR"/>
+        </w:rPr>
+        <w:t>version</w:t>
+      </w:r>
+      <w:r>
+        <w:rPr>
+          <w:rFonts w:ascii="Arial" w:hAnsi="Arial" w:eastAsia="Malgun Gothic" w:cs="Malgun Gothic"/>
+          <w:color w:val="000000"/>
+          <w:sz w:val="22"/>
+          <w:lang w:eastAsia="ko-KR"/>
+        </w:rPr>
+        <w:t xml:space="preserve">(낙관적 락)을 요구하고, </w:t>
+      </w:r>
+      <w:r>
+        <w:rPr>
+          <w:rFonts w:ascii="Menlo" w:hAnsi="Menlo" w:eastAsia="Menlo" w:cs="Menlo"/>
+          <w:color w:val="000000"/>
+          <w:sz w:val="21"/>
+          <w:lang w:eastAsia="ko-KR"/>
+        </w:rPr>
+        <w:t>null</w:t>
+      </w:r>
+      <w:r>
+        <w:rPr>
+          <w:rFonts w:ascii="Arial" w:hAnsi="Arial" w:eastAsia="Malgun Gothic" w:cs="Malgun Gothic"/>
+          <w:color w:val="000000"/>
+          <w:sz w:val="22"/>
+          <w:lang w:eastAsia="ko-KR"/>
+        </w:rPr>
+        <w:t xml:space="preserve">/생략은 변경 없음, 선택 텍스트의 빈 문자열은 지움이며, 바뀐 것이 없으면 </w:t>
+      </w:r>
+      <w:r>
+        <w:rPr>
+          <w:rFonts w:ascii="Menlo" w:hAnsi="Menlo" w:eastAsia="Menlo" w:cs="Menlo"/>
+          <w:color w:val="000000"/>
+          <w:sz w:val="21"/>
+          <w:lang w:eastAsia="ko-KR"/>
+        </w:rPr>
+        <w:t>version</w:t>
+      </w:r>
+      <w:r>
+        <w:rPr>
+          <w:rFonts w:ascii="Arial" w:hAnsi="Arial" w:eastAsia="Malgun Gothic" w:cs="Malgun Gothic"/>
+          <w:color w:val="000000"/>
+          <w:sz w:val="22"/>
+          <w:lang w:eastAsia="ko-KR"/>
+        </w:rPr>
+        <w:t xml:space="preserve">을 올리지 않는다. Node 공통 </w:t>
+      </w:r>
+      <w:r>
+        <w:rPr>
+          <w:rFonts w:ascii="Menlo" w:hAnsi="Menlo" w:eastAsia="Menlo" w:cs="Menlo"/>
+          <w:color w:val="000000"/>
+          <w:sz w:val="21"/>
+          <w:lang w:eastAsia="ko-KR"/>
+        </w:rPr>
+        <w:t>PATCH /nodes/{id}</w:t>
+      </w:r>
+      <w:r>
+        <w:rPr>
+          <w:rFonts w:ascii="Arial" w:hAnsi="Arial" w:eastAsia="Malgun Gothic" w:cs="Malgun Gothic"/>
+          <w:color w:val="000000"/>
+          <w:sz w:val="22"/>
+          <w:lang w:eastAsia="ko-KR"/>
+        </w:rPr>
+        <w:t xml:space="preserve">로 subtype 데이터를 바꾸려 하면 </w:t>
+      </w:r>
+      <w:r>
+        <w:rPr>
+          <w:rFonts w:ascii="Menlo" w:hAnsi="Menlo" w:eastAsia="Menlo" w:cs="Menlo"/>
+          <w:color w:val="000000"/>
+          <w:sz w:val="21"/>
+          <w:lang w:eastAsia="ko-KR"/>
+        </w:rPr>
+        <w:t>400 USE_SUBTYPE_API</w:t>
+      </w:r>
+      <w:r>
+        <w:rPr>
+          <w:rFonts w:ascii="Arial" w:hAnsi="Arial" w:eastAsia="Malgun Gothic" w:cs="Malgun Gothic"/>
+          <w:color w:val="000000"/>
+          <w:sz w:val="22"/>
+          <w:lang w:eastAsia="ko-KR"/>
+        </w:rPr>
+        <w:t xml:space="preserve">, </w:t>
+      </w:r>
+      <w:r>
+        <w:rPr>
+          <w:rFonts w:ascii="Menlo" w:hAnsi="Menlo" w:eastAsia="Menlo" w:cs="Menlo"/>
+          <w:color w:val="000000"/>
+          <w:sz w:val="21"/>
+          <w:lang w:eastAsia="ko-KR"/>
+        </w:rPr>
+        <w:t>POST /nodes</w:t>
+      </w:r>
+      <w:r>
+        <w:rPr>
+          <w:rFonts w:ascii="Arial" w:hAnsi="Arial" w:eastAsia="Malgun Gothic" w:cs="Malgun Gothic"/>
+          <w:color w:val="000000"/>
+          <w:sz w:val="22"/>
+          <w:lang w:eastAsia="ko-KR"/>
+        </w:rPr>
+        <w:t xml:space="preserve">로 만들려 하면 </w:t>
+      </w:r>
+      <w:r>
+        <w:rPr>
+          <w:rFonts w:ascii="Menlo" w:hAnsi="Menlo" w:eastAsia="Menlo" w:cs="Menlo"/>
+          <w:color w:val="000000"/>
+          <w:sz w:val="21"/>
+          <w:lang w:eastAsia="ko-KR"/>
+        </w:rPr>
+        <w:t>400 UNSUPPORTED_TYPE</w:t>
+      </w:r>
+      <w:r>
+        <w:rPr>
+          <w:rFonts w:ascii="Arial" w:hAnsi="Arial" w:eastAsia="Malgun Gothic" w:cs="Malgun Gothic"/>
+          <w:color w:val="000000"/>
+          <w:sz w:val="22"/>
+          <w:lang w:eastAsia="ko-KR"/>
+        </w:rPr>
+        <w:t xml:space="preserve">이다. 다른 타입의 id를 열면 </w:t>
+      </w:r>
+      <w:r>
+        <w:rPr>
+          <w:rFonts w:ascii="Menlo" w:hAnsi="Menlo" w:eastAsia="Menlo" w:cs="Menlo"/>
+          <w:color w:val="000000"/>
+          <w:sz w:val="21"/>
+          <w:lang w:eastAsia="ko-KR"/>
+        </w:rPr>
+        <w:t>404</w:t>
+      </w:r>
+      <w:r>
+        <w:rPr>
+          <w:rFonts w:ascii="Arial" w:hAnsi="Arial" w:eastAsia="Malgun Gothic" w:cs="Malgun Gothic"/>
+          <w:color w:val="000000"/>
+          <w:sz w:val="22"/>
+          <w:lang w:eastAsia="ko-KR"/>
+        </w:rPr>
+        <w:t xml:space="preserve">, 다른 Workspace의 id도 </w:t>
+      </w:r>
+      <w:r>
+        <w:rPr>
+          <w:rFonts w:ascii="Menlo" w:hAnsi="Menlo" w:eastAsia="Menlo" w:cs="Menlo"/>
+          <w:color w:val="000000"/>
+          <w:sz w:val="21"/>
+          <w:lang w:eastAsia="ko-KR"/>
+        </w:rPr>
+        <w:t>404</w:t>
+      </w:r>
+      <w:r>
+        <w:rPr>
+          <w:rFonts w:ascii="Arial" w:hAnsi="Arial" w:eastAsia="Malgun Gothic" w:cs="Malgun Gothic"/>
+          <w:color w:val="000000"/>
+          <w:sz w:val="22"/>
+          <w:lang w:eastAsia="ko-KR"/>
+        </w:rPr>
+        <w:t xml:space="preserve">다. 목록은 </w:t>
+      </w:r>
+      <w:r>
+        <w:rPr>
+          <w:rFonts w:ascii="Menlo" w:hAnsi="Menlo" w:eastAsia="Menlo" w:cs="Menlo"/>
+          <w:color w:val="000000"/>
+          <w:sz w:val="21"/>
+          <w:lang w:eastAsia="ko-KR"/>
+        </w:rPr>
+        <w:t>status</w:t>
+      </w:r>
+      <w:r>
+        <w:rPr>
+          <w:rFonts w:ascii="Arial" w:hAnsi="Arial" w:eastAsia="Malgun Gothic" w:cs="Malgun Gothic"/>
+          <w:color w:val="000000"/>
+          <w:sz w:val="22"/>
+          <w:lang w:eastAsia="ko-KR"/>
+        </w:rPr>
+        <w:t xml:space="preserve">(Node 보관 상태, 기본 </w:t>
+      </w:r>
+      <w:r>
+        <w:rPr>
+          <w:rFonts w:ascii="Menlo" w:hAnsi="Menlo" w:eastAsia="Menlo" w:cs="Menlo"/>
+          <w:color w:val="000000"/>
+          <w:sz w:val="21"/>
+          <w:lang w:eastAsia="ko-KR"/>
+        </w:rPr>
+        <w:t>ACTIVE</w:t>
+      </w:r>
+      <w:r>
+        <w:rPr>
+          <w:rFonts w:ascii="Arial" w:hAnsi="Arial" w:eastAsia="Malgun Gothic" w:cs="Malgun Gothic"/>
+          <w:color w:val="000000"/>
+          <w:sz w:val="22"/>
+          <w:lang w:eastAsia="ko-KR"/>
+        </w:rPr>
+        <w:t xml:space="preserve">)와 cursor를 </w:t>
+      </w:r>
+      <w:r>
+        <w:rPr>
+          <w:rFonts w:ascii="Menlo" w:hAnsi="Menlo" w:eastAsia="Menlo" w:cs="Menlo"/>
+          <w:color w:val="000000"/>
+          <w:sz w:val="21"/>
+          <w:lang w:eastAsia="ko-KR"/>
+        </w:rPr>
+        <w:t>GET /nodes</w:t>
+      </w:r>
+      <w:r>
+        <w:rPr>
+          <w:rFonts w:ascii="Arial" w:hAnsi="Arial" w:eastAsia="Malgun Gothic" w:cs="Malgun Gothic"/>
+          <w:color w:val="000000"/>
+          <w:sz w:val="22"/>
+          <w:lang w:eastAsia="ko-KR"/>
+        </w:rPr>
+        <w:t xml:space="preserve">와 같은 규약으로 쓴다. </w:t>
+      </w:r>
+      <w:r>
+        <w:rPr>
+          <w:rFonts w:ascii="Arial" w:hAnsi="Arial" w:eastAsia="Malgun Gothic" w:cs="Malgun Gothic"/>
+          <w:b/>
+          <w:color w:val="000000"/>
+          <w:sz w:val="22"/>
+          <w:lang w:eastAsia="ko-KR"/>
+        </w:rPr>
+        <w:t>Library(`GET /nodes`)는 Concept·Note·Error·Solution·Resource를 보여 주고 Snippet과 Project는 제외한다</w:t>
+      </w:r>
+      <w:r>
+        <w:rPr>
+          <w:rFonts w:ascii="Arial" w:hAnsi="Arial" w:eastAsia="Malgun Gothic" w:cs="Malgun Gothic"/>
+          <w:color w:val="000000"/>
+          <w:sz w:val="22"/>
+          <w:lang w:eastAsia="ko-KR"/>
+        </w:rPr>
+        <w:t>(각자의 작업 공간).</w:t>
+      </w:r>
+    </w:p>
+    <w:p>
+      <w:pPr>
+        <w:pStyle w:val="ListBullet"/>
+      </w:pPr>
+      <w:r>
+        <w:rPr>
+          <w:rFonts w:ascii="Arial" w:hAnsi="Arial" w:eastAsia="Malgun Gothic" w:cs="Malgun Gothic"/>
+          <w:b/>
+          <w:color w:val="000000"/>
+          <w:sz w:val="22"/>
+          <w:lang w:eastAsia="ko-KR"/>
+        </w:rPr>
+        <w:t>Error (`/errors`):</w:t>
+      </w:r>
+      <w:r>
+        <w:rPr>
+          <w:rFonts w:ascii="Arial" w:hAnsi="Arial" w:eastAsia="Malgun Gothic" w:cs="Malgun Gothic"/>
+          <w:color w:val="000000"/>
+          <w:sz w:val="22"/>
+          <w:lang w:eastAsia="ko-KR"/>
+        </w:rPr>
+        <w:t xml:space="preserve"> </w:t>
+      </w:r>
+      <w:r>
+        <w:rPr>
+          <w:rFonts w:ascii="Menlo" w:hAnsi="Menlo" w:eastAsia="Menlo" w:cs="Menlo"/>
+          <w:color w:val="000000"/>
+          <w:sz w:val="21"/>
+          <w:lang w:eastAsia="ko-KR"/>
+        </w:rPr>
+        <w:t>errorMessage</w:t>
+      </w:r>
+      <w:r>
+        <w:rPr>
+          <w:rFonts w:ascii="Arial" w:hAnsi="Arial" w:eastAsia="Malgun Gothic" w:cs="Malgun Gothic"/>
+          <w:color w:val="000000"/>
+          <w:sz w:val="22"/>
+          <w:lang w:eastAsia="ko-KR"/>
+        </w:rPr>
+        <w:t xml:space="preserve">(필수, 최대 100,000바이트 — 스택 트레이스 용도), </w:t>
+      </w:r>
+      <w:r>
+        <w:rPr>
+          <w:rFonts w:ascii="Menlo" w:hAnsi="Menlo" w:eastAsia="Menlo" w:cs="Menlo"/>
+          <w:color w:val="000000"/>
+          <w:sz w:val="21"/>
+          <w:lang w:eastAsia="ko-KR"/>
+        </w:rPr>
+        <w:t>environment</w:t>
+      </w:r>
+      <w:r>
+        <w:rPr>
+          <w:rFonts w:ascii="Arial" w:hAnsi="Arial" w:eastAsia="Malgun Gothic" w:cs="Malgun Gothic"/>
+          <w:color w:val="000000"/>
+          <w:sz w:val="22"/>
+          <w:lang w:eastAsia="ko-KR"/>
+        </w:rPr>
+        <w:t xml:space="preserve">(≤500), </w:t>
+      </w:r>
+      <w:r>
+        <w:rPr>
+          <w:rFonts w:ascii="Menlo" w:hAnsi="Menlo" w:eastAsia="Menlo" w:cs="Menlo"/>
+          <w:color w:val="000000"/>
+          <w:sz w:val="21"/>
+          <w:lang w:eastAsia="ko-KR"/>
+        </w:rPr>
+        <w:t>reproductionStepsMd</w:t>
+      </w:r>
+      <w:r>
+        <w:rPr>
+          <w:rFonts w:ascii="Arial" w:hAnsi="Arial" w:eastAsia="Malgun Gothic" w:cs="Malgun Gothic"/>
+          <w:color w:val="000000"/>
+          <w:sz w:val="22"/>
+          <w:lang w:eastAsia="ko-KR"/>
+        </w:rPr>
+        <w:t>·</w:t>
+      </w:r>
+      <w:r>
+        <w:rPr>
+          <w:rFonts w:ascii="Menlo" w:hAnsi="Menlo" w:eastAsia="Menlo" w:cs="Menlo"/>
+          <w:color w:val="000000"/>
+          <w:sz w:val="21"/>
+          <w:lang w:eastAsia="ko-KR"/>
+        </w:rPr>
+        <w:t>causeHypothesisMd</w:t>
+      </w:r>
+      <w:r>
+        <w:rPr>
+          <w:rFonts w:ascii="Arial" w:hAnsi="Arial" w:eastAsia="Malgun Gothic" w:cs="Malgun Gothic"/>
+          <w:color w:val="000000"/>
+          <w:sz w:val="22"/>
+          <w:lang w:eastAsia="ko-KR"/>
+        </w:rPr>
+        <w:t xml:space="preserve">(각 ≤100,000바이트), </w:t>
+      </w:r>
+      <w:r>
+        <w:rPr>
+          <w:rFonts w:ascii="Menlo" w:hAnsi="Menlo" w:eastAsia="Menlo" w:cs="Menlo"/>
+          <w:color w:val="000000"/>
+          <w:sz w:val="21"/>
+          <w:lang w:eastAsia="ko-KR"/>
+        </w:rPr>
+        <w:t>occurredAt</w:t>
+      </w:r>
+      <w:r>
+        <w:rPr>
+          <w:rFonts w:ascii="Arial" w:hAnsi="Arial" w:eastAsia="Malgun Gothic" w:cs="Malgun Gothic"/>
+          <w:color w:val="000000"/>
+          <w:sz w:val="22"/>
+          <w:lang w:eastAsia="ko-KR"/>
+        </w:rPr>
+        <w:t xml:space="preserve">(생략하면 지금). 크기 초과는 </w:t>
+      </w:r>
+      <w:r>
+        <w:rPr>
+          <w:rFonts w:ascii="Menlo" w:hAnsi="Menlo" w:eastAsia="Menlo" w:cs="Menlo"/>
+          <w:color w:val="000000"/>
+          <w:sz w:val="21"/>
+          <w:lang w:eastAsia="ko-KR"/>
+        </w:rPr>
+        <w:t>413 PAYLOAD_TOO_LARGE</w:t>
+      </w:r>
+      <w:r>
+        <w:rPr>
+          <w:rFonts w:ascii="Arial" w:hAnsi="Arial" w:eastAsia="Malgun Gothic" w:cs="Malgun Gothic"/>
+          <w:color w:val="000000"/>
+          <w:sz w:val="22"/>
+          <w:lang w:eastAsia="ko-KR"/>
+        </w:rPr>
+        <w:t xml:space="preserve">, 공백뿐인 메시지·NUL 문자는 </w:t>
+      </w:r>
+      <w:r>
+        <w:rPr>
+          <w:rFonts w:ascii="Menlo" w:hAnsi="Menlo" w:eastAsia="Menlo" w:cs="Menlo"/>
+          <w:color w:val="000000"/>
+          <w:sz w:val="21"/>
+          <w:lang w:eastAsia="ko-KR"/>
+        </w:rPr>
+        <w:t>400</w:t>
+      </w:r>
+      <w:r>
+        <w:rPr>
+          <w:rFonts w:ascii="Arial" w:hAnsi="Arial" w:eastAsia="Malgun Gothic" w:cs="Malgun Gothic"/>
+          <w:color w:val="000000"/>
+          <w:sz w:val="22"/>
+          <w:lang w:eastAsia="ko-KR"/>
+        </w:rPr>
+        <w:t xml:space="preserve">. 응답은 </w:t>
+      </w:r>
+      <w:r>
+        <w:rPr>
+          <w:rFonts w:ascii="Menlo" w:hAnsi="Menlo" w:eastAsia="Menlo" w:cs="Menlo"/>
+          <w:color w:val="000000"/>
+          <w:sz w:val="21"/>
+          <w:lang w:eastAsia="ko-KR"/>
+        </w:rPr>
+        <w:t>{공통 Node 필드, error{…resolutionStatus, occurredAt, resolvedAt}, relations, warnings[]}</w:t>
+      </w:r>
+      <w:r>
+        <w:rPr>
+          <w:rFonts w:ascii="Arial" w:hAnsi="Arial" w:eastAsia="Malgun Gothic" w:cs="Malgun Gothic"/>
+          <w:color w:val="000000"/>
+          <w:sz w:val="22"/>
+          <w:lang w:eastAsia="ko-KR"/>
+        </w:rPr>
+        <w:t xml:space="preserve">. 목록 필터 </w:t>
+      </w:r>
+      <w:r>
+        <w:rPr>
+          <w:rFonts w:ascii="Menlo" w:hAnsi="Menlo" w:eastAsia="Menlo" w:cs="Menlo"/>
+          <w:color w:val="000000"/>
+          <w:sz w:val="21"/>
+          <w:lang w:eastAsia="ko-KR"/>
+        </w:rPr>
+        <w:t>resolution</w:t>
+      </w:r>
+      <w:r>
+        <w:rPr>
+          <w:rFonts w:ascii="Arial" w:hAnsi="Arial" w:eastAsia="Malgun Gothic" w:cs="Malgun Gothic"/>
+          <w:color w:val="000000"/>
+          <w:sz w:val="22"/>
+          <w:lang w:eastAsia="ko-KR"/>
+        </w:rPr>
+        <w:t xml:space="preserve">(콤마 목록), </w:t>
+      </w:r>
+      <w:r>
+        <w:rPr>
+          <w:rFonts w:ascii="Menlo" w:hAnsi="Menlo" w:eastAsia="Menlo" w:cs="Menlo"/>
+          <w:color w:val="000000"/>
+          <w:sz w:val="21"/>
+          <w:lang w:eastAsia="ko-KR"/>
+        </w:rPr>
+        <w:t>projectId</w:t>
+      </w:r>
+      <w:r>
+        <w:rPr>
+          <w:rFonts w:ascii="Arial" w:hAnsi="Arial" w:eastAsia="Malgun Gothic" w:cs="Malgun Gothic"/>
+          <w:color w:val="000000"/>
+          <w:sz w:val="22"/>
+          <w:lang w:eastAsia="ko-KR"/>
+        </w:rPr>
+        <w:t>(</w:t>
+      </w:r>
+      <w:r>
+        <w:rPr>
+          <w:rFonts w:ascii="Menlo" w:hAnsi="Menlo" w:eastAsia="Menlo" w:cs="Menlo"/>
+          <w:color w:val="000000"/>
+          <w:sz w:val="21"/>
+          <w:lang w:eastAsia="ko-KR"/>
+        </w:rPr>
+        <w:t>OCCURRED_IN</w:t>
+      </w:r>
+      <w:r>
+        <w:rPr>
+          <w:rFonts w:ascii="Arial" w:hAnsi="Arial" w:eastAsia="Malgun Gothic" w:cs="Malgun Gothic"/>
+          <w:color w:val="000000"/>
+          <w:sz w:val="22"/>
+          <w:lang w:eastAsia="ko-KR"/>
+        </w:rPr>
+        <w:t xml:space="preserve">), </w:t>
+      </w:r>
+      <w:r>
+        <w:rPr>
+          <w:rFonts w:ascii="Menlo" w:hAnsi="Menlo" w:eastAsia="Menlo" w:cs="Menlo"/>
+          <w:color w:val="000000"/>
+          <w:sz w:val="21"/>
+          <w:lang w:eastAsia="ko-KR"/>
+        </w:rPr>
+        <w:t>tagId</w:t>
+      </w:r>
+      <w:r>
+        <w:rPr>
+          <w:rFonts w:ascii="Arial" w:hAnsi="Arial" w:eastAsia="Malgun Gothic" w:cs="Malgun Gothic"/>
+          <w:color w:val="000000"/>
+          <w:sz w:val="22"/>
+          <w:lang w:eastAsia="ko-KR"/>
+        </w:rPr>
+        <w:t xml:space="preserve">이며 항목마다 체인 미리보기 </w:t>
+      </w:r>
+      <w:r>
+        <w:rPr>
+          <w:rFonts w:ascii="Menlo" w:hAnsi="Menlo" w:eastAsia="Menlo" w:cs="Menlo"/>
+          <w:color w:val="000000"/>
+          <w:sz w:val="21"/>
+          <w:lang w:eastAsia="ko-KR"/>
+        </w:rPr>
+        <w:t>solutionCount</w:t>
+      </w:r>
+      <w:r>
+        <w:rPr>
+          <w:rFonts w:ascii="Arial" w:hAnsi="Arial" w:eastAsia="Malgun Gothic" w:cs="Malgun Gothic"/>
+          <w:color w:val="000000"/>
+          <w:sz w:val="22"/>
+          <w:lang w:eastAsia="ko-KR"/>
+        </w:rPr>
+        <w:t>·</w:t>
+      </w:r>
+      <w:r>
+        <w:rPr>
+          <w:rFonts w:ascii="Menlo" w:hAnsi="Menlo" w:eastAsia="Menlo" w:cs="Menlo"/>
+          <w:color w:val="000000"/>
+          <w:sz w:val="21"/>
+          <w:lang w:eastAsia="ko-KR"/>
+        </w:rPr>
+        <w:t>projectCount</w:t>
+      </w:r>
+      <w:r>
+        <w:rPr>
+          <w:rFonts w:ascii="Arial" w:hAnsi="Arial" w:eastAsia="Malgun Gothic" w:cs="Malgun Gothic"/>
+          <w:color w:val="000000"/>
+          <w:sz w:val="22"/>
+          <w:lang w:eastAsia="ko-KR"/>
+        </w:rPr>
+        <w:t>와 메시지 앞 200자를 준다.</w:t>
+      </w:r>
+    </w:p>
+    <w:p>
+      <w:pPr>
+        <w:pStyle w:val="ListBullet"/>
+      </w:pPr>
+      <w:r>
+        <w:rPr>
+          <w:rFonts w:ascii="Arial" w:hAnsi="Arial" w:eastAsia="Malgun Gothic" w:cs="Malgun Gothic"/>
+          <w:b/>
+          <w:color w:val="000000"/>
+          <w:sz w:val="22"/>
+          <w:lang w:eastAsia="ko-KR"/>
+        </w:rPr>
+        <w:t>Error 상태 전환 (`PATCH /errors/{id}/status {version, status, resolvedAt?}`):</w:t>
+      </w:r>
+      <w:r>
+        <w:rPr>
+          <w:rFonts w:ascii="Arial" w:hAnsi="Arial" w:eastAsia="Malgun Gothic" w:cs="Malgun Gothic"/>
+          <w:color w:val="000000"/>
+          <w:sz w:val="22"/>
+          <w:lang w:eastAsia="ko-KR"/>
+        </w:rPr>
+        <w:t xml:space="preserve"> 허용 전이는 </w:t>
+      </w:r>
+      <w:r>
+        <w:rPr>
+          <w:rFonts w:ascii="Menlo" w:hAnsi="Menlo" w:eastAsia="Menlo" w:cs="Menlo"/>
+          <w:color w:val="000000"/>
+          <w:sz w:val="21"/>
+          <w:lang w:eastAsia="ko-KR"/>
+        </w:rPr>
+        <w:t>OPEN → INVESTIGATING|RESOLVED|WONT_FIX</w:t>
+      </w:r>
+      <w:r>
+        <w:rPr>
+          <w:rFonts w:ascii="Arial" w:hAnsi="Arial" w:eastAsia="Malgun Gothic" w:cs="Malgun Gothic"/>
+          <w:color w:val="000000"/>
+          <w:sz w:val="22"/>
+          <w:lang w:eastAsia="ko-KR"/>
+        </w:rPr>
+        <w:t xml:space="preserve">, </w:t>
+      </w:r>
+      <w:r>
+        <w:rPr>
+          <w:rFonts w:ascii="Menlo" w:hAnsi="Menlo" w:eastAsia="Menlo" w:cs="Menlo"/>
+          <w:color w:val="000000"/>
+          <w:sz w:val="21"/>
+          <w:lang w:eastAsia="ko-KR"/>
+        </w:rPr>
+        <w:t>INVESTIGATING → OPEN|RESOLVED|WONT_FIX</w:t>
+      </w:r>
+      <w:r>
+        <w:rPr>
+          <w:rFonts w:ascii="Arial" w:hAnsi="Arial" w:eastAsia="Malgun Gothic" w:cs="Malgun Gothic"/>
+          <w:color w:val="000000"/>
+          <w:sz w:val="22"/>
+          <w:lang w:eastAsia="ko-KR"/>
+        </w:rPr>
+        <w:t xml:space="preserve">, </w:t>
+      </w:r>
+      <w:r>
+        <w:rPr>
+          <w:rFonts w:ascii="Menlo" w:hAnsi="Menlo" w:eastAsia="Menlo" w:cs="Menlo"/>
+          <w:color w:val="000000"/>
+          <w:sz w:val="21"/>
+          <w:lang w:eastAsia="ko-KR"/>
+        </w:rPr>
+        <w:t>RESOLVED|WONT_FIX → OPEN</w:t>
+      </w:r>
+      <w:r>
+        <w:rPr>
+          <w:rFonts w:ascii="Arial" w:hAnsi="Arial" w:eastAsia="Malgun Gothic" w:cs="Malgun Gothic"/>
+          <w:color w:val="000000"/>
+          <w:sz w:val="22"/>
+          <w:lang w:eastAsia="ko-KR"/>
+        </w:rPr>
+        <w:t xml:space="preserve">(재오픈)뿐이다. 종료 상태끼리는 바로 오갈 수 없으며 </w:t>
+      </w:r>
+      <w:r>
+        <w:rPr>
+          <w:rFonts w:ascii="Menlo" w:hAnsi="Menlo" w:eastAsia="Menlo" w:cs="Menlo"/>
+          <w:color w:val="000000"/>
+          <w:sz w:val="21"/>
+          <w:lang w:eastAsia="ko-KR"/>
+        </w:rPr>
+        <w:t>409 INVALID_STATUS_TRANSITION</w:t>
+      </w:r>
+      <w:r>
+        <w:rPr>
+          <w:rFonts w:ascii="Arial" w:hAnsi="Arial" w:eastAsia="Malgun Gothic" w:cs="Malgun Gothic"/>
+          <w:color w:val="000000"/>
+          <w:sz w:val="22"/>
+          <w:lang w:eastAsia="ko-KR"/>
+        </w:rPr>
+        <w:t xml:space="preserve">. 같은 상태로의 요청은 아무것도 바꾸지 않는다. </w:t>
+      </w:r>
+      <w:r>
+        <w:rPr>
+          <w:rFonts w:ascii="Menlo" w:hAnsi="Menlo" w:eastAsia="Menlo" w:cs="Menlo"/>
+          <w:color w:val="000000"/>
+          <w:sz w:val="21"/>
+          <w:lang w:eastAsia="ko-KR"/>
+        </w:rPr>
+        <w:t>resolvedAt</w:t>
+      </w:r>
+      <w:r>
+        <w:rPr>
+          <w:rFonts w:ascii="Arial" w:hAnsi="Arial" w:eastAsia="Malgun Gothic" w:cs="Malgun Gothic"/>
+          <w:color w:val="000000"/>
+          <w:sz w:val="22"/>
+          <w:lang w:eastAsia="ko-KR"/>
+        </w:rPr>
+        <w:t xml:space="preserve">은 </w:t>
+      </w:r>
+      <w:r>
+        <w:rPr>
+          <w:rFonts w:ascii="Menlo" w:hAnsi="Menlo" w:eastAsia="Menlo" w:cs="Menlo"/>
+          <w:color w:val="000000"/>
+          <w:sz w:val="21"/>
+          <w:lang w:eastAsia="ko-KR"/>
+        </w:rPr>
+        <w:t>RESOLVED</w:t>
+      </w:r>
+      <w:r>
+        <w:rPr>
+          <w:rFonts w:ascii="Arial" w:hAnsi="Arial" w:eastAsia="Malgun Gothic" w:cs="Malgun Gothic"/>
+          <w:color w:val="000000"/>
+          <w:sz w:val="22"/>
+          <w:lang w:eastAsia="ko-KR"/>
+        </w:rPr>
+        <w:t>일 때만 의미가 있고(다른 상태에서는 무시·</w:t>
+      </w:r>
+      <w:r>
+        <w:rPr>
+          <w:rFonts w:ascii="Menlo" w:hAnsi="Menlo" w:eastAsia="Menlo" w:cs="Menlo"/>
+          <w:color w:val="000000"/>
+          <w:sz w:val="21"/>
+          <w:lang w:eastAsia="ko-KR"/>
+        </w:rPr>
+        <w:t>null</w:t>
+      </w:r>
+      <w:r>
+        <w:rPr>
+          <w:rFonts w:ascii="Arial" w:hAnsi="Arial" w:eastAsia="Malgun Gothic" w:cs="Malgun Gothic"/>
+          <w:color w:val="000000"/>
+          <w:sz w:val="22"/>
+          <w:lang w:eastAsia="ko-KR"/>
+        </w:rPr>
+        <w:t xml:space="preserve">로 정리, DB CHECK </w:t>
+      </w:r>
+      <w:r>
+        <w:rPr>
+          <w:rFonts w:ascii="Menlo" w:hAnsi="Menlo" w:eastAsia="Menlo" w:cs="Menlo"/>
+          <w:color w:val="000000"/>
+          <w:sz w:val="21"/>
+          <w:lang w:eastAsia="ko-KR"/>
+        </w:rPr>
+        <w:t>ck_error_records__resolved_at</w:t>
+      </w:r>
+      <w:r>
+        <w:rPr>
+          <w:rFonts w:ascii="Arial" w:hAnsi="Arial" w:eastAsia="Malgun Gothic" w:cs="Malgun Gothic"/>
+          <w:color w:val="000000"/>
+          <w:sz w:val="22"/>
+          <w:lang w:eastAsia="ko-KR"/>
+        </w:rPr>
+        <w:t xml:space="preserve">이 같은 불변식을 강제) 생략하면 지금이며 발생 시각보다 이르면 </w:t>
+      </w:r>
+      <w:r>
+        <w:rPr>
+          <w:rFonts w:ascii="Menlo" w:hAnsi="Menlo" w:eastAsia="Menlo" w:cs="Menlo"/>
+          <w:color w:val="000000"/>
+          <w:sz w:val="21"/>
+          <w:lang w:eastAsia="ko-KR"/>
+        </w:rPr>
+        <w:t>400 BEFORE_OCCURRED_AT</w:t>
+      </w:r>
+      <w:r>
+        <w:rPr>
+          <w:rFonts w:ascii="Arial" w:hAnsi="Arial" w:eastAsia="Malgun Gothic" w:cs="Malgun Gothic"/>
+          <w:color w:val="000000"/>
+          <w:sz w:val="22"/>
+          <w:lang w:eastAsia="ko-KR"/>
+        </w:rPr>
+        <w:t xml:space="preserve">. 휴지통 Error는 </w:t>
+      </w:r>
+      <w:r>
+        <w:rPr>
+          <w:rFonts w:ascii="Menlo" w:hAnsi="Menlo" w:eastAsia="Menlo" w:cs="Menlo"/>
+          <w:color w:val="000000"/>
+          <w:sz w:val="21"/>
+          <w:lang w:eastAsia="ko-KR"/>
+        </w:rPr>
+        <w:t>409 INVALID_NODE_STATE</w:t>
+      </w:r>
+      <w:r>
+        <w:rPr>
+          <w:rFonts w:ascii="Arial" w:hAnsi="Arial" w:eastAsia="Malgun Gothic" w:cs="Malgun Gothic"/>
+          <w:color w:val="000000"/>
+          <w:sz w:val="22"/>
+          <w:lang w:eastAsia="ko-KR"/>
+        </w:rPr>
+        <w:t xml:space="preserve">. </w:t>
+      </w:r>
+      <w:r>
+        <w:rPr>
+          <w:rFonts w:ascii="Arial" w:hAnsi="Arial" w:eastAsia="Malgun Gothic" w:cs="Malgun Gothic"/>
+          <w:b/>
+          <w:color w:val="000000"/>
+          <w:sz w:val="22"/>
+          <w:lang w:eastAsia="ko-KR"/>
+        </w:rPr>
+        <w:t>`RESOLVED`로 바꿀 때 Solution(`SOLVED_BY` 나가는 관계)이 없으면 저장은 하되 응답과 이후 조회에 `warnings:["NO_SOLUTION_LINKED"]`를 싣는다</w:t>
+      </w:r>
+      <w:r>
+        <w:rPr>
+          <w:rFonts w:ascii="Arial" w:hAnsi="Arial" w:eastAsia="Malgun Gothic" w:cs="Malgun Gothic"/>
+          <w:color w:val="000000"/>
+          <w:sz w:val="22"/>
+          <w:lang w:eastAsia="ko-KR"/>
+        </w:rPr>
+        <w:t>(§9.7 — 막지 않는다).</w:t>
+      </w:r>
+    </w:p>
+    <w:p>
+      <w:pPr>
+        <w:pStyle w:val="ListBullet"/>
+      </w:pPr>
+      <w:r>
+        <w:rPr>
+          <w:rFonts w:ascii="Arial" w:hAnsi="Arial" w:eastAsia="Malgun Gothic" w:cs="Malgun Gothic"/>
+          <w:b/>
+          <w:color w:val="000000"/>
+          <w:sz w:val="22"/>
+          <w:lang w:eastAsia="ko-KR"/>
+        </w:rPr>
+        <w:t>Solution (`/solutions`):</w:t>
+      </w:r>
+      <w:r>
+        <w:rPr>
+          <w:rFonts w:ascii="Arial" w:hAnsi="Arial" w:eastAsia="Malgun Gothic" w:cs="Malgun Gothic"/>
+          <w:color w:val="000000"/>
+          <w:sz w:val="22"/>
+          <w:lang w:eastAsia="ko-KR"/>
+        </w:rPr>
+        <w:t xml:space="preserve"> </w:t>
+      </w:r>
+      <w:r>
+        <w:rPr>
+          <w:rFonts w:ascii="Menlo" w:hAnsi="Menlo" w:eastAsia="Menlo" w:cs="Menlo"/>
+          <w:color w:val="000000"/>
+          <w:sz w:val="21"/>
+          <w:lang w:eastAsia="ko-KR"/>
+        </w:rPr>
+        <w:t>approachMd</w:t>
+      </w:r>
+      <w:r>
+        <w:rPr>
+          <w:rFonts w:ascii="Arial" w:hAnsi="Arial" w:eastAsia="Malgun Gothic" w:cs="Malgun Gothic"/>
+          <w:color w:val="000000"/>
+          <w:sz w:val="22"/>
+          <w:lang w:eastAsia="ko-KR"/>
+        </w:rPr>
+        <w:t xml:space="preserve">(필수), </w:t>
+      </w:r>
+      <w:r>
+        <w:rPr>
+          <w:rFonts w:ascii="Menlo" w:hAnsi="Menlo" w:eastAsia="Menlo" w:cs="Menlo"/>
+          <w:color w:val="000000"/>
+          <w:sz w:val="21"/>
+          <w:lang w:eastAsia="ko-KR"/>
+        </w:rPr>
+        <w:t>stepsMd</w:t>
+      </w:r>
+      <w:r>
+        <w:rPr>
+          <w:rFonts w:ascii="Arial" w:hAnsi="Arial" w:eastAsia="Malgun Gothic" w:cs="Malgun Gothic"/>
+          <w:color w:val="000000"/>
+          <w:sz w:val="22"/>
+          <w:lang w:eastAsia="ko-KR"/>
+        </w:rPr>
+        <w:t>·</w:t>
+      </w:r>
+      <w:r>
+        <w:rPr>
+          <w:rFonts w:ascii="Menlo" w:hAnsi="Menlo" w:eastAsia="Menlo" w:cs="Menlo"/>
+          <w:color w:val="000000"/>
+          <w:sz w:val="21"/>
+          <w:lang w:eastAsia="ko-KR"/>
+        </w:rPr>
+        <w:t>verificationMd</w:t>
+      </w:r>
+      <w:r>
+        <w:rPr>
+          <w:rFonts w:ascii="Arial" w:hAnsi="Arial" w:eastAsia="Malgun Gothic" w:cs="Malgun Gothic"/>
+          <w:color w:val="000000"/>
+          <w:sz w:val="22"/>
+          <w:lang w:eastAsia="ko-KR"/>
+        </w:rPr>
+        <w:t>·</w:t>
+      </w:r>
+      <w:r>
+        <w:rPr>
+          <w:rFonts w:ascii="Menlo" w:hAnsi="Menlo" w:eastAsia="Menlo" w:cs="Menlo"/>
+          <w:color w:val="000000"/>
+          <w:sz w:val="21"/>
+          <w:lang w:eastAsia="ko-KR"/>
+        </w:rPr>
+        <w:t>tradeoffsMd</w:t>
+      </w:r>
+      <w:r>
+        <w:rPr>
+          <w:rFonts w:ascii="Arial" w:hAnsi="Arial" w:eastAsia="Malgun Gothic" w:cs="Malgun Gothic"/>
+          <w:color w:val="000000"/>
+          <w:sz w:val="22"/>
+          <w:lang w:eastAsia="ko-KR"/>
+        </w:rPr>
+        <w:t xml:space="preserve">(선택), </w:t>
+      </w:r>
+      <w:r>
+        <w:rPr>
+          <w:rFonts w:ascii="Menlo" w:hAnsi="Menlo" w:eastAsia="Menlo" w:cs="Menlo"/>
+          <w:color w:val="000000"/>
+          <w:sz w:val="21"/>
+          <w:lang w:eastAsia="ko-KR"/>
+        </w:rPr>
+        <w:t>resolvedAt</w:t>
+      </w:r>
+      <w:r>
+        <w:rPr>
+          <w:rFonts w:ascii="Arial" w:hAnsi="Arial" w:eastAsia="Malgun Gothic" w:cs="Malgun Gothic"/>
+          <w:color w:val="000000"/>
+          <w:sz w:val="22"/>
+          <w:lang w:eastAsia="ko-KR"/>
+        </w:rPr>
+        <w:t xml:space="preserve">(선택). </w:t>
+      </w:r>
+      <w:r>
+        <w:rPr>
+          <w:rFonts w:ascii="Arial" w:hAnsi="Arial" w:eastAsia="Malgun Gothic" w:cs="Malgun Gothic"/>
+          <w:b/>
+          <w:color w:val="000000"/>
+          <w:sz w:val="22"/>
+          <w:lang w:eastAsia="ko-KR"/>
+        </w:rPr>
+        <w:t>`errorNodeId`를 주면 Solution과 `Error --SOLVED_BY--&gt; Solution`을 한 트랜잭션으로 만든다</w:t>
+      </w:r>
+      <w:r>
+        <w:rPr>
+          <w:rFonts w:ascii="Arial" w:hAnsi="Arial" w:eastAsia="Malgun Gothic" w:cs="Malgun Gothic"/>
+          <w:color w:val="000000"/>
+          <w:sz w:val="22"/>
+          <w:lang w:eastAsia="ko-KR"/>
+        </w:rPr>
+        <w:t xml:space="preserve"> — Error가 아니면(</w:t>
+      </w:r>
+      <w:r>
+        <w:rPr>
+          <w:rFonts w:ascii="Menlo" w:hAnsi="Menlo" w:eastAsia="Menlo" w:cs="Menlo"/>
+          <w:color w:val="000000"/>
+          <w:sz w:val="21"/>
+          <w:lang w:eastAsia="ko-KR"/>
+        </w:rPr>
+        <w:t>400 TYPE_NOT_ALLOWED</w:t>
+      </w:r>
+      <w:r>
+        <w:rPr>
+          <w:rFonts w:ascii="Arial" w:hAnsi="Arial" w:eastAsia="Malgun Gothic" w:cs="Malgun Gothic"/>
+          <w:color w:val="000000"/>
+          <w:sz w:val="22"/>
+          <w:lang w:eastAsia="ko-KR"/>
+        </w:rPr>
+        <w:t>)·다른 Workspace면(</w:t>
+      </w:r>
+      <w:r>
+        <w:rPr>
+          <w:rFonts w:ascii="Menlo" w:hAnsi="Menlo" w:eastAsia="Menlo" w:cs="Menlo"/>
+          <w:color w:val="000000"/>
+          <w:sz w:val="21"/>
+          <w:lang w:eastAsia="ko-KR"/>
+        </w:rPr>
+        <w:t>400 INVALID_RELATION_NODE</w:t>
+      </w:r>
+      <w:r>
+        <w:rPr>
+          <w:rFonts w:ascii="Arial" w:hAnsi="Arial" w:eastAsia="Malgun Gothic" w:cs="Malgun Gothic"/>
+          <w:color w:val="000000"/>
+          <w:sz w:val="22"/>
+          <w:lang w:eastAsia="ko-KR"/>
+        </w:rPr>
+        <w:t xml:space="preserve">) Solution도 만들어지지 않는다(통합 테스트가 행 수로 확인). 설계 초안의 </w:t>
+      </w:r>
+      <w:r>
+        <w:rPr>
+          <w:rFonts w:ascii="Menlo" w:hAnsi="Menlo" w:eastAsia="Menlo" w:cs="Menlo"/>
+          <w:color w:val="000000"/>
+          <w:sz w:val="21"/>
+          <w:lang w:eastAsia="ko-KR"/>
+        </w:rPr>
+        <w:t>errorRelation</w:t>
+      </w:r>
+      <w:r>
+        <w:rPr>
+          <w:rFonts w:ascii="Arial" w:hAnsi="Arial" w:eastAsia="Malgun Gothic" w:cs="Malgun Gothic"/>
+          <w:color w:val="000000"/>
+          <w:sz w:val="22"/>
+          <w:lang w:eastAsia="ko-KR"/>
+        </w:rPr>
+        <w:t xml:space="preserve"> 필드명 대신 </w:t>
+      </w:r>
+      <w:r>
+        <w:rPr>
+          <w:rFonts w:ascii="Menlo" w:hAnsi="Menlo" w:eastAsia="Menlo" w:cs="Menlo"/>
+          <w:color w:val="000000"/>
+          <w:sz w:val="21"/>
+          <w:lang w:eastAsia="ko-KR"/>
+        </w:rPr>
+        <w:t>errorNodeId</w:t>
+      </w:r>
+      <w:r>
+        <w:rPr>
+          <w:rFonts w:ascii="Arial" w:hAnsi="Arial" w:eastAsia="Malgun Gothic" w:cs="Malgun Gothic"/>
+          <w:color w:val="000000"/>
+          <w:sz w:val="22"/>
+          <w:lang w:eastAsia="ko-KR"/>
+        </w:rPr>
+        <w:t xml:space="preserve">를 쓴다. 목록 필터 </w:t>
+      </w:r>
+      <w:r>
+        <w:rPr>
+          <w:rFonts w:ascii="Menlo" w:hAnsi="Menlo" w:eastAsia="Menlo" w:cs="Menlo"/>
+          <w:color w:val="000000"/>
+          <w:sz w:val="21"/>
+          <w:lang w:eastAsia="ko-KR"/>
+        </w:rPr>
+        <w:t>errorId</w:t>
+      </w:r>
+      <w:r>
+        <w:rPr>
+          <w:rFonts w:ascii="Arial" w:hAnsi="Arial" w:eastAsia="Malgun Gothic" w:cs="Malgun Gothic"/>
+          <w:color w:val="000000"/>
+          <w:sz w:val="22"/>
+          <w:lang w:eastAsia="ko-KR"/>
+        </w:rPr>
+        <w:t xml:space="preserve">(그 Error를 해결하는 것), </w:t>
+      </w:r>
+      <w:r>
+        <w:rPr>
+          <w:rFonts w:ascii="Menlo" w:hAnsi="Menlo" w:eastAsia="Menlo" w:cs="Menlo"/>
+          <w:color w:val="000000"/>
+          <w:sz w:val="21"/>
+          <w:lang w:eastAsia="ko-KR"/>
+        </w:rPr>
+        <w:t>projectId</w:t>
+      </w:r>
+      <w:r>
+        <w:rPr>
+          <w:rFonts w:ascii="Arial" w:hAnsi="Arial" w:eastAsia="Malgun Gothic" w:cs="Malgun Gothic"/>
+          <w:color w:val="000000"/>
+          <w:sz w:val="22"/>
+          <w:lang w:eastAsia="ko-KR"/>
+        </w:rPr>
+        <w:t>(</w:t>
+      </w:r>
+      <w:r>
+        <w:rPr>
+          <w:rFonts w:ascii="Menlo" w:hAnsi="Menlo" w:eastAsia="Menlo" w:cs="Menlo"/>
+          <w:color w:val="000000"/>
+          <w:sz w:val="21"/>
+          <w:lang w:eastAsia="ko-KR"/>
+        </w:rPr>
+        <w:t>APPLIED_IN</w:t>
+      </w:r>
+      <w:r>
+        <w:rPr>
+          <w:rFonts w:ascii="Arial" w:hAnsi="Arial" w:eastAsia="Malgun Gothic" w:cs="Malgun Gothic"/>
+          <w:color w:val="000000"/>
+          <w:sz w:val="22"/>
+          <w:lang w:eastAsia="ko-KR"/>
+        </w:rPr>
+        <w:t xml:space="preserve">)이고 항목마다 </w:t>
+      </w:r>
+      <w:r>
+        <w:rPr>
+          <w:rFonts w:ascii="Menlo" w:hAnsi="Menlo" w:eastAsia="Menlo" w:cs="Menlo"/>
+          <w:color w:val="000000"/>
+          <w:sz w:val="21"/>
+          <w:lang w:eastAsia="ko-KR"/>
+        </w:rPr>
+        <w:t>errorCount</w:t>
+      </w:r>
+      <w:r>
+        <w:rPr>
+          <w:rFonts w:ascii="Arial" w:hAnsi="Arial" w:eastAsia="Malgun Gothic" w:cs="Malgun Gothic"/>
+          <w:color w:val="000000"/>
+          <w:sz w:val="22"/>
+          <w:lang w:eastAsia="ko-KR"/>
+        </w:rPr>
+        <w:t>·</w:t>
+      </w:r>
+      <w:r>
+        <w:rPr>
+          <w:rFonts w:ascii="Menlo" w:hAnsi="Menlo" w:eastAsia="Menlo" w:cs="Menlo"/>
+          <w:color w:val="000000"/>
+          <w:sz w:val="21"/>
+          <w:lang w:eastAsia="ko-KR"/>
+        </w:rPr>
+        <w:t>snippetCount</w:t>
+      </w:r>
+      <w:r>
+        <w:rPr>
+          <w:rFonts w:ascii="Arial" w:hAnsi="Arial" w:eastAsia="Malgun Gothic" w:cs="Malgun Gothic"/>
+          <w:color w:val="000000"/>
+          <w:sz w:val="22"/>
+          <w:lang w:eastAsia="ko-KR"/>
+        </w:rPr>
+        <w:t>·</w:t>
+      </w:r>
+      <w:r>
+        <w:rPr>
+          <w:rFonts w:ascii="Menlo" w:hAnsi="Menlo" w:eastAsia="Menlo" w:cs="Menlo"/>
+          <w:color w:val="000000"/>
+          <w:sz w:val="21"/>
+          <w:lang w:eastAsia="ko-KR"/>
+        </w:rPr>
+        <w:t>projectCount</w:t>
+      </w:r>
+      <w:r>
+        <w:rPr>
+          <w:rFonts w:ascii="Arial" w:hAnsi="Arial" w:eastAsia="Malgun Gothic" w:cs="Malgun Gothic"/>
+          <w:color w:val="000000"/>
+          <w:sz w:val="22"/>
+          <w:lang w:eastAsia="ko-KR"/>
+        </w:rPr>
+        <w:t>를 준다.</w:t>
+      </w:r>
+    </w:p>
+    <w:p>
+      <w:pPr>
+        <w:pStyle w:val="ListBullet"/>
+      </w:pPr>
+      <w:r>
+        <w:rPr>
+          <w:rFonts w:ascii="Arial" w:hAnsi="Arial" w:eastAsia="Malgun Gothic" w:cs="Malgun Gothic"/>
+          <w:b/>
+          <w:color w:val="000000"/>
+          <w:sz w:val="22"/>
+          <w:lang w:eastAsia="ko-KR"/>
+        </w:rPr>
+        <w:t>Project (`/projects`):</w:t>
+      </w:r>
+      <w:r>
+        <w:rPr>
+          <w:rFonts w:ascii="Arial" w:hAnsi="Arial" w:eastAsia="Malgun Gothic" w:cs="Malgun Gothic"/>
+          <w:color w:val="000000"/>
+          <w:sz w:val="22"/>
+          <w:lang w:eastAsia="ko-KR"/>
+        </w:rPr>
+        <w:t xml:space="preserve"> </w:t>
+      </w:r>
+      <w:r>
+        <w:rPr>
+          <w:rFonts w:ascii="Menlo" w:hAnsi="Menlo" w:eastAsia="Menlo" w:cs="Menlo"/>
+          <w:color w:val="000000"/>
+          <w:sz w:val="21"/>
+          <w:lang w:eastAsia="ko-KR"/>
+        </w:rPr>
+        <w:t>description</w:t>
+      </w:r>
+      <w:r>
+        <w:rPr>
+          <w:rFonts w:ascii="Arial" w:hAnsi="Arial" w:eastAsia="Malgun Gothic" w:cs="Malgun Gothic"/>
+          <w:color w:val="000000"/>
+          <w:sz w:val="22"/>
+          <w:lang w:eastAsia="ko-KR"/>
+        </w:rPr>
+        <w:t xml:space="preserve">은 Node의 </w:t>
+      </w:r>
+      <w:r>
+        <w:rPr>
+          <w:rFonts w:ascii="Menlo" w:hAnsi="Menlo" w:eastAsia="Menlo" w:cs="Menlo"/>
+          <w:color w:val="000000"/>
+          <w:sz w:val="21"/>
+          <w:lang w:eastAsia="ko-KR"/>
+        </w:rPr>
+        <w:t>bodyMd</w:t>
+      </w:r>
+      <w:r>
+        <w:rPr>
+          <w:rFonts w:ascii="Arial" w:hAnsi="Arial" w:eastAsia="Malgun Gothic" w:cs="Malgun Gothic"/>
+          <w:color w:val="000000"/>
+          <w:sz w:val="22"/>
+          <w:lang w:eastAsia="ko-KR"/>
+        </w:rPr>
+        <w:t xml:space="preserve">(Markdown), </w:t>
+      </w:r>
+      <w:r>
+        <w:rPr>
+          <w:rFonts w:ascii="Menlo" w:hAnsi="Menlo" w:eastAsia="Menlo" w:cs="Menlo"/>
+          <w:color w:val="000000"/>
+          <w:sz w:val="21"/>
+          <w:lang w:eastAsia="ko-KR"/>
+        </w:rPr>
+        <w:t>projectStatus</w:t>
+      </w:r>
+      <w:r>
+        <w:rPr>
+          <w:rFonts w:ascii="Arial" w:hAnsi="Arial" w:eastAsia="Malgun Gothic" w:cs="Malgun Gothic"/>
+          <w:color w:val="000000"/>
+          <w:sz w:val="22"/>
+          <w:lang w:eastAsia="ko-KR"/>
+        </w:rPr>
+        <w:t>(</w:t>
+      </w:r>
+      <w:r>
+        <w:rPr>
+          <w:rFonts w:ascii="Menlo" w:hAnsi="Menlo" w:eastAsia="Menlo" w:cs="Menlo"/>
+          <w:color w:val="000000"/>
+          <w:sz w:val="21"/>
+          <w:lang w:eastAsia="ko-KR"/>
+        </w:rPr>
+        <w:t>ACTIVE|PAUSED|COMPLETED|ARCHIVED</w:t>
+      </w:r>
+      <w:r>
+        <w:rPr>
+          <w:rFonts w:ascii="Arial" w:hAnsi="Arial" w:eastAsia="Malgun Gothic" w:cs="Malgun Gothic"/>
+          <w:color w:val="000000"/>
+          <w:sz w:val="22"/>
+          <w:lang w:eastAsia="ko-KR"/>
+        </w:rPr>
+        <w:t xml:space="preserve">, 기본 </w:t>
+      </w:r>
+      <w:r>
+        <w:rPr>
+          <w:rFonts w:ascii="Menlo" w:hAnsi="Menlo" w:eastAsia="Menlo" w:cs="Menlo"/>
+          <w:color w:val="000000"/>
+          <w:sz w:val="21"/>
+          <w:lang w:eastAsia="ko-KR"/>
+        </w:rPr>
+        <w:t>ACTIVE</w:t>
+      </w:r>
+      <w:r>
+        <w:rPr>
+          <w:rFonts w:ascii="Arial" w:hAnsi="Arial" w:eastAsia="Malgun Gothic" w:cs="Malgun Gothic"/>
+          <w:color w:val="000000"/>
+          <w:sz w:val="22"/>
+          <w:lang w:eastAsia="ko-KR"/>
+        </w:rPr>
+        <w:t xml:space="preserve"> — Node의 보관 상태와는 별개의 업무 상태이며 목록에서 숨기는 보관은 Node archive), </w:t>
+      </w:r>
+      <w:r>
+        <w:rPr>
+          <w:rFonts w:ascii="Menlo" w:hAnsi="Menlo" w:eastAsia="Menlo" w:cs="Menlo"/>
+          <w:color w:val="000000"/>
+          <w:sz w:val="21"/>
+          <w:lang w:eastAsia="ko-KR"/>
+        </w:rPr>
+        <w:t>repositoryUrl</w:t>
+      </w:r>
+      <w:r>
+        <w:rPr>
+          <w:rFonts w:ascii="Arial" w:hAnsi="Arial" w:eastAsia="Malgun Gothic" w:cs="Malgun Gothic"/>
+          <w:color w:val="000000"/>
+          <w:sz w:val="22"/>
+          <w:lang w:eastAsia="ko-KR"/>
+        </w:rPr>
+        <w:t xml:space="preserve">(http/https만, 계정 정보가 든 URL 거부, ≤500), </w:t>
+      </w:r>
+      <w:r>
+        <w:rPr>
+          <w:rFonts w:ascii="Menlo" w:hAnsi="Menlo" w:eastAsia="Menlo" w:cs="Menlo"/>
+          <w:color w:val="000000"/>
+          <w:sz w:val="21"/>
+          <w:lang w:eastAsia="ko-KR"/>
+        </w:rPr>
+        <w:t>startedOn</w:t>
+      </w:r>
+      <w:r>
+        <w:rPr>
+          <w:rFonts w:ascii="Arial" w:hAnsi="Arial" w:eastAsia="Malgun Gothic" w:cs="Malgun Gothic"/>
+          <w:color w:val="000000"/>
+          <w:sz w:val="22"/>
+          <w:lang w:eastAsia="ko-KR"/>
+        </w:rPr>
+        <w:t>·</w:t>
+      </w:r>
+      <w:r>
+        <w:rPr>
+          <w:rFonts w:ascii="Menlo" w:hAnsi="Menlo" w:eastAsia="Menlo" w:cs="Menlo"/>
+          <w:color w:val="000000"/>
+          <w:sz w:val="21"/>
+          <w:lang w:eastAsia="ko-KR"/>
+        </w:rPr>
+        <w:t>endedOn</w:t>
+      </w:r>
+      <w:r>
+        <w:rPr>
+          <w:rFonts w:ascii="Arial" w:hAnsi="Arial" w:eastAsia="Malgun Gothic" w:cs="Malgun Gothic"/>
+          <w:color w:val="000000"/>
+          <w:sz w:val="22"/>
+          <w:lang w:eastAsia="ko-KR"/>
+        </w:rPr>
+        <w:t>(</w:t>
+      </w:r>
+      <w:r>
+        <w:rPr>
+          <w:rFonts w:ascii="Menlo" w:hAnsi="Menlo" w:eastAsia="Menlo" w:cs="Menlo"/>
+          <w:color w:val="000000"/>
+          <w:sz w:val="21"/>
+          <w:lang w:eastAsia="ko-KR"/>
+        </w:rPr>
+        <w:t>endedOn ≥ startedOn</w:t>
+      </w:r>
+      <w:r>
+        <w:rPr>
+          <w:rFonts w:ascii="Arial" w:hAnsi="Arial" w:eastAsia="Malgun Gothic" w:cs="Malgun Gothic"/>
+          <w:color w:val="000000"/>
+          <w:sz w:val="22"/>
+          <w:lang w:eastAsia="ko-KR"/>
+        </w:rPr>
+        <w:t xml:space="preserve">, 수정 시 기존 값과의 조합으로도 검사). 수정에서 날짜를 지우려면 </w:t>
+      </w:r>
+      <w:r>
+        <w:rPr>
+          <w:rFonts w:ascii="Menlo" w:hAnsi="Menlo" w:eastAsia="Menlo" w:cs="Menlo"/>
+          <w:color w:val="000000"/>
+          <w:sz w:val="21"/>
+          <w:lang w:eastAsia="ko-KR"/>
+        </w:rPr>
+        <w:t>clearStartedOn</w:t>
+      </w:r>
+      <w:r>
+        <w:rPr>
+          <w:rFonts w:ascii="Arial" w:hAnsi="Arial" w:eastAsia="Malgun Gothic" w:cs="Malgun Gothic"/>
+          <w:color w:val="000000"/>
+          <w:sz w:val="22"/>
+          <w:lang w:eastAsia="ko-KR"/>
+        </w:rPr>
+        <w:t>/</w:t>
+      </w:r>
+      <w:r>
+        <w:rPr>
+          <w:rFonts w:ascii="Menlo" w:hAnsi="Menlo" w:eastAsia="Menlo" w:cs="Menlo"/>
+          <w:color w:val="000000"/>
+          <w:sz w:val="21"/>
+          <w:lang w:eastAsia="ko-KR"/>
+        </w:rPr>
+        <w:t>clearEndedOn: true</w:t>
+      </w:r>
+      <w:r>
+        <w:rPr>
+          <w:rFonts w:ascii="Arial" w:hAnsi="Arial" w:eastAsia="Malgun Gothic" w:cs="Malgun Gothic"/>
+          <w:color w:val="000000"/>
+          <w:sz w:val="22"/>
+          <w:lang w:eastAsia="ko-KR"/>
+        </w:rPr>
+        <w:t xml:space="preserve">(생략과 구분하기 위해). 연결은 junction이 아니라 Relation이고(PROJ-03), 목록은 </w:t>
+      </w:r>
+      <w:r>
+        <w:rPr>
+          <w:rFonts w:ascii="Menlo" w:hAnsi="Menlo" w:eastAsia="Menlo" w:cs="Menlo"/>
+          <w:color w:val="000000"/>
+          <w:sz w:val="21"/>
+          <w:lang w:eastAsia="ko-KR"/>
+        </w:rPr>
+        <w:t>problemCount</w:t>
+      </w:r>
+      <w:r>
+        <w:rPr>
+          <w:rFonts w:ascii="Arial" w:hAnsi="Arial" w:eastAsia="Malgun Gothic" w:cs="Malgun Gothic"/>
+          <w:color w:val="000000"/>
+          <w:sz w:val="22"/>
+          <w:lang w:eastAsia="ko-KR"/>
+        </w:rPr>
+        <w:t xml:space="preserve">(들어오는 </w:t>
+      </w:r>
+      <w:r>
+        <w:rPr>
+          <w:rFonts w:ascii="Menlo" w:hAnsi="Menlo" w:eastAsia="Menlo" w:cs="Menlo"/>
+          <w:color w:val="000000"/>
+          <w:sz w:val="21"/>
+          <w:lang w:eastAsia="ko-KR"/>
+        </w:rPr>
+        <w:t>OCCURRED_IN</w:t>
+      </w:r>
+      <w:r>
+        <w:rPr>
+          <w:rFonts w:ascii="Arial" w:hAnsi="Arial" w:eastAsia="Malgun Gothic" w:cs="Malgun Gothic"/>
+          <w:color w:val="000000"/>
+          <w:sz w:val="22"/>
+          <w:lang w:eastAsia="ko-KR"/>
+        </w:rPr>
+        <w:t>)·</w:t>
+      </w:r>
+      <w:r>
+        <w:rPr>
+          <w:rFonts w:ascii="Menlo" w:hAnsi="Menlo" w:eastAsia="Menlo" w:cs="Menlo"/>
+          <w:color w:val="000000"/>
+          <w:sz w:val="21"/>
+          <w:lang w:eastAsia="ko-KR"/>
+        </w:rPr>
+        <w:t>knowledgeCount</w:t>
+      </w:r>
+      <w:r>
+        <w:rPr>
+          <w:rFonts w:ascii="Arial" w:hAnsi="Arial" w:eastAsia="Malgun Gothic" w:cs="Malgun Gothic"/>
+          <w:color w:val="000000"/>
+          <w:sz w:val="22"/>
+          <w:lang w:eastAsia="ko-KR"/>
+        </w:rPr>
+        <w:t>(</w:t>
+      </w:r>
+      <w:r>
+        <w:rPr>
+          <w:rFonts w:ascii="Menlo" w:hAnsi="Menlo" w:eastAsia="Menlo" w:cs="Menlo"/>
+          <w:color w:val="000000"/>
+          <w:sz w:val="21"/>
+          <w:lang w:eastAsia="ko-KR"/>
+        </w:rPr>
+        <w:t>USED_IN</w:t>
+      </w:r>
+      <w:r>
+        <w:rPr>
+          <w:rFonts w:ascii="Arial" w:hAnsi="Arial" w:eastAsia="Malgun Gothic" w:cs="Malgun Gothic"/>
+          <w:color w:val="000000"/>
+          <w:sz w:val="22"/>
+          <w:lang w:eastAsia="ko-KR"/>
+        </w:rPr>
+        <w:t>)·</w:t>
+      </w:r>
+      <w:r>
+        <w:rPr>
+          <w:rFonts w:ascii="Menlo" w:hAnsi="Menlo" w:eastAsia="Menlo" w:cs="Menlo"/>
+          <w:color w:val="000000"/>
+          <w:sz w:val="21"/>
+          <w:lang w:eastAsia="ko-KR"/>
+        </w:rPr>
+        <w:t>solutionCount</w:t>
+      </w:r>
+      <w:r>
+        <w:rPr>
+          <w:rFonts w:ascii="Arial" w:hAnsi="Arial" w:eastAsia="Malgun Gothic" w:cs="Malgun Gothic"/>
+          <w:color w:val="000000"/>
+          <w:sz w:val="22"/>
+          <w:lang w:eastAsia="ko-KR"/>
+        </w:rPr>
+        <w:t>(</w:t>
+      </w:r>
+      <w:r>
+        <w:rPr>
+          <w:rFonts w:ascii="Menlo" w:hAnsi="Menlo" w:eastAsia="Menlo" w:cs="Menlo"/>
+          <w:color w:val="000000"/>
+          <w:sz w:val="21"/>
+          <w:lang w:eastAsia="ko-KR"/>
+        </w:rPr>
+        <w:t>APPLIED_IN</w:t>
+      </w:r>
+      <w:r>
+        <w:rPr>
+          <w:rFonts w:ascii="Arial" w:hAnsi="Arial" w:eastAsia="Malgun Gothic" w:cs="Malgun Gothic"/>
+          <w:color w:val="000000"/>
+          <w:sz w:val="22"/>
+          <w:lang w:eastAsia="ko-KR"/>
+        </w:rPr>
+        <w:t xml:space="preserve">)를 준다. </w:t>
+      </w:r>
+      <w:r>
+        <w:rPr>
+          <w:rFonts w:ascii="Arial" w:hAnsi="Arial" w:eastAsia="Malgun Gothic" w:cs="Malgun Gothic"/>
+          <w:b/>
+          <w:color w:val="000000"/>
+          <w:sz w:val="22"/>
+          <w:lang w:eastAsia="ko-KR"/>
+        </w:rPr>
+        <w:t>`GET /projects/{id}/graph`</w:t>
+      </w:r>
+      <w:r>
+        <w:rPr>
+          <w:rFonts w:ascii="Arial" w:hAnsi="Arial" w:eastAsia="Malgun Gothic" w:cs="Malgun Gothic"/>
+          <w:color w:val="000000"/>
+          <w:sz w:val="22"/>
+          <w:lang w:eastAsia="ko-KR"/>
+        </w:rPr>
+        <w:t xml:space="preserve">는 그 Project를 중심으로 한 focus 그래프(기본 depth 2, §13.3의 상한·잘림 규칙 그대로)이며 Project가 아닌 id는 </w:t>
+      </w:r>
+      <w:r>
+        <w:rPr>
+          <w:rFonts w:ascii="Menlo" w:hAnsi="Menlo" w:eastAsia="Menlo" w:cs="Menlo"/>
+          <w:color w:val="000000"/>
+          <w:sz w:val="21"/>
+          <w:lang w:eastAsia="ko-KR"/>
+        </w:rPr>
+        <w:t>404</w:t>
+      </w:r>
+      <w:r>
+        <w:rPr>
+          <w:rFonts w:ascii="Arial" w:hAnsi="Arial" w:eastAsia="Malgun Gothic" w:cs="Malgun Gothic"/>
+          <w:color w:val="000000"/>
+          <w:sz w:val="22"/>
+          <w:lang w:eastAsia="ko-KR"/>
+        </w:rPr>
+        <w:t>.</w:t>
+      </w:r>
+    </w:p>
+    <w:p>
+      <w:pPr>
+        <w:pStyle w:val="ListBullet"/>
+      </w:pPr>
+      <w:r>
+        <w:rPr>
+          <w:rFonts w:ascii="Arial" w:hAnsi="Arial" w:eastAsia="Malgun Gothic" w:cs="Malgun Gothic"/>
+          <w:b/>
+          <w:color w:val="000000"/>
+          <w:sz w:val="22"/>
+          <w:lang w:eastAsia="ko-KR"/>
+        </w:rPr>
+        <w:t>Resource (`/resources`):</w:t>
+      </w:r>
+      <w:r>
+        <w:rPr>
+          <w:rFonts w:ascii="Arial" w:hAnsi="Arial" w:eastAsia="Malgun Gothic" w:cs="Malgun Gothic"/>
+          <w:color w:val="000000"/>
+          <w:sz w:val="22"/>
+          <w:lang w:eastAsia="ko-KR"/>
+        </w:rPr>
+        <w:t xml:space="preserve"> </w:t>
+      </w:r>
+      <w:r>
+        <w:rPr>
+          <w:rFonts w:ascii="Menlo" w:hAnsi="Menlo" w:eastAsia="Menlo" w:cs="Menlo"/>
+          <w:color w:val="000000"/>
+          <w:sz w:val="21"/>
+          <w:lang w:eastAsia="ko-KR"/>
+        </w:rPr>
+        <w:t>url</w:t>
+      </w:r>
+      <w:r>
+        <w:rPr>
+          <w:rFonts w:ascii="Arial" w:hAnsi="Arial" w:eastAsia="Malgun Gothic" w:cs="Malgun Gothic"/>
+          <w:color w:val="000000"/>
+          <w:sz w:val="22"/>
+          <w:lang w:eastAsia="ko-KR"/>
+        </w:rPr>
+        <w:t xml:space="preserve">(필수, http/https 절대 URL만; </w:t>
+      </w:r>
+      <w:r>
+        <w:rPr>
+          <w:rFonts w:ascii="Menlo" w:hAnsi="Menlo" w:eastAsia="Menlo" w:cs="Menlo"/>
+          <w:color w:val="000000"/>
+          <w:sz w:val="21"/>
+          <w:lang w:eastAsia="ko-KR"/>
+        </w:rPr>
+        <w:t>javascript:</w:t>
+      </w:r>
+      <w:r>
+        <w:rPr>
+          <w:rFonts w:ascii="Arial" w:hAnsi="Arial" w:eastAsia="Malgun Gothic" w:cs="Malgun Gothic"/>
+          <w:color w:val="000000"/>
+          <w:sz w:val="22"/>
+          <w:lang w:eastAsia="ko-KR"/>
+        </w:rPr>
+        <w:t>·</w:t>
+      </w:r>
+      <w:r>
+        <w:rPr>
+          <w:rFonts w:ascii="Menlo" w:hAnsi="Menlo" w:eastAsia="Menlo" w:cs="Menlo"/>
+          <w:color w:val="000000"/>
+          <w:sz w:val="21"/>
+          <w:lang w:eastAsia="ko-KR"/>
+        </w:rPr>
+        <w:t>data:</w:t>
+      </w:r>
+      <w:r>
+        <w:rPr>
+          <w:rFonts w:ascii="Arial" w:hAnsi="Arial" w:eastAsia="Malgun Gothic" w:cs="Malgun Gothic"/>
+          <w:color w:val="000000"/>
+          <w:sz w:val="22"/>
+          <w:lang w:eastAsia="ko-KR"/>
+        </w:rPr>
+        <w:t>·</w:t>
+      </w:r>
+      <w:r>
+        <w:rPr>
+          <w:rFonts w:ascii="Menlo" w:hAnsi="Menlo" w:eastAsia="Menlo" w:cs="Menlo"/>
+          <w:color w:val="000000"/>
+          <w:sz w:val="21"/>
+          <w:lang w:eastAsia="ko-KR"/>
+        </w:rPr>
+        <w:t>file:</w:t>
+      </w:r>
+      <w:r>
+        <w:rPr>
+          <w:rFonts w:ascii="Arial" w:hAnsi="Arial" w:eastAsia="Malgun Gothic" w:cs="Malgun Gothic"/>
+          <w:color w:val="000000"/>
+          <w:sz w:val="22"/>
+          <w:lang w:eastAsia="ko-KR"/>
+        </w:rPr>
+        <w:t>·</w:t>
+      </w:r>
+      <w:r>
+        <w:rPr>
+          <w:rFonts w:ascii="Menlo" w:hAnsi="Menlo" w:eastAsia="Menlo" w:cs="Menlo"/>
+          <w:color w:val="000000"/>
+          <w:sz w:val="21"/>
+          <w:lang w:eastAsia="ko-KR"/>
+        </w:rPr>
+        <w:t>ftp:</w:t>
+      </w:r>
+      <w:r>
+        <w:rPr>
+          <w:rFonts w:ascii="Arial" w:hAnsi="Arial" w:eastAsia="Malgun Gothic" w:cs="Malgun Gothic"/>
+          <w:color w:val="000000"/>
+          <w:sz w:val="22"/>
+          <w:lang w:eastAsia="ko-KR"/>
+        </w:rPr>
+        <w:t>·scheme 없음·host 없음·계정 정보(</w:t>
+      </w:r>
+      <w:r>
+        <w:rPr>
+          <w:rFonts w:ascii="Menlo" w:hAnsi="Menlo" w:eastAsia="Menlo" w:cs="Menlo"/>
+          <w:color w:val="000000"/>
+          <w:sz w:val="21"/>
+          <w:lang w:eastAsia="ko-KR"/>
+        </w:rPr>
+        <w:t>user:pass@</w:t>
+      </w:r>
+      <w:r>
+        <w:rPr>
+          <w:rFonts w:ascii="Arial" w:hAnsi="Arial" w:eastAsia="Malgun Gothic" w:cs="Malgun Gothic"/>
+          <w:color w:val="000000"/>
+          <w:sz w:val="22"/>
+          <w:lang w:eastAsia="ko-KR"/>
+        </w:rPr>
+        <w:t xml:space="preserve">)·2,000자 초과는 </w:t>
+      </w:r>
+      <w:r>
+        <w:rPr>
+          <w:rFonts w:ascii="Menlo" w:hAnsi="Menlo" w:eastAsia="Menlo" w:cs="Menlo"/>
+          <w:color w:val="000000"/>
+          <w:sz w:val="21"/>
+          <w:lang w:eastAsia="ko-KR"/>
+        </w:rPr>
+        <w:t>400 INVALID_URL</w:t>
+      </w:r>
+      <w:r>
+        <w:rPr>
+          <w:rFonts w:ascii="Arial" w:hAnsi="Arial" w:eastAsia="Malgun Gothic" w:cs="Malgun Gothic"/>
+          <w:color w:val="000000"/>
+          <w:sz w:val="22"/>
+          <w:lang w:eastAsia="ko-KR"/>
+        </w:rPr>
+        <w:t xml:space="preserve">, DB CHECK </w:t>
+      </w:r>
+      <w:r>
+        <w:rPr>
+          <w:rFonts w:ascii="Menlo" w:hAnsi="Menlo" w:eastAsia="Menlo" w:cs="Menlo"/>
+          <w:color w:val="000000"/>
+          <w:sz w:val="21"/>
+          <w:lang w:eastAsia="ko-KR"/>
+        </w:rPr>
+        <w:t>ck_resources__url_scheme</w:t>
+      </w:r>
+      <w:r>
+        <w:rPr>
+          <w:rFonts w:ascii="Arial" w:hAnsi="Arial" w:eastAsia="Malgun Gothic" w:cs="Malgun Gothic"/>
+          <w:color w:val="000000"/>
+          <w:sz w:val="22"/>
+          <w:lang w:eastAsia="ko-KR"/>
+        </w:rPr>
+        <w:t xml:space="preserve">가 최종 방어), </w:t>
+      </w:r>
+      <w:r>
+        <w:rPr>
+          <w:rFonts w:ascii="Menlo" w:hAnsi="Menlo" w:eastAsia="Menlo" w:cs="Menlo"/>
+          <w:color w:val="000000"/>
+          <w:sz w:val="21"/>
+          <w:lang w:eastAsia="ko-KR"/>
+        </w:rPr>
+        <w:t>kind</w:t>
+      </w:r>
+      <w:r>
+        <w:rPr>
+          <w:rFonts w:ascii="Arial" w:hAnsi="Arial" w:eastAsia="Malgun Gothic" w:cs="Malgun Gothic"/>
+          <w:color w:val="000000"/>
+          <w:sz w:val="22"/>
+          <w:lang w:eastAsia="ko-KR"/>
+        </w:rPr>
+        <w:t>(</w:t>
+      </w:r>
+      <w:r>
+        <w:rPr>
+          <w:rFonts w:ascii="Menlo" w:hAnsi="Menlo" w:eastAsia="Menlo" w:cs="Menlo"/>
+          <w:color w:val="000000"/>
+          <w:sz w:val="21"/>
+          <w:lang w:eastAsia="ko-KR"/>
+        </w:rPr>
+        <w:t>WEB|DOC|VIDEO|REPO|BOOK|OTHER</w:t>
+      </w:r>
+      <w:r>
+        <w:rPr>
+          <w:rFonts w:ascii="Arial" w:hAnsi="Arial" w:eastAsia="Malgun Gothic" w:cs="Malgun Gothic"/>
+          <w:color w:val="000000"/>
+          <w:sz w:val="22"/>
+          <w:lang w:eastAsia="ko-KR"/>
+        </w:rPr>
+        <w:t xml:space="preserve">, 기본 </w:t>
+      </w:r>
+      <w:r>
+        <w:rPr>
+          <w:rFonts w:ascii="Menlo" w:hAnsi="Menlo" w:eastAsia="Menlo" w:cs="Menlo"/>
+          <w:color w:val="000000"/>
+          <w:sz w:val="21"/>
+          <w:lang w:eastAsia="ko-KR"/>
+        </w:rPr>
+        <w:t>WEB</w:t>
+      </w:r>
+      <w:r>
+        <w:rPr>
+          <w:rFonts w:ascii="Arial" w:hAnsi="Arial" w:eastAsia="Malgun Gothic" w:cs="Malgun Gothic"/>
+          <w:color w:val="000000"/>
+          <w:sz w:val="22"/>
+          <w:lang w:eastAsia="ko-KR"/>
+        </w:rPr>
+        <w:t xml:space="preserve">), </w:t>
+      </w:r>
+      <w:r>
+        <w:rPr>
+          <w:rFonts w:ascii="Menlo" w:hAnsi="Menlo" w:eastAsia="Menlo" w:cs="Menlo"/>
+          <w:color w:val="000000"/>
+          <w:sz w:val="21"/>
+          <w:lang w:eastAsia="ko-KR"/>
+        </w:rPr>
+        <w:t>siteName</w:t>
+      </w:r>
+      <w:r>
+        <w:rPr>
+          <w:rFonts w:ascii="Arial" w:hAnsi="Arial" w:eastAsia="Malgun Gothic" w:cs="Malgun Gothic"/>
+          <w:color w:val="000000"/>
+          <w:sz w:val="22"/>
+          <w:lang w:eastAsia="ko-KR"/>
+        </w:rPr>
+        <w:t xml:space="preserve">(생략하면 host). 원문 URL은 입력 그대로 보관하고 </w:t>
+      </w:r>
+      <w:r>
+        <w:rPr>
+          <w:rFonts w:ascii="Menlo" w:hAnsi="Menlo" w:eastAsia="Menlo" w:cs="Menlo"/>
+          <w:color w:val="000000"/>
+          <w:sz w:val="21"/>
+          <w:lang w:eastAsia="ko-KR"/>
+        </w:rPr>
+        <w:t>url_normalized</w:t>
+      </w:r>
+      <w:r>
+        <w:rPr>
+          <w:rFonts w:ascii="Arial" w:hAnsi="Arial" w:eastAsia="Malgun Gothic" w:cs="Malgun Gothic"/>
+          <w:color w:val="000000"/>
+          <w:sz w:val="22"/>
+          <w:lang w:eastAsia="ko-KR"/>
+        </w:rPr>
+        <w:t xml:space="preserve">(§12.3 규칙 5가지; 경로·쿼리 값은 디코딩하지 않음)로 중복을 찾는다. </w:t>
+      </w:r>
+      <w:r>
+        <w:rPr>
+          <w:rFonts w:ascii="Arial" w:hAnsi="Arial" w:eastAsia="Malgun Gothic" w:cs="Malgun Gothic"/>
+          <w:b/>
+          <w:color w:val="000000"/>
+          <w:sz w:val="22"/>
+          <w:lang w:eastAsia="ko-KR"/>
+        </w:rPr>
+        <w:t>같은 정규화 URL의 다른 Resource(휴지통·다른 Workspace 제외)가 있으면 응답에 `duplicates:[{id,title}]`로 경고만 하고 저장은 막지 않는다.</w:t>
+      </w:r>
+      <w:r>
+        <w:rPr>
+          <w:rFonts w:ascii="Arial" w:hAnsi="Arial" w:eastAsia="Malgun Gothic" w:cs="Malgun Gothic"/>
+          <w:color w:val="000000"/>
+          <w:sz w:val="22"/>
+          <w:lang w:eastAsia="ko-KR"/>
+        </w:rPr>
+        <w:t xml:space="preserve"> 서버는 URL 내용을 가져오지 않는다(§17.4).</w:t>
+      </w:r>
+    </w:p>
+    <w:p>
+      <w:pPr>
+        <w:pStyle w:val="ListBullet"/>
+      </w:pPr>
+      <w:r>
+        <w:rPr>
+          <w:rFonts w:ascii="Arial" w:hAnsi="Arial" w:eastAsia="Malgun Gothic" w:cs="Malgun Gothic"/>
+          <w:b/>
+          <w:color w:val="000000"/>
+          <w:sz w:val="22"/>
+          <w:lang w:eastAsia="ko-KR"/>
+        </w:rPr>
+        <w:t>관계 규칙(§13.1.1)은 그대로 적용된다.</w:t>
+      </w:r>
+      <w:r>
+        <w:rPr>
+          <w:rFonts w:ascii="Arial" w:hAnsi="Arial" w:eastAsia="Malgun Gothic" w:cs="Malgun Gothic"/>
+          <w:color w:val="000000"/>
+          <w:sz w:val="22"/>
+          <w:lang w:eastAsia="ko-KR"/>
+        </w:rPr>
+        <w:t xml:space="preserve"> 권장 체인 7개 edge가 허용 방향으로만 만들어지고(</w:t>
+      </w:r>
+      <w:r>
+        <w:rPr>
+          <w:rFonts w:ascii="Menlo" w:hAnsi="Menlo" w:eastAsia="Menlo" w:cs="Menlo"/>
+          <w:color w:val="000000"/>
+          <w:sz w:val="21"/>
+          <w:lang w:eastAsia="ko-KR"/>
+        </w:rPr>
+        <w:t>Snippet --APPLIED_IN--&gt; Project</w:t>
+      </w:r>
+      <w:r>
+        <w:rPr>
+          <w:rFonts w:ascii="Arial" w:hAnsi="Arial" w:eastAsia="Malgun Gothic" w:cs="Malgun Gothic"/>
+          <w:color w:val="000000"/>
+          <w:sz w:val="22"/>
+          <w:lang w:eastAsia="ko-KR"/>
+        </w:rPr>
+        <w:t xml:space="preserve">, </w:t>
+      </w:r>
+      <w:r>
+        <w:rPr>
+          <w:rFonts w:ascii="Menlo" w:hAnsi="Menlo" w:eastAsia="Menlo" w:cs="Menlo"/>
+          <w:color w:val="000000"/>
+          <w:sz w:val="21"/>
+          <w:lang w:eastAsia="ko-KR"/>
+        </w:rPr>
+        <w:t>Error --USED_IN--&gt; Project</w:t>
+      </w:r>
+      <w:r>
+        <w:rPr>
+          <w:rFonts w:ascii="Arial" w:hAnsi="Arial" w:eastAsia="Malgun Gothic" w:cs="Malgun Gothic"/>
+          <w:color w:val="000000"/>
+          <w:sz w:val="22"/>
+          <w:lang w:eastAsia="ko-KR"/>
+        </w:rPr>
+        <w:t xml:space="preserve"> 등 설계가 막은 조합은 </w:t>
+      </w:r>
+      <w:r>
+        <w:rPr>
+          <w:rFonts w:ascii="Menlo" w:hAnsi="Menlo" w:eastAsia="Menlo" w:cs="Menlo"/>
+          <w:color w:val="000000"/>
+          <w:sz w:val="21"/>
+          <w:lang w:eastAsia="ko-KR"/>
+        </w:rPr>
+        <w:t>TYPE_NOT_ALLOWED</w:t>
+      </w:r>
+      <w:r>
+        <w:rPr>
+          <w:rFonts w:ascii="Arial" w:hAnsi="Arial" w:eastAsia="Malgun Gothic" w:cs="Malgun Gothic"/>
+          <w:color w:val="000000"/>
+          <w:sz w:val="22"/>
+          <w:lang w:eastAsia="ko-KR"/>
+        </w:rPr>
+        <w:t xml:space="preserve">), 휴지통 Solution은 Error 목록의 </w:t>
+      </w:r>
+      <w:r>
+        <w:rPr>
+          <w:rFonts w:ascii="Menlo" w:hAnsi="Menlo" w:eastAsia="Menlo" w:cs="Menlo"/>
+          <w:color w:val="000000"/>
+          <w:sz w:val="21"/>
+          <w:lang w:eastAsia="ko-KR"/>
+        </w:rPr>
+        <w:t>solutionCount</w:t>
+      </w:r>
+      <w:r>
+        <w:rPr>
+          <w:rFonts w:ascii="Arial" w:hAnsi="Arial" w:eastAsia="Malgun Gothic" w:cs="Malgun Gothic"/>
+          <w:color w:val="000000"/>
+          <w:sz w:val="22"/>
+          <w:lang w:eastAsia="ko-KR"/>
+        </w:rPr>
+        <w:t>에서 빠진다.</w:t>
+      </w:r>
+    </w:p>
+    <w:p>
+      <w:pPr>
+        <w:pStyle w:val="ListBullet"/>
+      </w:pPr>
+      <w:r>
+        <w:rPr>
+          <w:rFonts w:ascii="Arial" w:hAnsi="Arial" w:eastAsia="Malgun Gothic" w:cs="Malgun Gothic"/>
+          <w:b/>
+          <w:color w:val="000000"/>
+          <w:sz w:val="22"/>
+          <w:lang w:eastAsia="ko-KR"/>
+        </w:rPr>
+        <w:t>제외/이월:</w:t>
+      </w:r>
+      <w:r>
+        <w:rPr>
+          <w:rFonts w:ascii="Arial" w:hAnsi="Arial" w:eastAsia="Malgun Gothic" w:cs="Malgun Gothic"/>
+          <w:color w:val="000000"/>
+          <w:sz w:val="22"/>
+          <w:lang w:eastAsia="ko-KR"/>
+        </w:rPr>
+        <w:t xml:space="preserve"> Project 상태(</w:t>
+      </w:r>
+      <w:r>
+        <w:rPr>
+          <w:rFonts w:ascii="Menlo" w:hAnsi="Menlo" w:eastAsia="Menlo" w:cs="Menlo"/>
+          <w:color w:val="000000"/>
+          <w:sz w:val="21"/>
+          <w:lang w:eastAsia="ko-KR"/>
+        </w:rPr>
+        <w:t>ARCHIVED</w:t>
+      </w:r>
+      <w:r>
+        <w:rPr>
+          <w:rFonts w:ascii="Arial" w:hAnsi="Arial" w:eastAsia="Malgun Gothic" w:cs="Malgun Gothic"/>
+          <w:color w:val="000000"/>
+          <w:sz w:val="22"/>
+          <w:lang w:eastAsia="ko-KR"/>
+        </w:rPr>
+        <w:t xml:space="preserve">)와 Node 보관의 통합 정리, </w:t>
+      </w:r>
+      <w:r>
+        <w:rPr>
+          <w:rFonts w:ascii="Menlo" w:hAnsi="Menlo" w:eastAsia="Menlo" w:cs="Menlo"/>
+          <w:color w:val="000000"/>
+          <w:sz w:val="21"/>
+          <w:lang w:eastAsia="ko-KR"/>
+        </w:rPr>
+        <w:t>GET /graph/workspace</w:t>
+      </w:r>
+      <w:r>
+        <w:rPr>
+          <w:rFonts w:ascii="Arial" w:hAnsi="Arial" w:eastAsia="Malgun Gothic" w:cs="Malgun Gothic"/>
+          <w:color w:val="000000"/>
+          <w:sz w:val="22"/>
+          <w:lang w:eastAsia="ko-KR"/>
+        </w:rPr>
+        <w:t>의 Project scope 필터(GRPH-04 — Project 그래프는 전용 endpoint로 대신), Resource 메타데이터 자동 수집(</w:t>
+      </w:r>
+      <w:r>
+        <w:rPr>
+          <w:rFonts w:ascii="Menlo" w:hAnsi="Menlo" w:eastAsia="Menlo" w:cs="Menlo"/>
+          <w:color w:val="000000"/>
+          <w:sz w:val="21"/>
+          <w:lang w:eastAsia="ko-KR"/>
+        </w:rPr>
+        <w:t>last_checked_at</w:t>
+      </w:r>
+      <w:r>
+        <w:rPr>
+          <w:rFonts w:ascii="Arial" w:hAnsi="Arial" w:eastAsia="Malgun Gothic" w:cs="Malgun Gothic"/>
+          <w:color w:val="000000"/>
+          <w:sz w:val="22"/>
+          <w:lang w:eastAsia="ko-KR"/>
+        </w:rPr>
+        <w:t xml:space="preserve">은 항상 </w:t>
+      </w:r>
+      <w:r>
+        <w:rPr>
+          <w:rFonts w:ascii="Menlo" w:hAnsi="Menlo" w:eastAsia="Menlo" w:cs="Menlo"/>
+          <w:color w:val="000000"/>
+          <w:sz w:val="21"/>
+          <w:lang w:eastAsia="ko-KR"/>
+        </w:rPr>
+        <w:t>null</w:t>
+      </w:r>
+      <w:r>
+        <w:rPr>
+          <w:rFonts w:ascii="Arial" w:hAnsi="Arial" w:eastAsia="Malgun Gothic" w:cs="Malgun Gothic"/>
+          <w:color w:val="000000"/>
+          <w:sz w:val="22"/>
+          <w:lang w:eastAsia="ko-KR"/>
+        </w:rPr>
+        <w:t>), Error/Solution/Project의 타입 변경(KNOW-09), 영구 삭제(Phase 7 재인증 의존).</w:t>
+      </w:r>
+    </w:p>
+    <w:p>
+      <w:r>
+        <w:rPr>
+          <w:rFonts w:ascii="Arial" w:hAnsi="Arial" w:eastAsia="Malgun Gothic" w:cs="Malgun Gothic"/>
+          <w:b/>
+          <w:color w:val="000000"/>
+          <w:sz w:val="22"/>
+          <w:lang w:eastAsia="ko-KR"/>
+        </w:rPr>
         <w:t>Phase 5 구현 범위와 세부 계약(v1.8 확정)</w:t>
       </w:r>
     </w:p>

</xml_diff>